<commit_message>
Edited the Building data schematics and added data into database
</commit_message>
<xml_diff>
--- a/Building Data Schematics.docx
+++ b/Building Data Schematics.docx
@@ -83,7 +83,6 @@
                 <w:szCs w:val="22"/>
               </w:rPr>
             </w:pPr>
-            <w:proofErr w:type="spellStart"/>
             <w:r>
               <w:rPr>
                 <w:rFonts w:ascii="Arial" w:hAnsi="Arial" w:cs="Arial"/>
@@ -92,7 +91,6 @@
               </w:rPr>
               <w:t>Ice_Depth_Readings</w:t>
             </w:r>
-            <w:proofErr w:type="spellEnd"/>
           </w:p>
         </w:tc>
         <w:tc>
@@ -107,7 +105,6 @@
                 <w:szCs w:val="22"/>
               </w:rPr>
             </w:pPr>
-            <w:proofErr w:type="spellStart"/>
             <w:r>
               <w:rPr>
                 <w:rFonts w:ascii="Arial" w:hAnsi="Arial" w:cs="Arial"/>
@@ -116,7 +113,6 @@
               </w:rPr>
               <w:t>Reading_ID</w:t>
             </w:r>
-            <w:proofErr w:type="spellEnd"/>
           </w:p>
         </w:tc>
         <w:tc>
@@ -190,7 +186,6 @@
                 <w14:ligatures w14:val="none"/>
               </w:rPr>
             </w:pPr>
-            <w:proofErr w:type="spellStart"/>
             <w:r>
               <w:rPr>
                 <w:rFonts w:ascii="Arial" w:hAnsi="Arial" w:cs="Arial"/>
@@ -201,7 +196,6 @@
               </w:rPr>
               <w:t>Ice_Depth_Readings</w:t>
             </w:r>
-            <w:proofErr w:type="spellEnd"/>
           </w:p>
         </w:tc>
         <w:tc>
@@ -221,7 +215,6 @@
                 <w14:ligatures w14:val="none"/>
               </w:rPr>
             </w:pPr>
-            <w:proofErr w:type="spellStart"/>
             <w:r>
               <w:rPr>
                 <w:rFonts w:ascii="Arial" w:eastAsia="Times New Roman" w:hAnsi="Arial" w:cs="Arial"/>
@@ -233,7 +226,6 @@
               </w:rPr>
               <w:t>Reading_Date</w:t>
             </w:r>
-            <w:proofErr w:type="spellEnd"/>
           </w:p>
         </w:tc>
         <w:tc>
@@ -362,7 +354,6 @@
                 <w14:ligatures w14:val="none"/>
               </w:rPr>
             </w:pPr>
-            <w:proofErr w:type="spellStart"/>
             <w:r>
               <w:rPr>
                 <w:rFonts w:ascii="Arial" w:hAnsi="Arial" w:cs="Arial"/>
@@ -373,7 +364,6 @@
               </w:rPr>
               <w:t>Ice_Depth_Readings</w:t>
             </w:r>
-            <w:proofErr w:type="spellEnd"/>
           </w:p>
         </w:tc>
         <w:tc>
@@ -393,7 +383,6 @@
                 <w14:ligatures w14:val="none"/>
               </w:rPr>
             </w:pPr>
-            <w:proofErr w:type="spellStart"/>
             <w:r>
               <w:rPr>
                 <w:rFonts w:ascii="Arial" w:eastAsia="Times New Roman" w:hAnsi="Arial" w:cs="Arial"/>
@@ -405,7 +394,6 @@
               </w:rPr>
               <w:t>Zone_ID</w:t>
             </w:r>
-            <w:proofErr w:type="spellEnd"/>
           </w:p>
         </w:tc>
         <w:tc>
@@ -425,7 +413,6 @@
                 <w14:ligatures w14:val="none"/>
               </w:rPr>
             </w:pPr>
-            <w:proofErr w:type="spellStart"/>
             <w:r>
               <w:rPr>
                 <w:rFonts w:ascii="Arial" w:eastAsia="Times New Roman" w:hAnsi="Arial" w:cs="Arial"/>
@@ -437,7 +424,6 @@
               </w:rPr>
               <w:t>TinyInt</w:t>
             </w:r>
-            <w:proofErr w:type="spellEnd"/>
           </w:p>
         </w:tc>
         <w:tc>
@@ -497,7 +483,6 @@
                 <w14:ligatures w14:val="none"/>
               </w:rPr>
             </w:pPr>
-            <w:proofErr w:type="spellStart"/>
             <w:r>
               <w:rPr>
                 <w:rFonts w:ascii="Arial" w:hAnsi="Arial" w:cs="Arial"/>
@@ -508,7 +493,6 @@
               </w:rPr>
               <w:t>Ice_Depth_Readings</w:t>
             </w:r>
-            <w:proofErr w:type="spellEnd"/>
           </w:p>
         </w:tc>
         <w:tc>
@@ -528,7 +512,6 @@
                 <w14:ligatures w14:val="none"/>
               </w:rPr>
             </w:pPr>
-            <w:proofErr w:type="spellStart"/>
             <w:r>
               <w:rPr>
                 <w:rFonts w:ascii="Arial" w:eastAsia="Times New Roman" w:hAnsi="Arial" w:cs="Arial"/>
@@ -540,7 +523,6 @@
               </w:rPr>
               <w:t>Ice_Depth</w:t>
             </w:r>
-            <w:proofErr w:type="spellEnd"/>
           </w:p>
         </w:tc>
         <w:tc>
@@ -680,7 +662,6 @@
                 <w14:ligatures w14:val="none"/>
               </w:rPr>
             </w:pPr>
-            <w:proofErr w:type="spellStart"/>
             <w:r>
               <w:rPr>
                 <w:rFonts w:ascii="Arial" w:hAnsi="Arial" w:cs="Arial"/>
@@ -691,7 +672,6 @@
               </w:rPr>
               <w:t>Ice_Depth_Readings</w:t>
             </w:r>
-            <w:proofErr w:type="spellEnd"/>
           </w:p>
         </w:tc>
         <w:tc>
@@ -711,7 +691,6 @@
                 <w14:ligatures w14:val="none"/>
               </w:rPr>
             </w:pPr>
-            <w:proofErr w:type="spellStart"/>
             <w:r>
               <w:rPr>
                 <w:rFonts w:ascii="Arial" w:eastAsia="Times New Roman" w:hAnsi="Arial" w:cs="Arial"/>
@@ -723,7 +702,6 @@
               </w:rPr>
               <w:t>Worker_ID</w:t>
             </w:r>
-            <w:proofErr w:type="spellEnd"/>
           </w:p>
         </w:tc>
         <w:tc>
@@ -932,7 +910,6 @@
                 <w:szCs w:val="22"/>
               </w:rPr>
             </w:pPr>
-            <w:proofErr w:type="spellStart"/>
             <w:r>
               <w:rPr>
                 <w:rFonts w:ascii="Arial" w:eastAsia="Times New Roman" w:hAnsi="Arial" w:cs="Arial"/>
@@ -944,7 +921,6 @@
               </w:rPr>
               <w:t>Zamboni_ID</w:t>
             </w:r>
-            <w:proofErr w:type="spellEnd"/>
           </w:p>
         </w:tc>
         <w:tc>
@@ -1089,16 +1065,29 @@
                 <w14:ligatures w14:val="none"/>
               </w:rPr>
             </w:pPr>
-            <w:r>
-              <w:rPr>
-                <w:rFonts w:ascii="Arial" w:eastAsia="Times New Roman" w:hAnsi="Arial" w:cs="Arial"/>
-                <w:color w:val="000000"/>
-                <w:kern w:val="0"/>
-                <w:sz w:val="22"/>
-                <w:szCs w:val="22"/>
-                <w14:ligatures w14:val="none"/>
-              </w:rPr>
-              <w:t>varchar(10)</w:t>
+            <w:proofErr w:type="gramStart"/>
+            <w:r>
+              <w:rPr>
+                <w:rFonts w:ascii="Arial" w:eastAsia="Times New Roman" w:hAnsi="Arial" w:cs="Arial"/>
+                <w:color w:val="000000"/>
+                <w:kern w:val="0"/>
+                <w:sz w:val="22"/>
+                <w:szCs w:val="22"/>
+                <w14:ligatures w14:val="none"/>
+              </w:rPr>
+              <w:t>varchar(</w:t>
+            </w:r>
+            <w:proofErr w:type="gramEnd"/>
+            <w:r>
+              <w:rPr>
+                <w:rFonts w:ascii="Arial" w:eastAsia="Times New Roman" w:hAnsi="Arial" w:cs="Arial"/>
+                <w:color w:val="000000"/>
+                <w:kern w:val="0"/>
+                <w:sz w:val="22"/>
+                <w:szCs w:val="22"/>
+                <w14:ligatures w14:val="none"/>
+              </w:rPr>
+              <w:t>10)</w:t>
             </w:r>
           </w:p>
         </w:tc>
@@ -1120,19 +1109,17 @@
                 <w14:ligatures w14:val="none"/>
               </w:rPr>
             </w:pPr>
-            <w:proofErr w:type="spellStart"/>
-            <w:r>
-              <w:rPr>
-                <w:rFonts w:ascii="Arial" w:eastAsia="Times New Roman" w:hAnsi="Arial" w:cs="Arial"/>
-                <w:color w:val="000000"/>
-                <w:kern w:val="0"/>
-                <w:sz w:val="22"/>
-                <w:szCs w:val="22"/>
-                <w14:ligatures w14:val="none"/>
-              </w:rPr>
-              <w:t>DropDown</w:t>
-            </w:r>
-            <w:proofErr w:type="spellEnd"/>
+            <w:r>
+              <w:rPr>
+                <w:rFonts w:ascii="Arial" w:eastAsia="Times New Roman" w:hAnsi="Arial" w:cs="Arial"/>
+                <w:color w:val="000000"/>
+                <w:kern w:val="0"/>
+                <w:sz w:val="22"/>
+                <w:szCs w:val="22"/>
+                <w14:ligatures w14:val="none"/>
+              </w:rPr>
+              <w:t>Checkbox</w:t>
+            </w:r>
             <w:r>
               <w:rPr>
                 <w:rFonts w:ascii="Arial" w:eastAsia="Times New Roman" w:hAnsi="Arial" w:cs="Arial"/>
@@ -1289,7 +1276,6 @@
                 <w14:ligatures w14:val="none"/>
               </w:rPr>
             </w:pPr>
-            <w:proofErr w:type="spellStart"/>
             <w:r>
               <w:rPr>
                 <w:rFonts w:ascii="Arial" w:eastAsia="Times New Roman" w:hAnsi="Arial" w:cs="Arial"/>
@@ -1303,7 +1289,6 @@
               </w:rPr>
               <w:t>Zam_Schedule</w:t>
             </w:r>
-            <w:proofErr w:type="spellEnd"/>
           </w:p>
         </w:tc>
         <w:tc>
@@ -1324,7 +1309,6 @@
                 <w14:ligatures w14:val="none"/>
               </w:rPr>
             </w:pPr>
-            <w:proofErr w:type="spellStart"/>
             <w:r>
               <w:rPr>
                 <w:rFonts w:ascii="Arial" w:eastAsia="Times New Roman" w:hAnsi="Arial" w:cs="Arial"/>
@@ -1336,7 +1320,6 @@
               </w:rPr>
               <w:t>Zam_Schedule_ID</w:t>
             </w:r>
-            <w:proofErr w:type="spellEnd"/>
           </w:p>
         </w:tc>
         <w:tc>
@@ -1429,7 +1412,6 @@
                 <w14:ligatures w14:val="none"/>
               </w:rPr>
             </w:pPr>
-            <w:proofErr w:type="spellStart"/>
             <w:r>
               <w:rPr>
                 <w:rFonts w:ascii="Arial" w:eastAsia="Times New Roman" w:hAnsi="Arial" w:cs="Arial"/>
@@ -1443,7 +1425,6 @@
               </w:rPr>
               <w:t>Zam_Schedule</w:t>
             </w:r>
-            <w:proofErr w:type="spellEnd"/>
           </w:p>
         </w:tc>
         <w:tc>
@@ -1464,7 +1445,6 @@
                 <w14:ligatures w14:val="none"/>
               </w:rPr>
             </w:pPr>
-            <w:proofErr w:type="spellStart"/>
             <w:r>
               <w:rPr>
                 <w:rFonts w:ascii="Arial" w:eastAsia="Times New Roman" w:hAnsi="Arial" w:cs="Arial"/>
@@ -1476,7 +1456,6 @@
               </w:rPr>
               <w:t>Zam_Schedule_Date</w:t>
             </w:r>
-            <w:proofErr w:type="spellEnd"/>
           </w:p>
         </w:tc>
         <w:tc>
@@ -1597,7 +1576,6 @@
                 <w14:ligatures w14:val="none"/>
               </w:rPr>
             </w:pPr>
-            <w:proofErr w:type="spellStart"/>
             <w:r>
               <w:rPr>
                 <w:rFonts w:ascii="Arial" w:eastAsia="Times New Roman" w:hAnsi="Arial" w:cs="Arial"/>
@@ -1611,7 +1589,6 @@
               </w:rPr>
               <w:t>Zam_Schedule</w:t>
             </w:r>
-            <w:proofErr w:type="spellEnd"/>
           </w:p>
         </w:tc>
         <w:tc>
@@ -1663,16 +1640,29 @@
                 <w14:ligatures w14:val="none"/>
               </w:rPr>
             </w:pPr>
-            <w:r>
-              <w:rPr>
-                <w:rFonts w:ascii="Arial" w:eastAsia="Times New Roman" w:hAnsi="Arial" w:cs="Arial"/>
-                <w:color w:val="000000"/>
-                <w:kern w:val="0"/>
-                <w:sz w:val="22"/>
-                <w:szCs w:val="22"/>
-                <w14:ligatures w14:val="none"/>
-              </w:rPr>
-              <w:t>varchar(15)</w:t>
+            <w:proofErr w:type="gramStart"/>
+            <w:r>
+              <w:rPr>
+                <w:rFonts w:ascii="Arial" w:eastAsia="Times New Roman" w:hAnsi="Arial" w:cs="Arial"/>
+                <w:color w:val="000000"/>
+                <w:kern w:val="0"/>
+                <w:sz w:val="22"/>
+                <w:szCs w:val="22"/>
+                <w14:ligatures w14:val="none"/>
+              </w:rPr>
+              <w:t>varchar(</w:t>
+            </w:r>
+            <w:proofErr w:type="gramEnd"/>
+            <w:r>
+              <w:rPr>
+                <w:rFonts w:ascii="Arial" w:eastAsia="Times New Roman" w:hAnsi="Arial" w:cs="Arial"/>
+                <w:color w:val="000000"/>
+                <w:kern w:val="0"/>
+                <w:sz w:val="22"/>
+                <w:szCs w:val="22"/>
+                <w14:ligatures w14:val="none"/>
+              </w:rPr>
+              <w:t>15)</w:t>
             </w:r>
           </w:p>
         </w:tc>
@@ -1735,7 +1725,6 @@
                 <w14:ligatures w14:val="none"/>
               </w:rPr>
             </w:pPr>
-            <w:proofErr w:type="spellStart"/>
             <w:r>
               <w:rPr>
                 <w:rFonts w:ascii="Arial" w:eastAsia="Times New Roman" w:hAnsi="Arial" w:cs="Arial"/>
@@ -1749,7 +1738,6 @@
               </w:rPr>
               <w:t>Zam_Maintenance</w:t>
             </w:r>
-            <w:proofErr w:type="spellEnd"/>
           </w:p>
         </w:tc>
         <w:tc>
@@ -1770,7 +1758,6 @@
                 <w14:ligatures w14:val="none"/>
               </w:rPr>
             </w:pPr>
-            <w:proofErr w:type="spellStart"/>
             <w:r>
               <w:rPr>
                 <w:rFonts w:ascii="Arial" w:eastAsia="Times New Roman" w:hAnsi="Arial" w:cs="Arial"/>
@@ -1782,7 +1769,6 @@
               </w:rPr>
               <w:t>Zam_Maintenance_ID</w:t>
             </w:r>
-            <w:proofErr w:type="spellEnd"/>
           </w:p>
         </w:tc>
         <w:tc>
@@ -1874,7 +1860,6 @@
                 <w14:ligatures w14:val="none"/>
               </w:rPr>
             </w:pPr>
-            <w:proofErr w:type="spellStart"/>
             <w:r>
               <w:rPr>
                 <w:rFonts w:ascii="Arial" w:eastAsia="Times New Roman" w:hAnsi="Arial" w:cs="Arial"/>
@@ -1888,7 +1873,6 @@
               </w:rPr>
               <w:t>Zam_Maintenance</w:t>
             </w:r>
-            <w:proofErr w:type="spellEnd"/>
           </w:p>
         </w:tc>
         <w:tc>
@@ -1908,7 +1892,6 @@
                 <w14:ligatures w14:val="none"/>
               </w:rPr>
             </w:pPr>
-            <w:proofErr w:type="spellStart"/>
             <w:r>
               <w:rPr>
                 <w:rFonts w:ascii="Arial" w:eastAsia="Times New Roman" w:hAnsi="Arial" w:cs="Arial"/>
@@ -1920,7 +1903,6 @@
               </w:rPr>
               <w:t>Zam_Maintenance_Date</w:t>
             </w:r>
-            <w:proofErr w:type="spellEnd"/>
           </w:p>
         </w:tc>
         <w:tc>
@@ -2038,7 +2020,6 @@
                 <w14:ligatures w14:val="none"/>
               </w:rPr>
             </w:pPr>
-            <w:proofErr w:type="spellStart"/>
             <w:r>
               <w:rPr>
                 <w:rFonts w:ascii="Arial" w:eastAsia="Times New Roman" w:hAnsi="Arial" w:cs="Arial"/>
@@ -2052,7 +2033,6 @@
               </w:rPr>
               <w:t>Zam_Maintenance</w:t>
             </w:r>
-            <w:proofErr w:type="spellEnd"/>
           </w:p>
         </w:tc>
         <w:tc>
@@ -2072,7 +2052,6 @@
                 <w14:ligatures w14:val="none"/>
               </w:rPr>
             </w:pPr>
-            <w:proofErr w:type="spellStart"/>
             <w:r>
               <w:rPr>
                 <w:rFonts w:ascii="Arial" w:hAnsi="Arial" w:cs="Arial"/>
@@ -2082,7 +2061,6 @@
               </w:rPr>
               <w:t>Maintenance_Done</w:t>
             </w:r>
-            <w:proofErr w:type="spellEnd"/>
           </w:p>
         </w:tc>
         <w:tc>
@@ -2102,16 +2080,29 @@
                 <w14:ligatures w14:val="none"/>
               </w:rPr>
             </w:pPr>
-            <w:r>
-              <w:rPr>
-                <w:rFonts w:ascii="Arial" w:eastAsia="Times New Roman" w:hAnsi="Arial" w:cs="Arial"/>
-                <w:color w:val="000000"/>
-                <w:kern w:val="0"/>
-                <w:sz w:val="22"/>
-                <w:szCs w:val="22"/>
-                <w14:ligatures w14:val="none"/>
-              </w:rPr>
-              <w:t>Varchar(20)</w:t>
+            <w:proofErr w:type="gramStart"/>
+            <w:r>
+              <w:rPr>
+                <w:rFonts w:ascii="Arial" w:eastAsia="Times New Roman" w:hAnsi="Arial" w:cs="Arial"/>
+                <w:color w:val="000000"/>
+                <w:kern w:val="0"/>
+                <w:sz w:val="22"/>
+                <w:szCs w:val="22"/>
+                <w14:ligatures w14:val="none"/>
+              </w:rPr>
+              <w:t>Varchar(</w:t>
+            </w:r>
+            <w:proofErr w:type="gramEnd"/>
+            <w:r>
+              <w:rPr>
+                <w:rFonts w:ascii="Arial" w:eastAsia="Times New Roman" w:hAnsi="Arial" w:cs="Arial"/>
+                <w:color w:val="000000"/>
+                <w:kern w:val="0"/>
+                <w:sz w:val="22"/>
+                <w:szCs w:val="22"/>
+                <w14:ligatures w14:val="none"/>
+              </w:rPr>
+              <w:t>20)</w:t>
             </w:r>
           </w:p>
         </w:tc>
@@ -2200,7 +2191,6 @@
                 <w14:ligatures w14:val="none"/>
               </w:rPr>
             </w:pPr>
-            <w:proofErr w:type="spellStart"/>
             <w:r>
               <w:rPr>
                 <w:rFonts w:ascii="Arial" w:eastAsia="Times New Roman" w:hAnsi="Arial" w:cs="Arial"/>
@@ -2214,7 +2204,6 @@
               </w:rPr>
               <w:t>Zam_Maintenance</w:t>
             </w:r>
-            <w:proofErr w:type="spellEnd"/>
           </w:p>
         </w:tc>
         <w:tc>
@@ -2264,16 +2253,29 @@
                 <w14:ligatures w14:val="none"/>
               </w:rPr>
             </w:pPr>
-            <w:r>
-              <w:rPr>
-                <w:rFonts w:ascii="Arial" w:eastAsia="Times New Roman" w:hAnsi="Arial" w:cs="Arial"/>
-                <w:color w:val="000000"/>
-                <w:kern w:val="0"/>
-                <w:sz w:val="22"/>
-                <w:szCs w:val="22"/>
-                <w14:ligatures w14:val="none"/>
-              </w:rPr>
-              <w:t>Varchar(15)</w:t>
+            <w:proofErr w:type="gramStart"/>
+            <w:r>
+              <w:rPr>
+                <w:rFonts w:ascii="Arial" w:eastAsia="Times New Roman" w:hAnsi="Arial" w:cs="Arial"/>
+                <w:color w:val="000000"/>
+                <w:kern w:val="0"/>
+                <w:sz w:val="22"/>
+                <w:szCs w:val="22"/>
+                <w14:ligatures w14:val="none"/>
+              </w:rPr>
+              <w:t>Varchar(</w:t>
+            </w:r>
+            <w:proofErr w:type="gramEnd"/>
+            <w:r>
+              <w:rPr>
+                <w:rFonts w:ascii="Arial" w:eastAsia="Times New Roman" w:hAnsi="Arial" w:cs="Arial"/>
+                <w:color w:val="000000"/>
+                <w:kern w:val="0"/>
+                <w:sz w:val="22"/>
+                <w:szCs w:val="22"/>
+                <w14:ligatures w14:val="none"/>
+              </w:rPr>
+              <w:t>15)</w:t>
             </w:r>
           </w:p>
         </w:tc>
@@ -2334,7 +2336,6 @@
                 <w14:ligatures w14:val="none"/>
               </w:rPr>
             </w:pPr>
-            <w:proofErr w:type="spellStart"/>
             <w:r>
               <w:rPr>
                 <w:rFonts w:ascii="Arial" w:eastAsia="Times New Roman" w:hAnsi="Arial" w:cs="Arial"/>
@@ -2348,7 +2349,6 @@
               </w:rPr>
               <w:t>Zam_Maintenance</w:t>
             </w:r>
-            <w:proofErr w:type="spellEnd"/>
           </w:p>
         </w:tc>
         <w:tc>
@@ -2494,7 +2494,6 @@
                 <w14:ligatures w14:val="none"/>
               </w:rPr>
             </w:pPr>
-            <w:proofErr w:type="spellStart"/>
             <w:r>
               <w:rPr>
                 <w:rFonts w:ascii="Arial" w:eastAsia="Times New Roman" w:hAnsi="Arial" w:cs="Arial"/>
@@ -2508,7 +2507,6 @@
               </w:rPr>
               <w:t>Zam_Maintenance</w:t>
             </w:r>
-            <w:proofErr w:type="spellEnd"/>
           </w:p>
         </w:tc>
         <w:tc>
@@ -2528,7 +2526,6 @@
                 <w14:ligatures w14:val="none"/>
               </w:rPr>
             </w:pPr>
-            <w:proofErr w:type="spellStart"/>
             <w:r>
               <w:rPr>
                 <w:rFonts w:ascii="Arial" w:eastAsia="Times New Roman" w:hAnsi="Arial" w:cs="Arial"/>
@@ -2540,7 +2537,6 @@
               </w:rPr>
               <w:t>Zamboni_ID</w:t>
             </w:r>
-            <w:proofErr w:type="spellEnd"/>
           </w:p>
         </w:tc>
         <w:tc>
@@ -2630,7 +2626,6 @@
                 <w14:ligatures w14:val="none"/>
               </w:rPr>
             </w:pPr>
-            <w:proofErr w:type="spellStart"/>
             <w:r>
               <w:rPr>
                 <w:rFonts w:ascii="Arial" w:eastAsia="Times New Roman" w:hAnsi="Arial" w:cs="Arial"/>
@@ -2644,7 +2639,6 @@
               </w:rPr>
               <w:t>Zam_Maintenance</w:t>
             </w:r>
-            <w:proofErr w:type="spellEnd"/>
           </w:p>
         </w:tc>
         <w:tc>
@@ -2664,7 +2658,6 @@
                 <w14:ligatures w14:val="none"/>
               </w:rPr>
             </w:pPr>
-            <w:proofErr w:type="spellStart"/>
             <w:r>
               <w:rPr>
                 <w:rFonts w:ascii="Arial" w:eastAsia="Times New Roman" w:hAnsi="Arial" w:cs="Arial"/>
@@ -2676,7 +2669,6 @@
               </w:rPr>
               <w:t>Worker_ID</w:t>
             </w:r>
-            <w:proofErr w:type="spellEnd"/>
           </w:p>
         </w:tc>
         <w:tc>
@@ -2847,7 +2839,6 @@
                 <w:szCs w:val="22"/>
               </w:rPr>
             </w:pPr>
-            <w:proofErr w:type="spellStart"/>
             <w:r>
               <w:rPr>
                 <w:rFonts w:ascii="Arial" w:hAnsi="Arial" w:cs="Arial"/>
@@ -2856,7 +2847,6 @@
               </w:rPr>
               <w:t>Rink_HVAC_Filter</w:t>
             </w:r>
-            <w:proofErr w:type="spellEnd"/>
           </w:p>
         </w:tc>
         <w:tc>
@@ -2871,7 +2861,6 @@
                 <w:szCs w:val="22"/>
               </w:rPr>
             </w:pPr>
-            <w:proofErr w:type="spellStart"/>
             <w:r>
               <w:rPr>
                 <w:rFonts w:ascii="Arial" w:hAnsi="Arial" w:cs="Arial"/>
@@ -2880,7 +2869,6 @@
               </w:rPr>
               <w:t>Rink_HVAC_Filter_ID</w:t>
             </w:r>
-            <w:proofErr w:type="spellEnd"/>
           </w:p>
         </w:tc>
         <w:tc>
@@ -2954,7 +2942,6 @@
                 <w14:ligatures w14:val="none"/>
               </w:rPr>
             </w:pPr>
-            <w:proofErr w:type="spellStart"/>
             <w:r>
               <w:rPr>
                 <w:rFonts w:ascii="Arial" w:hAnsi="Arial" w:cs="Arial"/>
@@ -2966,7 +2953,6 @@
               </w:rPr>
               <w:t>Rink_HVAC_Filter</w:t>
             </w:r>
-            <w:proofErr w:type="spellEnd"/>
           </w:p>
         </w:tc>
         <w:tc>
@@ -2986,7 +2972,6 @@
                 <w14:ligatures w14:val="none"/>
               </w:rPr>
             </w:pPr>
-            <w:proofErr w:type="spellStart"/>
             <w:r>
               <w:rPr>
                 <w:rFonts w:ascii="Arial" w:eastAsia="Times New Roman" w:hAnsi="Arial" w:cs="Arial"/>
@@ -2998,7 +2983,6 @@
               </w:rPr>
               <w:t>Rink_Change_Date</w:t>
             </w:r>
-            <w:proofErr w:type="spellEnd"/>
           </w:p>
         </w:tc>
         <w:tc>
@@ -3114,7 +3098,6 @@
                 <w14:ligatures w14:val="none"/>
               </w:rPr>
             </w:pPr>
-            <w:proofErr w:type="spellStart"/>
             <w:r>
               <w:rPr>
                 <w:rFonts w:ascii="Arial" w:eastAsia="Times New Roman" w:hAnsi="Arial" w:cs="Arial"/>
@@ -3128,7 +3111,6 @@
               </w:rPr>
               <w:t>Rink_HVAC_Filter</w:t>
             </w:r>
-            <w:proofErr w:type="spellEnd"/>
           </w:p>
         </w:tc>
         <w:tc>
@@ -3274,7 +3256,6 @@
                 <w14:ligatures w14:val="none"/>
               </w:rPr>
             </w:pPr>
-            <w:proofErr w:type="spellStart"/>
             <w:r>
               <w:rPr>
                 <w:rFonts w:ascii="Arial" w:eastAsia="Times New Roman" w:hAnsi="Arial" w:cs="Arial"/>
@@ -3288,7 +3269,6 @@
               </w:rPr>
               <w:t>Rink_HVAC_Filter</w:t>
             </w:r>
-            <w:proofErr w:type="spellEnd"/>
           </w:p>
         </w:tc>
         <w:tc>
@@ -3434,7 +3414,6 @@
                 <w14:ligatures w14:val="none"/>
               </w:rPr>
             </w:pPr>
-            <w:proofErr w:type="spellStart"/>
             <w:r>
               <w:rPr>
                 <w:rFonts w:ascii="Arial" w:eastAsia="Times New Roman" w:hAnsi="Arial" w:cs="Arial"/>
@@ -3448,7 +3427,6 @@
               </w:rPr>
               <w:t>Rink_HVAC_Filter</w:t>
             </w:r>
-            <w:proofErr w:type="spellEnd"/>
           </w:p>
         </w:tc>
         <w:tc>
@@ -3594,7 +3572,6 @@
                 <w14:ligatures w14:val="none"/>
               </w:rPr>
             </w:pPr>
-            <w:proofErr w:type="spellStart"/>
             <w:r>
               <w:rPr>
                 <w:rFonts w:ascii="Arial" w:eastAsia="Times New Roman" w:hAnsi="Arial" w:cs="Arial"/>
@@ -3608,7 +3585,6 @@
               </w:rPr>
               <w:t>Rink_HVAC_Filter</w:t>
             </w:r>
-            <w:proofErr w:type="spellEnd"/>
           </w:p>
         </w:tc>
         <w:tc>
@@ -3728,7 +3704,6 @@
                 <w14:ligatures w14:val="none"/>
               </w:rPr>
             </w:pPr>
-            <w:proofErr w:type="spellStart"/>
             <w:r>
               <w:rPr>
                 <w:rFonts w:ascii="Arial" w:eastAsia="Times New Roman" w:hAnsi="Arial" w:cs="Arial"/>
@@ -3742,7 +3717,6 @@
               </w:rPr>
               <w:t>Rink_HVAC_Filter</w:t>
             </w:r>
-            <w:proofErr w:type="spellEnd"/>
           </w:p>
         </w:tc>
         <w:tc>
@@ -3862,7 +3836,6 @@
                 <w14:ligatures w14:val="none"/>
               </w:rPr>
             </w:pPr>
-            <w:proofErr w:type="spellStart"/>
             <w:r>
               <w:rPr>
                 <w:rFonts w:ascii="Arial" w:eastAsia="Times New Roman" w:hAnsi="Arial" w:cs="Arial"/>
@@ -3876,7 +3849,6 @@
               </w:rPr>
               <w:t>Rink_HVAC_Filter</w:t>
             </w:r>
-            <w:proofErr w:type="spellEnd"/>
           </w:p>
         </w:tc>
         <w:tc>
@@ -3996,7 +3968,6 @@
                 <w14:ligatures w14:val="none"/>
               </w:rPr>
             </w:pPr>
-            <w:proofErr w:type="spellStart"/>
             <w:r>
               <w:rPr>
                 <w:rFonts w:ascii="Arial" w:eastAsia="Times New Roman" w:hAnsi="Arial" w:cs="Arial"/>
@@ -4010,7 +3981,6 @@
               </w:rPr>
               <w:t>Rink_HVAC_Filter</w:t>
             </w:r>
-            <w:proofErr w:type="spellEnd"/>
           </w:p>
         </w:tc>
         <w:tc>
@@ -4060,16 +4030,29 @@
                 <w14:ligatures w14:val="none"/>
               </w:rPr>
             </w:pPr>
-            <w:r>
-              <w:rPr>
-                <w:rFonts w:ascii="Arial" w:eastAsia="Times New Roman" w:hAnsi="Arial" w:cs="Arial"/>
-                <w:color w:val="000000"/>
-                <w:kern w:val="0"/>
-                <w:sz w:val="22"/>
-                <w:szCs w:val="22"/>
-                <w14:ligatures w14:val="none"/>
-              </w:rPr>
-              <w:t>Varchar(15)</w:t>
+            <w:proofErr w:type="gramStart"/>
+            <w:r>
+              <w:rPr>
+                <w:rFonts w:ascii="Arial" w:eastAsia="Times New Roman" w:hAnsi="Arial" w:cs="Arial"/>
+                <w:color w:val="000000"/>
+                <w:kern w:val="0"/>
+                <w:sz w:val="22"/>
+                <w:szCs w:val="22"/>
+                <w14:ligatures w14:val="none"/>
+              </w:rPr>
+              <w:t>Varchar(</w:t>
+            </w:r>
+            <w:proofErr w:type="gramEnd"/>
+            <w:r>
+              <w:rPr>
+                <w:rFonts w:ascii="Arial" w:eastAsia="Times New Roman" w:hAnsi="Arial" w:cs="Arial"/>
+                <w:color w:val="000000"/>
+                <w:kern w:val="0"/>
+                <w:sz w:val="22"/>
+                <w:szCs w:val="22"/>
+                <w14:ligatures w14:val="none"/>
+              </w:rPr>
+              <w:t>15)</w:t>
             </w:r>
           </w:p>
         </w:tc>
@@ -4130,7 +4113,6 @@
                 <w14:ligatures w14:val="none"/>
               </w:rPr>
             </w:pPr>
-            <w:proofErr w:type="spellStart"/>
             <w:r>
               <w:rPr>
                 <w:rFonts w:ascii="Arial" w:eastAsia="Times New Roman" w:hAnsi="Arial" w:cs="Arial"/>
@@ -4144,7 +4126,6 @@
               </w:rPr>
               <w:t>Rink_HVAC_Filter</w:t>
             </w:r>
-            <w:proofErr w:type="spellEnd"/>
           </w:p>
         </w:tc>
         <w:tc>
@@ -4164,7 +4145,6 @@
                 <w14:ligatures w14:val="none"/>
               </w:rPr>
             </w:pPr>
-            <w:proofErr w:type="spellStart"/>
             <w:r>
               <w:rPr>
                 <w:rFonts w:ascii="Arial" w:eastAsia="Times New Roman" w:hAnsi="Arial" w:cs="Arial"/>
@@ -4176,7 +4156,6 @@
               </w:rPr>
               <w:t>Worker_ID</w:t>
             </w:r>
-            <w:proofErr w:type="spellEnd"/>
           </w:p>
         </w:tc>
         <w:tc>
@@ -4351,7 +4330,6 @@
                 <w:szCs w:val="22"/>
               </w:rPr>
             </w:pPr>
-            <w:proofErr w:type="spellStart"/>
             <w:r>
               <w:rPr>
                 <w:rFonts w:ascii="Arial" w:hAnsi="Arial" w:cs="Arial"/>
@@ -4360,7 +4338,6 @@
               </w:rPr>
               <w:t>Facility_HVAC_Filter</w:t>
             </w:r>
-            <w:proofErr w:type="spellEnd"/>
           </w:p>
         </w:tc>
         <w:tc>
@@ -4375,7 +4352,6 @@
                 <w:szCs w:val="22"/>
               </w:rPr>
             </w:pPr>
-            <w:proofErr w:type="spellStart"/>
             <w:r>
               <w:rPr>
                 <w:rFonts w:ascii="Arial" w:hAnsi="Arial" w:cs="Arial"/>
@@ -4392,7 +4368,6 @@
               </w:rPr>
               <w:t>_HVAC_Filter_ID</w:t>
             </w:r>
-            <w:proofErr w:type="spellEnd"/>
           </w:p>
         </w:tc>
         <w:tc>
@@ -4466,7 +4441,6 @@
                 <w14:ligatures w14:val="none"/>
               </w:rPr>
             </w:pPr>
-            <w:proofErr w:type="spellStart"/>
             <w:r>
               <w:rPr>
                 <w:rFonts w:ascii="Arial" w:hAnsi="Arial" w:cs="Arial"/>
@@ -4478,7 +4452,6 @@
               </w:rPr>
               <w:t>Facility_HVAC_Filter</w:t>
             </w:r>
-            <w:proofErr w:type="spellEnd"/>
           </w:p>
         </w:tc>
         <w:tc>
@@ -4498,7 +4471,6 @@
                 <w14:ligatures w14:val="none"/>
               </w:rPr>
             </w:pPr>
-            <w:proofErr w:type="spellStart"/>
             <w:r>
               <w:rPr>
                 <w:rFonts w:ascii="Arial" w:eastAsia="Times New Roman" w:hAnsi="Arial" w:cs="Arial"/>
@@ -4510,7 +4482,6 @@
               </w:rPr>
               <w:t>Rink_Change_Date</w:t>
             </w:r>
-            <w:proofErr w:type="spellEnd"/>
           </w:p>
         </w:tc>
         <w:tc>
@@ -4626,7 +4597,6 @@
                 <w14:ligatures w14:val="none"/>
               </w:rPr>
             </w:pPr>
-            <w:proofErr w:type="spellStart"/>
             <w:r>
               <w:rPr>
                 <w:rFonts w:ascii="Arial" w:eastAsia="Times New Roman" w:hAnsi="Arial" w:cs="Arial"/>
@@ -4640,7 +4610,6 @@
               </w:rPr>
               <w:t>Facility_HVAC_Filter</w:t>
             </w:r>
-            <w:proofErr w:type="spellEnd"/>
           </w:p>
         </w:tc>
         <w:tc>
@@ -4808,7 +4777,6 @@
                 <w14:ligatures w14:val="none"/>
               </w:rPr>
             </w:pPr>
-            <w:proofErr w:type="spellStart"/>
             <w:r>
               <w:rPr>
                 <w:rFonts w:ascii="Arial" w:eastAsia="Times New Roman" w:hAnsi="Arial" w:cs="Arial"/>
@@ -4822,7 +4790,6 @@
               </w:rPr>
               <w:t>Facility_HVAC_Filter</w:t>
             </w:r>
-            <w:proofErr w:type="spellEnd"/>
           </w:p>
         </w:tc>
         <w:tc>
@@ -5012,7 +4979,6 @@
                 <w14:ligatures w14:val="none"/>
               </w:rPr>
             </w:pPr>
-            <w:proofErr w:type="spellStart"/>
             <w:r>
               <w:rPr>
                 <w:rFonts w:ascii="Arial" w:eastAsia="Times New Roman" w:hAnsi="Arial" w:cs="Arial"/>
@@ -5026,7 +4992,6 @@
               </w:rPr>
               <w:t>Facility_HVAC_Filter</w:t>
             </w:r>
-            <w:proofErr w:type="spellEnd"/>
           </w:p>
         </w:tc>
         <w:tc>
@@ -5216,7 +5181,6 @@
                 <w14:ligatures w14:val="none"/>
               </w:rPr>
             </w:pPr>
-            <w:proofErr w:type="spellStart"/>
             <w:r>
               <w:rPr>
                 <w:rFonts w:ascii="Arial" w:eastAsia="Times New Roman" w:hAnsi="Arial" w:cs="Arial"/>
@@ -5230,7 +5194,6 @@
               </w:rPr>
               <w:t>Facility_HVAC_Filter</w:t>
             </w:r>
-            <w:proofErr w:type="spellEnd"/>
           </w:p>
         </w:tc>
         <w:tc>
@@ -5372,7 +5335,6 @@
                 <w14:ligatures w14:val="none"/>
               </w:rPr>
             </w:pPr>
-            <w:proofErr w:type="spellStart"/>
             <w:r>
               <w:rPr>
                 <w:rFonts w:ascii="Arial" w:eastAsia="Times New Roman" w:hAnsi="Arial" w:cs="Arial"/>
@@ -5386,7 +5348,6 @@
               </w:rPr>
               <w:t>Facility_HVAC_Filter</w:t>
             </w:r>
-            <w:proofErr w:type="spellEnd"/>
           </w:p>
         </w:tc>
         <w:tc>
@@ -5550,7 +5511,6 @@
                 <w14:ligatures w14:val="none"/>
               </w:rPr>
             </w:pPr>
-            <w:proofErr w:type="spellStart"/>
             <w:r>
               <w:rPr>
                 <w:rFonts w:ascii="Arial" w:eastAsia="Times New Roman" w:hAnsi="Arial" w:cs="Arial"/>
@@ -5564,7 +5524,6 @@
               </w:rPr>
               <w:t>Facility_HVAC_Filter</w:t>
             </w:r>
-            <w:proofErr w:type="spellEnd"/>
           </w:p>
         </w:tc>
         <w:tc>
@@ -5728,7 +5687,6 @@
                 <w14:ligatures w14:val="none"/>
               </w:rPr>
             </w:pPr>
-            <w:proofErr w:type="spellStart"/>
             <w:r>
               <w:rPr>
                 <w:rFonts w:ascii="Arial" w:eastAsia="Times New Roman" w:hAnsi="Arial" w:cs="Arial"/>
@@ -5742,7 +5700,6 @@
               </w:rPr>
               <w:t>Facility_HVAC_Filter</w:t>
             </w:r>
-            <w:proofErr w:type="spellEnd"/>
           </w:p>
         </w:tc>
         <w:tc>
@@ -5792,16 +5749,29 @@
                 <w14:ligatures w14:val="none"/>
               </w:rPr>
             </w:pPr>
-            <w:r>
-              <w:rPr>
-                <w:rFonts w:ascii="Arial" w:eastAsia="Times New Roman" w:hAnsi="Arial" w:cs="Arial"/>
-                <w:color w:val="000000"/>
-                <w:kern w:val="0"/>
-                <w:sz w:val="22"/>
-                <w:szCs w:val="22"/>
-                <w14:ligatures w14:val="none"/>
-              </w:rPr>
-              <w:t>Varchar(15)</w:t>
+            <w:proofErr w:type="gramStart"/>
+            <w:r>
+              <w:rPr>
+                <w:rFonts w:ascii="Arial" w:eastAsia="Times New Roman" w:hAnsi="Arial" w:cs="Arial"/>
+                <w:color w:val="000000"/>
+                <w:kern w:val="0"/>
+                <w:sz w:val="22"/>
+                <w:szCs w:val="22"/>
+                <w14:ligatures w14:val="none"/>
+              </w:rPr>
+              <w:t>Varchar(</w:t>
+            </w:r>
+            <w:proofErr w:type="gramEnd"/>
+            <w:r>
+              <w:rPr>
+                <w:rFonts w:ascii="Arial" w:eastAsia="Times New Roman" w:hAnsi="Arial" w:cs="Arial"/>
+                <w:color w:val="000000"/>
+                <w:kern w:val="0"/>
+                <w:sz w:val="22"/>
+                <w:szCs w:val="22"/>
+                <w14:ligatures w14:val="none"/>
+              </w:rPr>
+              <w:t>15)</w:t>
             </w:r>
           </w:p>
         </w:tc>
@@ -5862,7 +5832,6 @@
                 <w14:ligatures w14:val="none"/>
               </w:rPr>
             </w:pPr>
-            <w:proofErr w:type="spellStart"/>
             <w:r>
               <w:rPr>
                 <w:rFonts w:ascii="Arial" w:eastAsia="Times New Roman" w:hAnsi="Arial" w:cs="Arial"/>
@@ -5876,7 +5845,6 @@
               </w:rPr>
               <w:t>Facility_HVAC_Filter</w:t>
             </w:r>
-            <w:proofErr w:type="spellEnd"/>
           </w:p>
         </w:tc>
         <w:tc>
@@ -5896,7 +5864,6 @@
                 <w14:ligatures w14:val="none"/>
               </w:rPr>
             </w:pPr>
-            <w:proofErr w:type="spellStart"/>
             <w:r>
               <w:rPr>
                 <w:rFonts w:ascii="Arial" w:eastAsia="Times New Roman" w:hAnsi="Arial" w:cs="Arial"/>
@@ -5908,7 +5875,6 @@
               </w:rPr>
               <w:t>Worker_ID</w:t>
             </w:r>
-            <w:proofErr w:type="spellEnd"/>
           </w:p>
         </w:tc>
         <w:tc>
@@ -6093,7 +6059,6 @@
                 <w:szCs w:val="22"/>
               </w:rPr>
             </w:pPr>
-            <w:proofErr w:type="spellStart"/>
             <w:r>
               <w:rPr>
                 <w:rFonts w:ascii="Arial" w:hAnsi="Arial" w:cs="Arial"/>
@@ -6102,7 +6067,6 @@
               </w:rPr>
               <w:t>Ice_Maintenance</w:t>
             </w:r>
-            <w:proofErr w:type="spellEnd"/>
           </w:p>
         </w:tc>
         <w:tc>
@@ -6117,7 +6081,6 @@
                 <w:szCs w:val="22"/>
               </w:rPr>
             </w:pPr>
-            <w:proofErr w:type="spellStart"/>
             <w:r>
               <w:rPr>
                 <w:rFonts w:ascii="Arial" w:hAnsi="Arial" w:cs="Arial"/>
@@ -6126,7 +6089,6 @@
               </w:rPr>
               <w:t>Ice_Maintenance_ID</w:t>
             </w:r>
-            <w:proofErr w:type="spellEnd"/>
           </w:p>
         </w:tc>
         <w:tc>
@@ -6200,7 +6162,6 @@
                 <w14:ligatures w14:val="none"/>
               </w:rPr>
             </w:pPr>
-            <w:proofErr w:type="spellStart"/>
             <w:r>
               <w:rPr>
                 <w:rFonts w:ascii="Arial" w:hAnsi="Arial" w:cs="Arial"/>
@@ -6212,7 +6173,6 @@
               </w:rPr>
               <w:t>Ice_Maintenance</w:t>
             </w:r>
-            <w:proofErr w:type="spellEnd"/>
           </w:p>
         </w:tc>
         <w:tc>
@@ -6232,7 +6192,6 @@
                 <w14:ligatures w14:val="none"/>
               </w:rPr>
             </w:pPr>
-            <w:proofErr w:type="spellStart"/>
             <w:r>
               <w:rPr>
                 <w:rFonts w:ascii="Arial" w:eastAsia="Times New Roman" w:hAnsi="Arial" w:cs="Arial"/>
@@ -6244,7 +6203,6 @@
               </w:rPr>
               <w:t>Ice_Maintenance_Date</w:t>
             </w:r>
-            <w:proofErr w:type="spellEnd"/>
           </w:p>
         </w:tc>
         <w:tc>
@@ -6360,7 +6318,6 @@
                 <w14:ligatures w14:val="none"/>
               </w:rPr>
             </w:pPr>
-            <w:proofErr w:type="spellStart"/>
             <w:r>
               <w:rPr>
                 <w:rFonts w:ascii="Arial" w:eastAsia="Times New Roman" w:hAnsi="Arial" w:cs="Arial"/>
@@ -6374,7 +6331,6 @@
               </w:rPr>
               <w:t>Ice_Maintenance</w:t>
             </w:r>
-            <w:proofErr w:type="spellEnd"/>
           </w:p>
         </w:tc>
         <w:tc>
@@ -6424,16 +6380,29 @@
                 <w14:ligatures w14:val="none"/>
               </w:rPr>
             </w:pPr>
-            <w:r>
-              <w:rPr>
-                <w:rFonts w:ascii="Arial" w:eastAsia="Times New Roman" w:hAnsi="Arial" w:cs="Arial"/>
-                <w:color w:val="000000"/>
-                <w:kern w:val="0"/>
-                <w:sz w:val="22"/>
-                <w:szCs w:val="22"/>
-                <w14:ligatures w14:val="none"/>
-              </w:rPr>
-              <w:t>Varchar(10)</w:t>
+            <w:proofErr w:type="gramStart"/>
+            <w:r>
+              <w:rPr>
+                <w:rFonts w:ascii="Arial" w:eastAsia="Times New Roman" w:hAnsi="Arial" w:cs="Arial"/>
+                <w:color w:val="000000"/>
+                <w:kern w:val="0"/>
+                <w:sz w:val="22"/>
+                <w:szCs w:val="22"/>
+                <w14:ligatures w14:val="none"/>
+              </w:rPr>
+              <w:t>Varchar(</w:t>
+            </w:r>
+            <w:proofErr w:type="gramEnd"/>
+            <w:r>
+              <w:rPr>
+                <w:rFonts w:ascii="Arial" w:eastAsia="Times New Roman" w:hAnsi="Arial" w:cs="Arial"/>
+                <w:color w:val="000000"/>
+                <w:kern w:val="0"/>
+                <w:sz w:val="22"/>
+                <w:szCs w:val="22"/>
+                <w14:ligatures w14:val="none"/>
+              </w:rPr>
+              <w:t>10)</w:t>
             </w:r>
           </w:p>
         </w:tc>
@@ -6526,17 +6495,36 @@
           </w:p>
           <w:p>
             <w:pPr>
-              <w:cnfStyle w:val="000000000000" w:firstRow="0" w:lastRow="0" w:firstColumn="0" w:lastColumn="0" w:oddVBand="0" w:evenVBand="0" w:oddHBand="0" w:evenHBand="0" w:firstRowFirstColumn="0" w:firstRowLastColumn="0" w:lastRowFirstColumn="0" w:lastRowLastColumn="0"/>
-              <w:rPr>
-                <w:rFonts w:ascii="Arial" w:eastAsia="Times New Roman" w:hAnsi="Arial" w:cs="Arial"/>
-                <w:color w:val="000000"/>
-                <w:kern w:val="0"/>
-                <w:sz w:val="22"/>
-                <w:szCs w:val="22"/>
-                <w14:ligatures w14:val="none"/>
-              </w:rPr>
-            </w:pPr>
-            <w:r>
+              <w:pStyle w:val="ListParagraph"/>
+              <w:numPr>
+                <w:ilvl w:val="0"/>
+                <w:numId w:val="4"/>
+              </w:numPr>
+              <w:cnfStyle w:val="000000000000" w:firstRow="0" w:lastRow="0" w:firstColumn="0" w:lastColumn="0" w:oddVBand="0" w:evenVBand="0" w:oddHBand="0" w:evenHBand="0" w:firstRowFirstColumn="0" w:firstRowLastColumn="0" w:lastRowFirstColumn="0" w:lastRowLastColumn="0"/>
+              <w:rPr>
+                <w:rFonts w:ascii="Arial" w:eastAsia="Times New Roman" w:hAnsi="Arial" w:cs="Arial"/>
+                <w:color w:val="000000"/>
+                <w:kern w:val="0"/>
+                <w:sz w:val="22"/>
+                <w:szCs w:val="22"/>
+                <w14:ligatures w14:val="none"/>
+              </w:rPr>
+            </w:pPr>
+            <w:r>
+              <w:rPr>
+                <w:rFonts w:ascii="Arial" w:eastAsia="Times New Roman" w:hAnsi="Arial" w:cs="Arial"/>
+                <w:color w:val="000000"/>
+                <w:kern w:val="0"/>
+                <w:sz w:val="22"/>
+                <w:szCs w:val="22"/>
+                <w14:ligatures w14:val="none"/>
+              </w:rPr>
+              <w:t>NA</w:t>
+            </w:r>
+          </w:p>
+          <w:p>
+            <w:pPr>
+              <w:cnfStyle w:val="000000000000" w:firstRow="0" w:lastRow="0" w:firstColumn="0" w:lastColumn="0" w:oddVBand="0" w:evenVBand="0" w:oddHBand="0" w:evenHBand="0" w:firstRowFirstColumn="0" w:firstRowLastColumn="0" w:lastRowFirstColumn="0" w:lastRowLastColumn="0"/>
               <w:rPr>
                 <w:rFonts w:ascii="Arial" w:eastAsia="Times New Roman" w:hAnsi="Arial" w:cs="Arial"/>
                 <w:b/>
@@ -6547,7 +6535,43 @@
                 <w:szCs w:val="22"/>
                 <w14:ligatures w14:val="none"/>
               </w:rPr>
+            </w:pPr>
+            <w:r>
+              <w:rPr>
+                <w:rFonts w:ascii="Arial" w:eastAsia="Times New Roman" w:hAnsi="Arial" w:cs="Arial"/>
+                <w:b/>
+                <w:bCs/>
+                <w:color w:val="000000"/>
+                <w:kern w:val="0"/>
+                <w:sz w:val="22"/>
+                <w:szCs w:val="22"/>
+                <w14:ligatures w14:val="none"/>
+              </w:rPr>
               <w:t>Required</w:t>
+            </w:r>
+          </w:p>
+          <w:p>
+            <w:pPr>
+              <w:cnfStyle w:val="000000000000" w:firstRow="0" w:lastRow="0" w:firstColumn="0" w:lastColumn="0" w:oddVBand="0" w:evenVBand="0" w:oddHBand="0" w:evenHBand="0" w:firstRowFirstColumn="0" w:firstRowLastColumn="0" w:lastRowFirstColumn="0" w:lastRowLastColumn="0"/>
+              <w:rPr>
+                <w:rFonts w:ascii="Arial" w:eastAsia="Times New Roman" w:hAnsi="Arial" w:cs="Arial"/>
+                <w:color w:val="000000"/>
+                <w:kern w:val="0"/>
+                <w:sz w:val="22"/>
+                <w:szCs w:val="22"/>
+                <w14:ligatures w14:val="none"/>
+              </w:rPr>
+            </w:pPr>
+            <w:r>
+              <w:rPr>
+                <w:rFonts w:ascii="Arial" w:eastAsia="Times New Roman" w:hAnsi="Arial" w:cs="Arial"/>
+                <w:color w:val="000000"/>
+                <w:kern w:val="0"/>
+                <w:sz w:val="22"/>
+                <w:szCs w:val="22"/>
+                <w14:ligatures w14:val="none"/>
+              </w:rPr>
+              <w:t>If NA make all other dropdown as NA</w:t>
             </w:r>
           </w:p>
         </w:tc>
@@ -6578,7 +6602,6 @@
                 <w14:ligatures w14:val="none"/>
               </w:rPr>
             </w:pPr>
-            <w:proofErr w:type="spellStart"/>
             <w:r>
               <w:rPr>
                 <w:rFonts w:ascii="Arial" w:eastAsia="Times New Roman" w:hAnsi="Arial" w:cs="Arial"/>
@@ -6592,7 +6615,6 @@
               </w:rPr>
               <w:t>Ice_Maintenance</w:t>
             </w:r>
-            <w:proofErr w:type="spellEnd"/>
           </w:p>
         </w:tc>
         <w:tc>
@@ -6642,16 +6664,29 @@
                 <w14:ligatures w14:val="none"/>
               </w:rPr>
             </w:pPr>
-            <w:r>
-              <w:rPr>
-                <w:rFonts w:ascii="Arial" w:eastAsia="Times New Roman" w:hAnsi="Arial" w:cs="Arial"/>
-                <w:color w:val="000000"/>
-                <w:kern w:val="0"/>
-                <w:sz w:val="22"/>
-                <w:szCs w:val="22"/>
-                <w14:ligatures w14:val="none"/>
-              </w:rPr>
-              <w:t>Bool</w:t>
+            <w:proofErr w:type="gramStart"/>
+            <w:r>
+              <w:rPr>
+                <w:rFonts w:ascii="Arial" w:eastAsia="Times New Roman" w:hAnsi="Arial" w:cs="Arial"/>
+                <w:color w:val="000000"/>
+                <w:kern w:val="0"/>
+                <w:sz w:val="22"/>
+                <w:szCs w:val="22"/>
+                <w14:ligatures w14:val="none"/>
+              </w:rPr>
+              <w:t>Varchar(</w:t>
+            </w:r>
+            <w:proofErr w:type="gramEnd"/>
+            <w:r>
+              <w:rPr>
+                <w:rFonts w:ascii="Arial" w:eastAsia="Times New Roman" w:hAnsi="Arial" w:cs="Arial"/>
+                <w:color w:val="000000"/>
+                <w:kern w:val="0"/>
+                <w:sz w:val="22"/>
+                <w:szCs w:val="22"/>
+                <w14:ligatures w14:val="none"/>
+              </w:rPr>
+              <w:t>10)</w:t>
             </w:r>
           </w:p>
         </w:tc>
@@ -6681,7 +6716,29 @@
                 <w:szCs w:val="22"/>
                 <w14:ligatures w14:val="none"/>
               </w:rPr>
-              <w:t>Yes/No Dropdown</w:t>
+              <w:t>Yes/No</w:t>
+            </w:r>
+            <w:r>
+              <w:rPr>
+                <w:rFonts w:ascii="Arial" w:eastAsia="Times New Roman" w:hAnsi="Arial" w:cs="Arial"/>
+                <w:color w:val="000000"/>
+                <w:kern w:val="0"/>
+                <w:sz w:val="22"/>
+                <w:szCs w:val="22"/>
+                <w14:ligatures w14:val="none"/>
+              </w:rPr>
+              <w:t>/NA</w:t>
+            </w:r>
+            <w:r>
+              <w:rPr>
+                <w:rFonts w:ascii="Arial" w:eastAsia="Times New Roman" w:hAnsi="Arial" w:cs="Arial"/>
+                <w:color w:val="000000"/>
+                <w:kern w:val="0"/>
+                <w:sz w:val="22"/>
+                <w:szCs w:val="22"/>
+                <w14:ligatures w14:val="none"/>
+              </w:rPr>
+              <w:t xml:space="preserve"> Dropdown</w:t>
             </w:r>
           </w:p>
           <w:p>
@@ -6738,7 +6795,6 @@
                 <w14:ligatures w14:val="none"/>
               </w:rPr>
             </w:pPr>
-            <w:proofErr w:type="spellStart"/>
             <w:r>
               <w:rPr>
                 <w:rFonts w:ascii="Arial" w:eastAsia="Times New Roman" w:hAnsi="Arial" w:cs="Arial"/>
@@ -6752,7 +6808,6 @@
               </w:rPr>
               <w:t>Ice_Maintenance</w:t>
             </w:r>
-            <w:proofErr w:type="spellEnd"/>
           </w:p>
         </w:tc>
         <w:tc>
@@ -6772,7 +6827,6 @@
                 <w14:ligatures w14:val="none"/>
               </w:rPr>
             </w:pPr>
-            <w:proofErr w:type="spellStart"/>
             <w:r>
               <w:rPr>
                 <w:rFonts w:ascii="Arial" w:eastAsia="Times New Roman" w:hAnsi="Arial" w:cs="Arial"/>
@@ -6784,7 +6838,6 @@
               </w:rPr>
               <w:t>Cross_Cut</w:t>
             </w:r>
-            <w:proofErr w:type="spellEnd"/>
           </w:p>
         </w:tc>
         <w:tc>
@@ -6804,16 +6857,29 @@
                 <w14:ligatures w14:val="none"/>
               </w:rPr>
             </w:pPr>
-            <w:r>
-              <w:rPr>
-                <w:rFonts w:ascii="Arial" w:eastAsia="Times New Roman" w:hAnsi="Arial" w:cs="Arial"/>
-                <w:color w:val="000000"/>
-                <w:kern w:val="0"/>
-                <w:sz w:val="22"/>
-                <w:szCs w:val="22"/>
-                <w14:ligatures w14:val="none"/>
-              </w:rPr>
-              <w:t>Bool</w:t>
+            <w:proofErr w:type="gramStart"/>
+            <w:r>
+              <w:rPr>
+                <w:rFonts w:ascii="Arial" w:eastAsia="Times New Roman" w:hAnsi="Arial" w:cs="Arial"/>
+                <w:color w:val="000000"/>
+                <w:kern w:val="0"/>
+                <w:sz w:val="22"/>
+                <w:szCs w:val="22"/>
+                <w14:ligatures w14:val="none"/>
+              </w:rPr>
+              <w:t>Varchar(</w:t>
+            </w:r>
+            <w:proofErr w:type="gramEnd"/>
+            <w:r>
+              <w:rPr>
+                <w:rFonts w:ascii="Arial" w:eastAsia="Times New Roman" w:hAnsi="Arial" w:cs="Arial"/>
+                <w:color w:val="000000"/>
+                <w:kern w:val="0"/>
+                <w:sz w:val="22"/>
+                <w:szCs w:val="22"/>
+                <w14:ligatures w14:val="none"/>
+              </w:rPr>
+              <w:t>10)</w:t>
             </w:r>
           </w:p>
         </w:tc>
@@ -6843,7 +6909,29 @@
                 <w:szCs w:val="22"/>
                 <w14:ligatures w14:val="none"/>
               </w:rPr>
-              <w:t>Yes/No Dropdown</w:t>
+              <w:t>Yes/No</w:t>
+            </w:r>
+            <w:r>
+              <w:rPr>
+                <w:rFonts w:ascii="Arial" w:eastAsia="Times New Roman" w:hAnsi="Arial" w:cs="Arial"/>
+                <w:color w:val="000000"/>
+                <w:kern w:val="0"/>
+                <w:sz w:val="22"/>
+                <w:szCs w:val="22"/>
+                <w14:ligatures w14:val="none"/>
+              </w:rPr>
+              <w:t>/NA</w:t>
+            </w:r>
+            <w:r>
+              <w:rPr>
+                <w:rFonts w:ascii="Arial" w:eastAsia="Times New Roman" w:hAnsi="Arial" w:cs="Arial"/>
+                <w:color w:val="000000"/>
+                <w:kern w:val="0"/>
+                <w:sz w:val="22"/>
+                <w:szCs w:val="22"/>
+                <w14:ligatures w14:val="none"/>
+              </w:rPr>
+              <w:t xml:space="preserve"> Dropdown</w:t>
             </w:r>
           </w:p>
           <w:p>
@@ -6900,7 +6988,6 @@
                 <w14:ligatures w14:val="none"/>
               </w:rPr>
             </w:pPr>
-            <w:proofErr w:type="spellStart"/>
             <w:r>
               <w:rPr>
                 <w:rFonts w:ascii="Arial" w:eastAsia="Times New Roman" w:hAnsi="Arial" w:cs="Arial"/>
@@ -6914,7 +7001,6 @@
               </w:rPr>
               <w:t>Ice_Maintenance</w:t>
             </w:r>
-            <w:proofErr w:type="spellEnd"/>
           </w:p>
         </w:tc>
         <w:tc>
@@ -6934,7 +7020,6 @@
                 <w14:ligatures w14:val="none"/>
               </w:rPr>
             </w:pPr>
-            <w:proofErr w:type="spellStart"/>
             <w:r>
               <w:rPr>
                 <w:rFonts w:ascii="Arial" w:eastAsia="Times New Roman" w:hAnsi="Arial" w:cs="Arial"/>
@@ -6946,7 +7031,6 @@
               </w:rPr>
               <w:t>Hand_Flood</w:t>
             </w:r>
-            <w:proofErr w:type="spellEnd"/>
           </w:p>
         </w:tc>
         <w:tc>
@@ -6966,16 +7050,29 @@
                 <w14:ligatures w14:val="none"/>
               </w:rPr>
             </w:pPr>
-            <w:r>
-              <w:rPr>
-                <w:rFonts w:ascii="Arial" w:eastAsia="Times New Roman" w:hAnsi="Arial" w:cs="Arial"/>
-                <w:color w:val="000000"/>
-                <w:kern w:val="0"/>
-                <w:sz w:val="22"/>
-                <w:szCs w:val="22"/>
-                <w14:ligatures w14:val="none"/>
-              </w:rPr>
-              <w:t>Bool</w:t>
+            <w:proofErr w:type="gramStart"/>
+            <w:r>
+              <w:rPr>
+                <w:rFonts w:ascii="Arial" w:eastAsia="Times New Roman" w:hAnsi="Arial" w:cs="Arial"/>
+                <w:color w:val="000000"/>
+                <w:kern w:val="0"/>
+                <w:sz w:val="22"/>
+                <w:szCs w:val="22"/>
+                <w14:ligatures w14:val="none"/>
+              </w:rPr>
+              <w:t>Varchar(</w:t>
+            </w:r>
+            <w:proofErr w:type="gramEnd"/>
+            <w:r>
+              <w:rPr>
+                <w:rFonts w:ascii="Arial" w:eastAsia="Times New Roman" w:hAnsi="Arial" w:cs="Arial"/>
+                <w:color w:val="000000"/>
+                <w:kern w:val="0"/>
+                <w:sz w:val="22"/>
+                <w:szCs w:val="22"/>
+                <w14:ligatures w14:val="none"/>
+              </w:rPr>
+              <w:t>10)</w:t>
             </w:r>
           </w:p>
         </w:tc>
@@ -7005,7 +7102,29 @@
                 <w:szCs w:val="22"/>
                 <w14:ligatures w14:val="none"/>
               </w:rPr>
-              <w:t>Yes/No Dropdown</w:t>
+              <w:t>Yes/No</w:t>
+            </w:r>
+            <w:r>
+              <w:rPr>
+                <w:rFonts w:ascii="Arial" w:eastAsia="Times New Roman" w:hAnsi="Arial" w:cs="Arial"/>
+                <w:color w:val="000000"/>
+                <w:kern w:val="0"/>
+                <w:sz w:val="22"/>
+                <w:szCs w:val="22"/>
+                <w14:ligatures w14:val="none"/>
+              </w:rPr>
+              <w:t>/NA</w:t>
+            </w:r>
+            <w:r>
+              <w:rPr>
+                <w:rFonts w:ascii="Arial" w:eastAsia="Times New Roman" w:hAnsi="Arial" w:cs="Arial"/>
+                <w:color w:val="000000"/>
+                <w:kern w:val="0"/>
+                <w:sz w:val="22"/>
+                <w:szCs w:val="22"/>
+                <w14:ligatures w14:val="none"/>
+              </w:rPr>
+              <w:t xml:space="preserve"> Dropdown</w:t>
             </w:r>
           </w:p>
           <w:p>
@@ -7062,7 +7181,6 @@
                 <w14:ligatures w14:val="none"/>
               </w:rPr>
             </w:pPr>
-            <w:proofErr w:type="spellStart"/>
             <w:r>
               <w:rPr>
                 <w:rFonts w:ascii="Arial" w:eastAsia="Times New Roman" w:hAnsi="Arial" w:cs="Arial"/>
@@ -7076,7 +7194,6 @@
               </w:rPr>
               <w:t>Ice_Maintenance</w:t>
             </w:r>
-            <w:proofErr w:type="spellEnd"/>
           </w:p>
         </w:tc>
         <w:tc>
@@ -7126,16 +7243,29 @@
                 <w14:ligatures w14:val="none"/>
               </w:rPr>
             </w:pPr>
-            <w:r>
-              <w:rPr>
-                <w:rFonts w:ascii="Arial" w:eastAsia="Times New Roman" w:hAnsi="Arial" w:cs="Arial"/>
-                <w:color w:val="000000"/>
-                <w:kern w:val="0"/>
-                <w:sz w:val="22"/>
-                <w:szCs w:val="22"/>
-                <w14:ligatures w14:val="none"/>
-              </w:rPr>
-              <w:t>Varchar(15)</w:t>
+            <w:proofErr w:type="gramStart"/>
+            <w:r>
+              <w:rPr>
+                <w:rFonts w:ascii="Arial" w:eastAsia="Times New Roman" w:hAnsi="Arial" w:cs="Arial"/>
+                <w:color w:val="000000"/>
+                <w:kern w:val="0"/>
+                <w:sz w:val="22"/>
+                <w:szCs w:val="22"/>
+                <w14:ligatures w14:val="none"/>
+              </w:rPr>
+              <w:t>Varchar(</w:t>
+            </w:r>
+            <w:proofErr w:type="gramEnd"/>
+            <w:r>
+              <w:rPr>
+                <w:rFonts w:ascii="Arial" w:eastAsia="Times New Roman" w:hAnsi="Arial" w:cs="Arial"/>
+                <w:color w:val="000000"/>
+                <w:kern w:val="0"/>
+                <w:sz w:val="22"/>
+                <w:szCs w:val="22"/>
+                <w14:ligatures w14:val="none"/>
+              </w:rPr>
+              <w:t>15)</w:t>
             </w:r>
           </w:p>
         </w:tc>
@@ -7166,6 +7296,30 @@
                 <w14:ligatures w14:val="none"/>
               </w:rPr>
               <w:t>Text Field</w:t>
+            </w:r>
+          </w:p>
+          <w:p>
+            <w:pPr>
+              <w:cnfStyle w:val="000000000000" w:firstRow="0" w:lastRow="0" w:firstColumn="0" w:lastColumn="0" w:oddVBand="0" w:evenVBand="0" w:oddHBand="0" w:evenHBand="0" w:firstRowFirstColumn="0" w:firstRowLastColumn="0" w:lastRowFirstColumn="0" w:lastRowLastColumn="0"/>
+              <w:rPr>
+                <w:rFonts w:ascii="Arial" w:eastAsia="Times New Roman" w:hAnsi="Arial" w:cs="Arial"/>
+                <w:color w:val="000000"/>
+                <w:kern w:val="0"/>
+                <w:sz w:val="22"/>
+                <w:szCs w:val="22"/>
+                <w14:ligatures w14:val="none"/>
+              </w:rPr>
+            </w:pPr>
+            <w:r>
+              <w:rPr>
+                <w:rFonts w:ascii="Arial" w:eastAsia="Times New Roman" w:hAnsi="Arial" w:cs="Arial"/>
+                <w:color w:val="000000"/>
+                <w:kern w:val="0"/>
+                <w:sz w:val="22"/>
+                <w:szCs w:val="22"/>
+                <w14:ligatures w14:val="none"/>
+              </w:rPr>
+              <w:t>Required if NA</w:t>
             </w:r>
           </w:p>
         </w:tc>
@@ -7196,7 +7350,6 @@
                 <w14:ligatures w14:val="none"/>
               </w:rPr>
             </w:pPr>
-            <w:proofErr w:type="spellStart"/>
             <w:r>
               <w:rPr>
                 <w:rFonts w:ascii="Arial" w:eastAsia="Times New Roman" w:hAnsi="Arial" w:cs="Arial"/>
@@ -7210,7 +7363,6 @@
               </w:rPr>
               <w:t>Ice_Maintenance</w:t>
             </w:r>
-            <w:proofErr w:type="spellEnd"/>
           </w:p>
         </w:tc>
         <w:tc>
@@ -7230,7 +7382,6 @@
                 <w14:ligatures w14:val="none"/>
               </w:rPr>
             </w:pPr>
-            <w:proofErr w:type="spellStart"/>
             <w:r>
               <w:rPr>
                 <w:rFonts w:ascii="Arial" w:eastAsia="Times New Roman" w:hAnsi="Arial" w:cs="Arial"/>
@@ -7242,7 +7393,6 @@
               </w:rPr>
               <w:t>Worker_ID</w:t>
             </w:r>
-            <w:proofErr w:type="spellEnd"/>
           </w:p>
         </w:tc>
         <w:tc>
@@ -7416,7 +7566,6 @@
                 <w:szCs w:val="22"/>
               </w:rPr>
             </w:pPr>
-            <w:proofErr w:type="spellStart"/>
             <w:r>
               <w:rPr>
                 <w:rFonts w:ascii="Arial" w:hAnsi="Arial" w:cs="Arial"/>
@@ -7425,7 +7574,6 @@
               </w:rPr>
               <w:t>Rink_Misc_Maintenance</w:t>
             </w:r>
-            <w:proofErr w:type="spellEnd"/>
           </w:p>
         </w:tc>
         <w:tc>
@@ -7440,7 +7588,6 @@
                 <w:szCs w:val="22"/>
               </w:rPr>
             </w:pPr>
-            <w:proofErr w:type="spellStart"/>
             <w:r>
               <w:rPr>
                 <w:rFonts w:ascii="Arial" w:hAnsi="Arial" w:cs="Arial"/>
@@ -7449,7 +7596,6 @@
               </w:rPr>
               <w:t>Rink_Misc_Maintenance_ID</w:t>
             </w:r>
-            <w:proofErr w:type="spellEnd"/>
           </w:p>
         </w:tc>
         <w:tc>
@@ -7510,7 +7656,6 @@
                 <w:szCs w:val="22"/>
               </w:rPr>
             </w:pPr>
-            <w:proofErr w:type="spellStart"/>
             <w:r>
               <w:rPr>
                 <w:rFonts w:ascii="Arial" w:hAnsi="Arial" w:cs="Arial"/>
@@ -7519,7 +7664,6 @@
               </w:rPr>
               <w:t>Rink_Misc_Maintenance</w:t>
             </w:r>
-            <w:proofErr w:type="spellEnd"/>
           </w:p>
         </w:tc>
         <w:tc>
@@ -7534,7 +7678,6 @@
                 <w:szCs w:val="22"/>
               </w:rPr>
             </w:pPr>
-            <w:proofErr w:type="spellStart"/>
             <w:r>
               <w:rPr>
                 <w:rFonts w:ascii="Arial" w:hAnsi="Arial" w:cs="Arial"/>
@@ -7551,7 +7694,6 @@
               </w:rPr>
               <w:t>_Date</w:t>
             </w:r>
-            <w:proofErr w:type="spellEnd"/>
           </w:p>
         </w:tc>
         <w:tc>
@@ -7647,7 +7789,6 @@
                 <w14:ligatures w14:val="none"/>
               </w:rPr>
             </w:pPr>
-            <w:proofErr w:type="spellStart"/>
             <w:r>
               <w:rPr>
                 <w:rFonts w:ascii="Arial" w:eastAsia="Times New Roman" w:hAnsi="Arial" w:cs="Arial"/>
@@ -7661,7 +7802,6 @@
               </w:rPr>
               <w:t>Rink_Misc_Maintenance</w:t>
             </w:r>
-            <w:proofErr w:type="spellEnd"/>
           </w:p>
         </w:tc>
         <w:tc>
@@ -7711,16 +7851,29 @@
                 <w14:ligatures w14:val="none"/>
               </w:rPr>
             </w:pPr>
-            <w:r>
-              <w:rPr>
-                <w:rFonts w:ascii="Arial" w:eastAsia="Times New Roman" w:hAnsi="Arial" w:cs="Arial"/>
-                <w:color w:val="000000"/>
-                <w:kern w:val="0"/>
-                <w:sz w:val="22"/>
-                <w:szCs w:val="22"/>
-                <w14:ligatures w14:val="none"/>
-              </w:rPr>
-              <w:t>Varchar(20)</w:t>
+            <w:proofErr w:type="gramStart"/>
+            <w:r>
+              <w:rPr>
+                <w:rFonts w:ascii="Arial" w:eastAsia="Times New Roman" w:hAnsi="Arial" w:cs="Arial"/>
+                <w:color w:val="000000"/>
+                <w:kern w:val="0"/>
+                <w:sz w:val="22"/>
+                <w:szCs w:val="22"/>
+                <w14:ligatures w14:val="none"/>
+              </w:rPr>
+              <w:t>Varchar(</w:t>
+            </w:r>
+            <w:proofErr w:type="gramEnd"/>
+            <w:r>
+              <w:rPr>
+                <w:rFonts w:ascii="Arial" w:eastAsia="Times New Roman" w:hAnsi="Arial" w:cs="Arial"/>
+                <w:color w:val="000000"/>
+                <w:kern w:val="0"/>
+                <w:sz w:val="22"/>
+                <w:szCs w:val="22"/>
+                <w14:ligatures w14:val="none"/>
+              </w:rPr>
+              <w:t>20)</w:t>
             </w:r>
           </w:p>
         </w:tc>
@@ -7781,7 +7934,6 @@
                 <w14:ligatures w14:val="none"/>
               </w:rPr>
             </w:pPr>
-            <w:proofErr w:type="spellStart"/>
             <w:r>
               <w:rPr>
                 <w:rFonts w:ascii="Arial" w:eastAsia="Times New Roman" w:hAnsi="Arial" w:cs="Arial"/>
@@ -7795,7 +7947,6 @@
               </w:rPr>
               <w:t>Rink_Misc_Maintenance</w:t>
             </w:r>
-            <w:proofErr w:type="spellEnd"/>
           </w:p>
         </w:tc>
         <w:tc>
@@ -7845,16 +7996,29 @@
                 <w14:ligatures w14:val="none"/>
               </w:rPr>
             </w:pPr>
-            <w:r>
-              <w:rPr>
-                <w:rFonts w:ascii="Arial" w:eastAsia="Times New Roman" w:hAnsi="Arial" w:cs="Arial"/>
-                <w:color w:val="000000"/>
-                <w:kern w:val="0"/>
-                <w:sz w:val="22"/>
-                <w:szCs w:val="22"/>
-                <w14:ligatures w14:val="none"/>
-              </w:rPr>
-              <w:t>Varchar(20)</w:t>
+            <w:proofErr w:type="gramStart"/>
+            <w:r>
+              <w:rPr>
+                <w:rFonts w:ascii="Arial" w:eastAsia="Times New Roman" w:hAnsi="Arial" w:cs="Arial"/>
+                <w:color w:val="000000"/>
+                <w:kern w:val="0"/>
+                <w:sz w:val="22"/>
+                <w:szCs w:val="22"/>
+                <w14:ligatures w14:val="none"/>
+              </w:rPr>
+              <w:t>Varchar(</w:t>
+            </w:r>
+            <w:proofErr w:type="gramEnd"/>
+            <w:r>
+              <w:rPr>
+                <w:rFonts w:ascii="Arial" w:eastAsia="Times New Roman" w:hAnsi="Arial" w:cs="Arial"/>
+                <w:color w:val="000000"/>
+                <w:kern w:val="0"/>
+                <w:sz w:val="22"/>
+                <w:szCs w:val="22"/>
+                <w14:ligatures w14:val="none"/>
+              </w:rPr>
+              <w:t>20)</w:t>
             </w:r>
           </w:p>
         </w:tc>
@@ -7915,7 +8079,6 @@
                 <w14:ligatures w14:val="none"/>
               </w:rPr>
             </w:pPr>
-            <w:proofErr w:type="spellStart"/>
             <w:r>
               <w:rPr>
                 <w:rFonts w:ascii="Arial" w:eastAsia="Times New Roman" w:hAnsi="Arial" w:cs="Arial"/>
@@ -7929,7 +8092,6 @@
               </w:rPr>
               <w:t>Rink_Misc_Maintenance</w:t>
             </w:r>
-            <w:proofErr w:type="spellEnd"/>
           </w:p>
         </w:tc>
         <w:tc>
@@ -7949,7 +8111,6 @@
                 <w14:ligatures w14:val="none"/>
               </w:rPr>
             </w:pPr>
-            <w:proofErr w:type="spellStart"/>
             <w:r>
               <w:rPr>
                 <w:rFonts w:ascii="Arial" w:eastAsia="Times New Roman" w:hAnsi="Arial" w:cs="Arial"/>
@@ -7961,7 +8122,6 @@
               </w:rPr>
               <w:t>Worker_ID</w:t>
             </w:r>
-            <w:proofErr w:type="spellEnd"/>
           </w:p>
         </w:tc>
         <w:tc>
@@ -8082,6 +8242,25 @@
           <w:szCs w:val="40"/>
         </w:rPr>
         <w:t>Natural Gas Form</w:t>
+      </w:r>
+    </w:p>
+    <w:p>
+      <w:pPr>
+        <w:rPr>
+          <w:b/>
+          <w:bCs/>
+          <w:sz w:val="28"/>
+          <w:szCs w:val="28"/>
+        </w:rPr>
+      </w:pPr>
+      <w:r>
+        <w:rPr>
+          <w:b/>
+          <w:bCs/>
+          <w:sz w:val="28"/>
+          <w:szCs w:val="28"/>
+        </w:rPr>
+        <w:t>**Make them all required</w:t>
       </w:r>
     </w:p>
     <w:tbl>
@@ -8164,7 +8343,6 @@
                 <w:szCs w:val="22"/>
               </w:rPr>
             </w:pPr>
-            <w:proofErr w:type="spellStart"/>
             <w:r>
               <w:rPr>
                 <w:rFonts w:ascii="Arial" w:hAnsi="Arial" w:cs="Arial"/>
@@ -8173,7 +8351,6 @@
               </w:rPr>
               <w:t>Natural_Gas_Stats</w:t>
             </w:r>
-            <w:proofErr w:type="spellEnd"/>
           </w:p>
         </w:tc>
         <w:tc>
@@ -8188,7 +8365,6 @@
                 <w:szCs w:val="22"/>
               </w:rPr>
             </w:pPr>
-            <w:proofErr w:type="spellStart"/>
             <w:r>
               <w:rPr>
                 <w:rFonts w:ascii="Arial" w:hAnsi="Arial" w:cs="Arial"/>
@@ -8205,7 +8381,6 @@
               </w:rPr>
               <w:t>_ID</w:t>
             </w:r>
-            <w:proofErr w:type="spellEnd"/>
           </w:p>
         </w:tc>
         <w:tc>
@@ -8279,7 +8454,6 @@
                 <w14:ligatures w14:val="none"/>
               </w:rPr>
             </w:pPr>
-            <w:proofErr w:type="spellStart"/>
             <w:r>
               <w:rPr>
                 <w:rFonts w:ascii="Arial" w:eastAsia="Times New Roman" w:hAnsi="Arial" w:cs="Arial"/>
@@ -8293,7 +8467,6 @@
               </w:rPr>
               <w:t>Natural_Gas_Stats</w:t>
             </w:r>
-            <w:proofErr w:type="spellEnd"/>
           </w:p>
         </w:tc>
         <w:tc>
@@ -8313,7 +8486,6 @@
                 <w14:ligatures w14:val="none"/>
               </w:rPr>
             </w:pPr>
-            <w:proofErr w:type="spellStart"/>
             <w:r>
               <w:rPr>
                 <w:rFonts w:ascii="Arial" w:eastAsia="Times New Roman" w:hAnsi="Arial" w:cs="Arial"/>
@@ -8336,7 +8508,6 @@
               </w:rPr>
               <w:t>Billing_Date</w:t>
             </w:r>
-            <w:proofErr w:type="spellEnd"/>
           </w:p>
         </w:tc>
         <w:tc>
@@ -8452,7 +8623,6 @@
                 <w14:ligatures w14:val="none"/>
               </w:rPr>
             </w:pPr>
-            <w:proofErr w:type="spellStart"/>
             <w:r>
               <w:rPr>
                 <w:rFonts w:ascii="Arial" w:eastAsia="Times New Roman" w:hAnsi="Arial" w:cs="Arial"/>
@@ -8466,7 +8636,6 @@
               </w:rPr>
               <w:t>Natural_Gas_Stats</w:t>
             </w:r>
-            <w:proofErr w:type="spellEnd"/>
           </w:p>
         </w:tc>
         <w:tc>
@@ -8486,7 +8655,6 @@
                 <w14:ligatures w14:val="none"/>
               </w:rPr>
             </w:pPr>
-            <w:proofErr w:type="spellStart"/>
             <w:r>
               <w:rPr>
                 <w:rFonts w:ascii="Arial" w:eastAsia="Times New Roman" w:hAnsi="Arial" w:cs="Arial"/>
@@ -8509,7 +8677,6 @@
               </w:rPr>
               <w:t>Read_Date</w:t>
             </w:r>
-            <w:proofErr w:type="spellEnd"/>
           </w:p>
         </w:tc>
         <w:tc>
@@ -8625,7 +8792,6 @@
                 <w14:ligatures w14:val="none"/>
               </w:rPr>
             </w:pPr>
-            <w:proofErr w:type="spellStart"/>
             <w:r>
               <w:rPr>
                 <w:rFonts w:ascii="Arial" w:eastAsia="Times New Roman" w:hAnsi="Arial" w:cs="Arial"/>
@@ -8639,7 +8805,6 @@
               </w:rPr>
               <w:t>Natural_Gas_Stats</w:t>
             </w:r>
-            <w:proofErr w:type="spellEnd"/>
           </w:p>
         </w:tc>
         <w:tc>
@@ -8659,7 +8824,6 @@
                 <w14:ligatures w14:val="none"/>
               </w:rPr>
             </w:pPr>
-            <w:proofErr w:type="spellStart"/>
             <w:r>
               <w:rPr>
                 <w:rFonts w:ascii="Arial" w:eastAsia="Times New Roman" w:hAnsi="Arial" w:cs="Arial"/>
@@ -8682,7 +8846,6 @@
               </w:rPr>
               <w:t>Billing_Days</w:t>
             </w:r>
-            <w:proofErr w:type="spellEnd"/>
           </w:p>
         </w:tc>
         <w:tc>
@@ -8798,7 +8961,6 @@
                 <w14:ligatures w14:val="none"/>
               </w:rPr>
             </w:pPr>
-            <w:proofErr w:type="spellStart"/>
             <w:r>
               <w:rPr>
                 <w:rFonts w:ascii="Arial" w:eastAsia="Times New Roman" w:hAnsi="Arial" w:cs="Arial"/>
@@ -8812,7 +8974,6 @@
               </w:rPr>
               <w:t>Natural_Gas_Stats</w:t>
             </w:r>
-            <w:proofErr w:type="spellEnd"/>
           </w:p>
         </w:tc>
         <w:tc>
@@ -8832,7 +8993,6 @@
                 <w14:ligatures w14:val="none"/>
               </w:rPr>
             </w:pPr>
-            <w:proofErr w:type="spellStart"/>
             <w:r>
               <w:rPr>
                 <w:rFonts w:ascii="Arial" w:eastAsia="Times New Roman" w:hAnsi="Arial" w:cs="Arial"/>
@@ -8844,7 +9004,6 @@
               </w:rPr>
               <w:t>Other_Gas_Charges</w:t>
             </w:r>
-            <w:proofErr w:type="spellEnd"/>
           </w:p>
         </w:tc>
         <w:tc>
@@ -8864,16 +9023,29 @@
                 <w14:ligatures w14:val="none"/>
               </w:rPr>
             </w:pPr>
-            <w:r>
-              <w:rPr>
-                <w:rFonts w:ascii="Arial" w:eastAsia="Times New Roman" w:hAnsi="Arial" w:cs="Arial"/>
-                <w:color w:val="000000"/>
-                <w:kern w:val="0"/>
-                <w:sz w:val="22"/>
-                <w:szCs w:val="22"/>
-                <w14:ligatures w14:val="none"/>
-              </w:rPr>
-              <w:t>Decimal(10,2)</w:t>
+            <w:proofErr w:type="gramStart"/>
+            <w:r>
+              <w:rPr>
+                <w:rFonts w:ascii="Arial" w:eastAsia="Times New Roman" w:hAnsi="Arial" w:cs="Arial"/>
+                <w:color w:val="000000"/>
+                <w:kern w:val="0"/>
+                <w:sz w:val="22"/>
+                <w:szCs w:val="22"/>
+                <w14:ligatures w14:val="none"/>
+              </w:rPr>
+              <w:t>Decimal(</w:t>
+            </w:r>
+            <w:proofErr w:type="gramEnd"/>
+            <w:r>
+              <w:rPr>
+                <w:rFonts w:ascii="Arial" w:eastAsia="Times New Roman" w:hAnsi="Arial" w:cs="Arial"/>
+                <w:color w:val="000000"/>
+                <w:kern w:val="0"/>
+                <w:sz w:val="22"/>
+                <w:szCs w:val="22"/>
+                <w14:ligatures w14:val="none"/>
+              </w:rPr>
+              <w:t>10,2)</w:t>
             </w:r>
           </w:p>
         </w:tc>
@@ -8960,7 +9132,6 @@
                 <w14:ligatures w14:val="none"/>
               </w:rPr>
             </w:pPr>
-            <w:proofErr w:type="spellStart"/>
             <w:r>
               <w:rPr>
                 <w:rFonts w:ascii="Arial" w:eastAsia="Times New Roman" w:hAnsi="Arial" w:cs="Arial"/>
@@ -8974,7 +9145,6 @@
               </w:rPr>
               <w:t>Natural_Gas_Stats</w:t>
             </w:r>
-            <w:proofErr w:type="spellEnd"/>
           </w:p>
         </w:tc>
         <w:tc>
@@ -8994,7 +9164,6 @@
                 <w14:ligatures w14:val="none"/>
               </w:rPr>
             </w:pPr>
-            <w:proofErr w:type="spellStart"/>
             <w:r>
               <w:rPr>
                 <w:rFonts w:ascii="Arial" w:eastAsia="Times New Roman" w:hAnsi="Arial" w:cs="Arial"/>
@@ -9006,7 +9175,6 @@
               </w:rPr>
               <w:t>Previous_Balance_And_Adjustments_Gas</w:t>
             </w:r>
-            <w:proofErr w:type="spellEnd"/>
           </w:p>
         </w:tc>
         <w:tc>
@@ -9026,16 +9194,29 @@
                 <w14:ligatures w14:val="none"/>
               </w:rPr>
             </w:pPr>
-            <w:r>
-              <w:rPr>
-                <w:rFonts w:ascii="Arial" w:eastAsia="Times New Roman" w:hAnsi="Arial" w:cs="Arial"/>
-                <w:color w:val="000000"/>
-                <w:kern w:val="0"/>
-                <w:sz w:val="22"/>
-                <w:szCs w:val="22"/>
-                <w14:ligatures w14:val="none"/>
-              </w:rPr>
-              <w:t>Decimal(10,2)</w:t>
+            <w:proofErr w:type="gramStart"/>
+            <w:r>
+              <w:rPr>
+                <w:rFonts w:ascii="Arial" w:eastAsia="Times New Roman" w:hAnsi="Arial" w:cs="Arial"/>
+                <w:color w:val="000000"/>
+                <w:kern w:val="0"/>
+                <w:sz w:val="22"/>
+                <w:szCs w:val="22"/>
+                <w14:ligatures w14:val="none"/>
+              </w:rPr>
+              <w:t>Decimal(</w:t>
+            </w:r>
+            <w:proofErr w:type="gramEnd"/>
+            <w:r>
+              <w:rPr>
+                <w:rFonts w:ascii="Arial" w:eastAsia="Times New Roman" w:hAnsi="Arial" w:cs="Arial"/>
+                <w:color w:val="000000"/>
+                <w:kern w:val="0"/>
+                <w:sz w:val="22"/>
+                <w:szCs w:val="22"/>
+                <w14:ligatures w14:val="none"/>
+              </w:rPr>
+              <w:t>10,2)</w:t>
             </w:r>
           </w:p>
         </w:tc>
@@ -9122,7 +9303,6 @@
                 <w14:ligatures w14:val="none"/>
               </w:rPr>
             </w:pPr>
-            <w:proofErr w:type="spellStart"/>
             <w:r>
               <w:rPr>
                 <w:rFonts w:ascii="Arial" w:eastAsia="Times New Roman" w:hAnsi="Arial" w:cs="Arial"/>
@@ -9136,7 +9316,6 @@
               </w:rPr>
               <w:t>Natural_Gas_Stats</w:t>
             </w:r>
-            <w:proofErr w:type="spellEnd"/>
           </w:p>
         </w:tc>
         <w:tc>
@@ -9156,7 +9335,6 @@
                 <w14:ligatures w14:val="none"/>
               </w:rPr>
             </w:pPr>
-            <w:proofErr w:type="spellStart"/>
             <w:r>
               <w:rPr>
                 <w:rFonts w:ascii="Arial" w:eastAsia="Times New Roman" w:hAnsi="Arial" w:cs="Arial"/>
@@ -9168,7 +9346,6 @@
               </w:rPr>
               <w:t>Base_Gas_Cost</w:t>
             </w:r>
-            <w:proofErr w:type="spellEnd"/>
           </w:p>
         </w:tc>
         <w:tc>
@@ -9188,16 +9365,29 @@
                 <w14:ligatures w14:val="none"/>
               </w:rPr>
             </w:pPr>
-            <w:r>
-              <w:rPr>
-                <w:rFonts w:ascii="Arial" w:eastAsia="Times New Roman" w:hAnsi="Arial" w:cs="Arial"/>
-                <w:color w:val="000000"/>
-                <w:kern w:val="0"/>
-                <w:sz w:val="22"/>
-                <w:szCs w:val="22"/>
-                <w14:ligatures w14:val="none"/>
-              </w:rPr>
-              <w:t>Decimal(10,2)</w:t>
+            <w:proofErr w:type="gramStart"/>
+            <w:r>
+              <w:rPr>
+                <w:rFonts w:ascii="Arial" w:eastAsia="Times New Roman" w:hAnsi="Arial" w:cs="Arial"/>
+                <w:color w:val="000000"/>
+                <w:kern w:val="0"/>
+                <w:sz w:val="22"/>
+                <w:szCs w:val="22"/>
+                <w14:ligatures w14:val="none"/>
+              </w:rPr>
+              <w:t>Decimal(</w:t>
+            </w:r>
+            <w:proofErr w:type="gramEnd"/>
+            <w:r>
+              <w:rPr>
+                <w:rFonts w:ascii="Arial" w:eastAsia="Times New Roman" w:hAnsi="Arial" w:cs="Arial"/>
+                <w:color w:val="000000"/>
+                <w:kern w:val="0"/>
+                <w:sz w:val="22"/>
+                <w:szCs w:val="22"/>
+                <w14:ligatures w14:val="none"/>
+              </w:rPr>
+              <w:t>10,2)</w:t>
             </w:r>
           </w:p>
         </w:tc>
@@ -9284,7 +9474,6 @@
                 <w14:ligatures w14:val="none"/>
               </w:rPr>
             </w:pPr>
-            <w:proofErr w:type="spellStart"/>
             <w:r>
               <w:rPr>
                 <w:rFonts w:ascii="Arial" w:eastAsia="Times New Roman" w:hAnsi="Arial" w:cs="Arial"/>
@@ -9298,7 +9487,6 @@
               </w:rPr>
               <w:t>Natural_Gas_Stats</w:t>
             </w:r>
-            <w:proofErr w:type="spellEnd"/>
           </w:p>
         </w:tc>
         <w:tc>
@@ -9318,7 +9506,6 @@
                 <w14:ligatures w14:val="none"/>
               </w:rPr>
             </w:pPr>
-            <w:proofErr w:type="spellStart"/>
             <w:r>
               <w:rPr>
                 <w:rFonts w:ascii="Arial" w:eastAsia="Times New Roman" w:hAnsi="Arial" w:cs="Arial"/>
@@ -9330,7 +9517,6 @@
               </w:rPr>
               <w:t>Purchase_Gas_Adjustment</w:t>
             </w:r>
-            <w:proofErr w:type="spellEnd"/>
           </w:p>
         </w:tc>
         <w:tc>
@@ -9350,16 +9536,29 @@
                 <w14:ligatures w14:val="none"/>
               </w:rPr>
             </w:pPr>
-            <w:r>
-              <w:rPr>
-                <w:rFonts w:ascii="Arial" w:eastAsia="Times New Roman" w:hAnsi="Arial" w:cs="Arial"/>
-                <w:color w:val="000000"/>
-                <w:kern w:val="0"/>
-                <w:sz w:val="22"/>
-                <w:szCs w:val="22"/>
-                <w14:ligatures w14:val="none"/>
-              </w:rPr>
-              <w:t>Decimal(10,2)</w:t>
+            <w:proofErr w:type="gramStart"/>
+            <w:r>
+              <w:rPr>
+                <w:rFonts w:ascii="Arial" w:eastAsia="Times New Roman" w:hAnsi="Arial" w:cs="Arial"/>
+                <w:color w:val="000000"/>
+                <w:kern w:val="0"/>
+                <w:sz w:val="22"/>
+                <w:szCs w:val="22"/>
+                <w14:ligatures w14:val="none"/>
+              </w:rPr>
+              <w:t>Decimal(</w:t>
+            </w:r>
+            <w:proofErr w:type="gramEnd"/>
+            <w:r>
+              <w:rPr>
+                <w:rFonts w:ascii="Arial" w:eastAsia="Times New Roman" w:hAnsi="Arial" w:cs="Arial"/>
+                <w:color w:val="000000"/>
+                <w:kern w:val="0"/>
+                <w:sz w:val="22"/>
+                <w:szCs w:val="22"/>
+                <w14:ligatures w14:val="none"/>
+              </w:rPr>
+              <w:t>10,2)</w:t>
             </w:r>
           </w:p>
         </w:tc>
@@ -9446,7 +9645,6 @@
                 <w14:ligatures w14:val="none"/>
               </w:rPr>
             </w:pPr>
-            <w:proofErr w:type="spellStart"/>
             <w:r>
               <w:rPr>
                 <w:rFonts w:ascii="Arial" w:eastAsia="Times New Roman" w:hAnsi="Arial" w:cs="Arial"/>
@@ -9460,7 +9658,6 @@
               </w:rPr>
               <w:t>Natural_Gas_Stats</w:t>
             </w:r>
-            <w:proofErr w:type="spellEnd"/>
           </w:p>
         </w:tc>
         <w:tc>
@@ -9480,7 +9677,6 @@
                 <w14:ligatures w14:val="none"/>
               </w:rPr>
             </w:pPr>
-            <w:proofErr w:type="spellStart"/>
             <w:r>
               <w:rPr>
                 <w:rFonts w:ascii="Arial" w:eastAsia="Times New Roman" w:hAnsi="Arial" w:cs="Arial"/>
@@ -9492,7 +9688,6 @@
               </w:rPr>
               <w:t>Distribution_Charge</w:t>
             </w:r>
-            <w:proofErr w:type="spellEnd"/>
           </w:p>
         </w:tc>
         <w:tc>
@@ -9512,16 +9707,29 @@
                 <w14:ligatures w14:val="none"/>
               </w:rPr>
             </w:pPr>
-            <w:r>
-              <w:rPr>
-                <w:rFonts w:ascii="Arial" w:eastAsia="Times New Roman" w:hAnsi="Arial" w:cs="Arial"/>
-                <w:color w:val="000000"/>
-                <w:kern w:val="0"/>
-                <w:sz w:val="22"/>
-                <w:szCs w:val="22"/>
-                <w14:ligatures w14:val="none"/>
-              </w:rPr>
-              <w:t>Decimal(10,2)</w:t>
+            <w:proofErr w:type="gramStart"/>
+            <w:r>
+              <w:rPr>
+                <w:rFonts w:ascii="Arial" w:eastAsia="Times New Roman" w:hAnsi="Arial" w:cs="Arial"/>
+                <w:color w:val="000000"/>
+                <w:kern w:val="0"/>
+                <w:sz w:val="22"/>
+                <w:szCs w:val="22"/>
+                <w14:ligatures w14:val="none"/>
+              </w:rPr>
+              <w:t>Decimal(</w:t>
+            </w:r>
+            <w:proofErr w:type="gramEnd"/>
+            <w:r>
+              <w:rPr>
+                <w:rFonts w:ascii="Arial" w:eastAsia="Times New Roman" w:hAnsi="Arial" w:cs="Arial"/>
+                <w:color w:val="000000"/>
+                <w:kern w:val="0"/>
+                <w:sz w:val="22"/>
+                <w:szCs w:val="22"/>
+                <w14:ligatures w14:val="none"/>
+              </w:rPr>
+              <w:t>10,2)</w:t>
             </w:r>
           </w:p>
         </w:tc>
@@ -9608,7 +9816,6 @@
                 <w14:ligatures w14:val="none"/>
               </w:rPr>
             </w:pPr>
-            <w:proofErr w:type="spellStart"/>
             <w:r>
               <w:rPr>
                 <w:rFonts w:ascii="Arial" w:eastAsia="Times New Roman" w:hAnsi="Arial" w:cs="Arial"/>
@@ -9622,7 +9829,6 @@
               </w:rPr>
               <w:t>Natural_Gas_Stats</w:t>
             </w:r>
-            <w:proofErr w:type="spellEnd"/>
           </w:p>
         </w:tc>
         <w:tc>
@@ -9642,7 +9848,6 @@
                 <w14:ligatures w14:val="none"/>
               </w:rPr>
             </w:pPr>
-            <w:proofErr w:type="spellStart"/>
             <w:r>
               <w:rPr>
                 <w:rFonts w:ascii="Arial" w:eastAsia="Times New Roman" w:hAnsi="Arial" w:cs="Arial"/>
@@ -9654,7 +9859,6 @@
               </w:rPr>
               <w:t>Tax_Cost</w:t>
             </w:r>
-            <w:proofErr w:type="spellEnd"/>
           </w:p>
         </w:tc>
         <w:tc>
@@ -9674,16 +9878,29 @@
                 <w14:ligatures w14:val="none"/>
               </w:rPr>
             </w:pPr>
-            <w:r>
-              <w:rPr>
-                <w:rFonts w:ascii="Arial" w:eastAsia="Times New Roman" w:hAnsi="Arial" w:cs="Arial"/>
-                <w:color w:val="000000"/>
-                <w:kern w:val="0"/>
-                <w:sz w:val="22"/>
-                <w:szCs w:val="22"/>
-                <w14:ligatures w14:val="none"/>
-              </w:rPr>
-              <w:t>Decimal(10,2)</w:t>
+            <w:proofErr w:type="gramStart"/>
+            <w:r>
+              <w:rPr>
+                <w:rFonts w:ascii="Arial" w:eastAsia="Times New Roman" w:hAnsi="Arial" w:cs="Arial"/>
+                <w:color w:val="000000"/>
+                <w:kern w:val="0"/>
+                <w:sz w:val="22"/>
+                <w:szCs w:val="22"/>
+                <w14:ligatures w14:val="none"/>
+              </w:rPr>
+              <w:t>Decimal(</w:t>
+            </w:r>
+            <w:proofErr w:type="gramEnd"/>
+            <w:r>
+              <w:rPr>
+                <w:rFonts w:ascii="Arial" w:eastAsia="Times New Roman" w:hAnsi="Arial" w:cs="Arial"/>
+                <w:color w:val="000000"/>
+                <w:kern w:val="0"/>
+                <w:sz w:val="22"/>
+                <w:szCs w:val="22"/>
+                <w14:ligatures w14:val="none"/>
+              </w:rPr>
+              <w:t>10,2)</w:t>
             </w:r>
           </w:p>
         </w:tc>
@@ -9770,7 +9987,6 @@
                 <w14:ligatures w14:val="none"/>
               </w:rPr>
             </w:pPr>
-            <w:proofErr w:type="spellStart"/>
             <w:r>
               <w:rPr>
                 <w:rFonts w:ascii="Arial" w:eastAsia="Times New Roman" w:hAnsi="Arial" w:cs="Arial"/>
@@ -9784,7 +10000,6 @@
               </w:rPr>
               <w:t>Natural_Gas_Stats</w:t>
             </w:r>
-            <w:proofErr w:type="spellEnd"/>
           </w:p>
         </w:tc>
         <w:tc>
@@ -9804,7 +10019,6 @@
                 <w14:ligatures w14:val="none"/>
               </w:rPr>
             </w:pPr>
-            <w:proofErr w:type="spellStart"/>
             <w:r>
               <w:rPr>
                 <w:rFonts w:ascii="Arial" w:eastAsia="Times New Roman" w:hAnsi="Arial" w:cs="Arial"/>
@@ -9816,7 +10030,6 @@
               </w:rPr>
               <w:t>Natural_Gas_Used_Therms</w:t>
             </w:r>
-            <w:proofErr w:type="spellEnd"/>
           </w:p>
         </w:tc>
         <w:tc>
@@ -9836,16 +10049,29 @@
                 <w14:ligatures w14:val="none"/>
               </w:rPr>
             </w:pPr>
-            <w:r>
-              <w:rPr>
-                <w:rFonts w:ascii="Arial" w:eastAsia="Times New Roman" w:hAnsi="Arial" w:cs="Arial"/>
-                <w:color w:val="000000"/>
-                <w:kern w:val="0"/>
-                <w:sz w:val="22"/>
-                <w:szCs w:val="22"/>
-                <w14:ligatures w14:val="none"/>
-              </w:rPr>
-              <w:t>Decimal(10,1)</w:t>
+            <w:proofErr w:type="gramStart"/>
+            <w:r>
+              <w:rPr>
+                <w:rFonts w:ascii="Arial" w:eastAsia="Times New Roman" w:hAnsi="Arial" w:cs="Arial"/>
+                <w:color w:val="000000"/>
+                <w:kern w:val="0"/>
+                <w:sz w:val="22"/>
+                <w:szCs w:val="22"/>
+                <w14:ligatures w14:val="none"/>
+              </w:rPr>
+              <w:t>Decimal(</w:t>
+            </w:r>
+            <w:proofErr w:type="gramEnd"/>
+            <w:r>
+              <w:rPr>
+                <w:rFonts w:ascii="Arial" w:eastAsia="Times New Roman" w:hAnsi="Arial" w:cs="Arial"/>
+                <w:color w:val="000000"/>
+                <w:kern w:val="0"/>
+                <w:sz w:val="22"/>
+                <w:szCs w:val="22"/>
+                <w14:ligatures w14:val="none"/>
+              </w:rPr>
+              <w:t>10,1)</w:t>
             </w:r>
           </w:p>
         </w:tc>
@@ -9932,7 +10158,6 @@
                 <w14:ligatures w14:val="none"/>
               </w:rPr>
             </w:pPr>
-            <w:proofErr w:type="spellStart"/>
             <w:r>
               <w:rPr>
                 <w:rFonts w:ascii="Arial" w:eastAsia="Times New Roman" w:hAnsi="Arial" w:cs="Arial"/>
@@ -9946,7 +10171,6 @@
               </w:rPr>
               <w:t>Natural_Gas_Stats</w:t>
             </w:r>
-            <w:proofErr w:type="spellEnd"/>
           </w:p>
         </w:tc>
         <w:tc>
@@ -9966,7 +10190,6 @@
                 <w14:ligatures w14:val="none"/>
               </w:rPr>
             </w:pPr>
-            <w:proofErr w:type="spellStart"/>
             <w:r>
               <w:rPr>
                 <w:rFonts w:ascii="Arial" w:eastAsia="Times New Roman" w:hAnsi="Arial" w:cs="Arial"/>
@@ -9978,7 +10201,6 @@
               </w:rPr>
               <w:t>Gas_Heating_Degree_Days</w:t>
             </w:r>
-            <w:proofErr w:type="spellEnd"/>
           </w:p>
         </w:tc>
         <w:tc>
@@ -10092,7 +10314,6 @@
                 <w14:ligatures w14:val="none"/>
               </w:rPr>
             </w:pPr>
-            <w:proofErr w:type="spellStart"/>
             <w:r>
               <w:rPr>
                 <w:rFonts w:ascii="Arial" w:eastAsia="Times New Roman" w:hAnsi="Arial" w:cs="Arial"/>
@@ -10106,7 +10327,6 @@
               </w:rPr>
               <w:t>Natural_Gas_Stats</w:t>
             </w:r>
-            <w:proofErr w:type="spellEnd"/>
           </w:p>
         </w:tc>
         <w:tc>
@@ -10126,7 +10346,6 @@
                 <w14:ligatures w14:val="none"/>
               </w:rPr>
             </w:pPr>
-            <w:proofErr w:type="spellStart"/>
             <w:r>
               <w:rPr>
                 <w:rFonts w:ascii="Arial" w:eastAsia="Times New Roman" w:hAnsi="Arial" w:cs="Arial"/>
@@ -10138,7 +10357,6 @@
               </w:rPr>
               <w:t>Gas_Cooling_Degree_Days</w:t>
             </w:r>
-            <w:proofErr w:type="spellEnd"/>
           </w:p>
         </w:tc>
         <w:tc>
@@ -10252,7 +10470,6 @@
                 <w14:ligatures w14:val="none"/>
               </w:rPr>
             </w:pPr>
-            <w:proofErr w:type="spellStart"/>
             <w:r>
               <w:rPr>
                 <w:rFonts w:ascii="Arial" w:eastAsia="Times New Roman" w:hAnsi="Arial" w:cs="Arial"/>
@@ -10266,7 +10483,6 @@
               </w:rPr>
               <w:t>Natural_Gas_Stats</w:t>
             </w:r>
-            <w:proofErr w:type="spellEnd"/>
           </w:p>
         </w:tc>
         <w:tc>
@@ -10286,7 +10502,6 @@
                 <w14:ligatures w14:val="none"/>
               </w:rPr>
             </w:pPr>
-            <w:proofErr w:type="spellStart"/>
             <w:r>
               <w:rPr>
                 <w:rFonts w:ascii="Arial" w:eastAsia="Times New Roman" w:hAnsi="Arial" w:cs="Arial"/>
@@ -10298,7 +10513,6 @@
               </w:rPr>
               <w:t>Worker_ID</w:t>
             </w:r>
-            <w:proofErr w:type="spellEnd"/>
           </w:p>
         </w:tc>
         <w:tc>
@@ -10402,6 +10616,25 @@
         <w:t>Electricity Form</w:t>
       </w:r>
     </w:p>
+    <w:p>
+      <w:pPr>
+        <w:rPr>
+          <w:b/>
+          <w:bCs/>
+          <w:sz w:val="28"/>
+          <w:szCs w:val="28"/>
+        </w:rPr>
+      </w:pPr>
+      <w:r>
+        <w:rPr>
+          <w:b/>
+          <w:bCs/>
+          <w:sz w:val="28"/>
+          <w:szCs w:val="28"/>
+        </w:rPr>
+        <w:t>**Make them all required</w:t>
+      </w:r>
+    </w:p>
     <w:tbl>
       <w:tblPr>
         <w:tblStyle w:val="GridTable1Light"/>
@@ -10482,7 +10715,6 @@
                 <w:szCs w:val="22"/>
               </w:rPr>
             </w:pPr>
-            <w:proofErr w:type="spellStart"/>
             <w:r>
               <w:rPr>
                 <w:rFonts w:ascii="Arial" w:hAnsi="Arial" w:cs="Arial"/>
@@ -10491,7 +10723,6 @@
               </w:rPr>
               <w:t>Electricity_Stats</w:t>
             </w:r>
-            <w:proofErr w:type="spellEnd"/>
           </w:p>
         </w:tc>
         <w:tc>
@@ -10506,7 +10737,6 @@
                 <w:szCs w:val="22"/>
               </w:rPr>
             </w:pPr>
-            <w:proofErr w:type="spellStart"/>
             <w:r>
               <w:rPr>
                 <w:rFonts w:ascii="Arial" w:hAnsi="Arial" w:cs="Arial"/>
@@ -10523,7 +10753,6 @@
               </w:rPr>
               <w:t>_ID</w:t>
             </w:r>
-            <w:proofErr w:type="spellEnd"/>
           </w:p>
         </w:tc>
         <w:tc>
@@ -10597,7 +10826,6 @@
                 <w14:ligatures w14:val="none"/>
               </w:rPr>
             </w:pPr>
-            <w:proofErr w:type="spellStart"/>
             <w:r>
               <w:rPr>
                 <w:rFonts w:ascii="Arial" w:eastAsia="Times New Roman" w:hAnsi="Arial" w:cs="Arial"/>
@@ -10611,7 +10839,6 @@
               </w:rPr>
               <w:t>Electricity_Stats</w:t>
             </w:r>
-            <w:proofErr w:type="spellEnd"/>
           </w:p>
         </w:tc>
         <w:tc>
@@ -10631,7 +10858,6 @@
                 <w14:ligatures w14:val="none"/>
               </w:rPr>
             </w:pPr>
-            <w:proofErr w:type="spellStart"/>
             <w:r>
               <w:rPr>
                 <w:rFonts w:ascii="Arial" w:eastAsia="Times New Roman" w:hAnsi="Arial" w:cs="Arial"/>
@@ -10643,7 +10869,6 @@
               </w:rPr>
               <w:t>Electricity_Billing_Date</w:t>
             </w:r>
-            <w:proofErr w:type="spellEnd"/>
           </w:p>
         </w:tc>
         <w:tc>
@@ -10733,7 +10958,6 @@
                 <w14:ligatures w14:val="none"/>
               </w:rPr>
             </w:pPr>
-            <w:proofErr w:type="spellStart"/>
             <w:r>
               <w:rPr>
                 <w:rFonts w:ascii="Arial" w:eastAsia="Times New Roman" w:hAnsi="Arial" w:cs="Arial"/>
@@ -10747,7 +10971,6 @@
               </w:rPr>
               <w:t>Electricity_Stats</w:t>
             </w:r>
-            <w:proofErr w:type="spellEnd"/>
           </w:p>
         </w:tc>
         <w:tc>
@@ -10767,7 +10990,6 @@
                 <w14:ligatures w14:val="none"/>
               </w:rPr>
             </w:pPr>
-            <w:proofErr w:type="spellStart"/>
             <w:r>
               <w:rPr>
                 <w:rFonts w:ascii="Arial" w:eastAsia="Times New Roman" w:hAnsi="Arial" w:cs="Arial"/>
@@ -10779,7 +11001,6 @@
               </w:rPr>
               <w:t>Electricity_Read_Date</w:t>
             </w:r>
-            <w:proofErr w:type="spellEnd"/>
           </w:p>
         </w:tc>
         <w:tc>
@@ -10869,7 +11090,6 @@
                 <w14:ligatures w14:val="none"/>
               </w:rPr>
             </w:pPr>
-            <w:proofErr w:type="spellStart"/>
             <w:r>
               <w:rPr>
                 <w:rFonts w:ascii="Arial" w:eastAsia="Times New Roman" w:hAnsi="Arial" w:cs="Arial"/>
@@ -10883,7 +11103,6 @@
               </w:rPr>
               <w:t>Electricity_Stats</w:t>
             </w:r>
-            <w:proofErr w:type="spellEnd"/>
           </w:p>
         </w:tc>
         <w:tc>
@@ -10903,7 +11122,6 @@
                 <w14:ligatures w14:val="none"/>
               </w:rPr>
             </w:pPr>
-            <w:proofErr w:type="spellStart"/>
             <w:r>
               <w:rPr>
                 <w:rFonts w:ascii="Arial" w:eastAsia="Times New Roman" w:hAnsi="Arial" w:cs="Arial"/>
@@ -10915,7 +11133,6 @@
               </w:rPr>
               <w:t>Electricity_Billing_Days</w:t>
             </w:r>
-            <w:proofErr w:type="spellEnd"/>
           </w:p>
         </w:tc>
         <w:tc>
@@ -11005,7 +11222,6 @@
                 <w14:ligatures w14:val="none"/>
               </w:rPr>
             </w:pPr>
-            <w:proofErr w:type="spellStart"/>
             <w:r>
               <w:rPr>
                 <w:rFonts w:ascii="Arial" w:eastAsia="Times New Roman" w:hAnsi="Arial" w:cs="Arial"/>
@@ -11019,7 +11235,6 @@
               </w:rPr>
               <w:t>Electricity_Stats</w:t>
             </w:r>
-            <w:proofErr w:type="spellEnd"/>
           </w:p>
         </w:tc>
         <w:tc>
@@ -11039,7 +11254,6 @@
                 <w14:ligatures w14:val="none"/>
               </w:rPr>
             </w:pPr>
-            <w:proofErr w:type="spellStart"/>
             <w:r>
               <w:rPr>
                 <w:rFonts w:ascii="Arial" w:eastAsia="Times New Roman" w:hAnsi="Arial" w:cs="Arial"/>
@@ -11051,7 +11265,6 @@
               </w:rPr>
               <w:t>On_Peak_Energy_Charges</w:t>
             </w:r>
-            <w:proofErr w:type="spellEnd"/>
           </w:p>
         </w:tc>
         <w:tc>
@@ -11071,16 +11284,29 @@
                 <w14:ligatures w14:val="none"/>
               </w:rPr>
             </w:pPr>
-            <w:r>
-              <w:rPr>
-                <w:rFonts w:ascii="Arial" w:eastAsia="Times New Roman" w:hAnsi="Arial" w:cs="Arial"/>
-                <w:color w:val="000000"/>
-                <w:kern w:val="0"/>
-                <w:sz w:val="22"/>
-                <w:szCs w:val="22"/>
-                <w14:ligatures w14:val="none"/>
-              </w:rPr>
-              <w:t>Decimal(10,2)</w:t>
+            <w:proofErr w:type="gramStart"/>
+            <w:r>
+              <w:rPr>
+                <w:rFonts w:ascii="Arial" w:eastAsia="Times New Roman" w:hAnsi="Arial" w:cs="Arial"/>
+                <w:color w:val="000000"/>
+                <w:kern w:val="0"/>
+                <w:sz w:val="22"/>
+                <w:szCs w:val="22"/>
+                <w14:ligatures w14:val="none"/>
+              </w:rPr>
+              <w:t>Decimal(</w:t>
+            </w:r>
+            <w:proofErr w:type="gramEnd"/>
+            <w:r>
+              <w:rPr>
+                <w:rFonts w:ascii="Arial" w:eastAsia="Times New Roman" w:hAnsi="Arial" w:cs="Arial"/>
+                <w:color w:val="000000"/>
+                <w:kern w:val="0"/>
+                <w:sz w:val="22"/>
+                <w:szCs w:val="22"/>
+                <w14:ligatures w14:val="none"/>
+              </w:rPr>
+              <w:t>10,2)</w:t>
             </w:r>
           </w:p>
         </w:tc>
@@ -11141,7 +11367,6 @@
                 <w14:ligatures w14:val="none"/>
               </w:rPr>
             </w:pPr>
-            <w:proofErr w:type="spellStart"/>
             <w:r>
               <w:rPr>
                 <w:rFonts w:ascii="Arial" w:eastAsia="Times New Roman" w:hAnsi="Arial" w:cs="Arial"/>
@@ -11155,7 +11380,6 @@
               </w:rPr>
               <w:t>Electricity_Stats</w:t>
             </w:r>
-            <w:proofErr w:type="spellEnd"/>
           </w:p>
         </w:tc>
         <w:tc>
@@ -11175,7 +11399,6 @@
                 <w14:ligatures w14:val="none"/>
               </w:rPr>
             </w:pPr>
-            <w:proofErr w:type="spellStart"/>
             <w:r>
               <w:rPr>
                 <w:rFonts w:ascii="Arial" w:eastAsia="Times New Roman" w:hAnsi="Arial" w:cs="Arial"/>
@@ -11187,7 +11410,6 @@
               </w:rPr>
               <w:t>Off_Peak_Energy_Charges</w:t>
             </w:r>
-            <w:proofErr w:type="spellEnd"/>
           </w:p>
         </w:tc>
         <w:tc>
@@ -11207,16 +11429,29 @@
                 <w14:ligatures w14:val="none"/>
               </w:rPr>
             </w:pPr>
-            <w:r>
-              <w:rPr>
-                <w:rFonts w:ascii="Arial" w:eastAsia="Times New Roman" w:hAnsi="Arial" w:cs="Arial"/>
-                <w:color w:val="000000"/>
-                <w:kern w:val="0"/>
-                <w:sz w:val="22"/>
-                <w:szCs w:val="22"/>
-                <w14:ligatures w14:val="none"/>
-              </w:rPr>
-              <w:t>Decimal(10,2)</w:t>
+            <w:proofErr w:type="gramStart"/>
+            <w:r>
+              <w:rPr>
+                <w:rFonts w:ascii="Arial" w:eastAsia="Times New Roman" w:hAnsi="Arial" w:cs="Arial"/>
+                <w:color w:val="000000"/>
+                <w:kern w:val="0"/>
+                <w:sz w:val="22"/>
+                <w:szCs w:val="22"/>
+                <w14:ligatures w14:val="none"/>
+              </w:rPr>
+              <w:t>Decimal(</w:t>
+            </w:r>
+            <w:proofErr w:type="gramEnd"/>
+            <w:r>
+              <w:rPr>
+                <w:rFonts w:ascii="Arial" w:eastAsia="Times New Roman" w:hAnsi="Arial" w:cs="Arial"/>
+                <w:color w:val="000000"/>
+                <w:kern w:val="0"/>
+                <w:sz w:val="22"/>
+                <w:szCs w:val="22"/>
+                <w14:ligatures w14:val="none"/>
+              </w:rPr>
+              <w:t>10,2)</w:t>
             </w:r>
           </w:p>
         </w:tc>
@@ -11277,7 +11512,6 @@
                 <w14:ligatures w14:val="none"/>
               </w:rPr>
             </w:pPr>
-            <w:proofErr w:type="spellStart"/>
             <w:r>
               <w:rPr>
                 <w:rFonts w:ascii="Arial" w:eastAsia="Times New Roman" w:hAnsi="Arial" w:cs="Arial"/>
@@ -11291,7 +11525,6 @@
               </w:rPr>
               <w:t>Electricity_Stats</w:t>
             </w:r>
-            <w:proofErr w:type="spellEnd"/>
           </w:p>
         </w:tc>
         <w:tc>
@@ -11311,7 +11544,6 @@
                 <w14:ligatures w14:val="none"/>
               </w:rPr>
             </w:pPr>
-            <w:proofErr w:type="spellStart"/>
             <w:r>
               <w:rPr>
                 <w:rFonts w:ascii="Arial" w:eastAsia="Times New Roman" w:hAnsi="Arial" w:cs="Arial"/>
@@ -11323,7 +11555,6 @@
               </w:rPr>
               <w:t>System_Demand_Charges</w:t>
             </w:r>
-            <w:proofErr w:type="spellEnd"/>
           </w:p>
         </w:tc>
         <w:tc>
@@ -11343,16 +11574,29 @@
                 <w14:ligatures w14:val="none"/>
               </w:rPr>
             </w:pPr>
-            <w:r>
-              <w:rPr>
-                <w:rFonts w:ascii="Arial" w:eastAsia="Times New Roman" w:hAnsi="Arial" w:cs="Arial"/>
-                <w:color w:val="000000"/>
-                <w:kern w:val="0"/>
-                <w:sz w:val="22"/>
-                <w:szCs w:val="22"/>
-                <w14:ligatures w14:val="none"/>
-              </w:rPr>
-              <w:t>Decimal(10,2)</w:t>
+            <w:proofErr w:type="gramStart"/>
+            <w:r>
+              <w:rPr>
+                <w:rFonts w:ascii="Arial" w:eastAsia="Times New Roman" w:hAnsi="Arial" w:cs="Arial"/>
+                <w:color w:val="000000"/>
+                <w:kern w:val="0"/>
+                <w:sz w:val="22"/>
+                <w:szCs w:val="22"/>
+                <w14:ligatures w14:val="none"/>
+              </w:rPr>
+              <w:t>Decimal(</w:t>
+            </w:r>
+            <w:proofErr w:type="gramEnd"/>
+            <w:r>
+              <w:rPr>
+                <w:rFonts w:ascii="Arial" w:eastAsia="Times New Roman" w:hAnsi="Arial" w:cs="Arial"/>
+                <w:color w:val="000000"/>
+                <w:kern w:val="0"/>
+                <w:sz w:val="22"/>
+                <w:szCs w:val="22"/>
+                <w14:ligatures w14:val="none"/>
+              </w:rPr>
+              <w:t>10,2)</w:t>
             </w:r>
           </w:p>
         </w:tc>
@@ -11413,7 +11657,6 @@
                 <w14:ligatures w14:val="none"/>
               </w:rPr>
             </w:pPr>
-            <w:proofErr w:type="spellStart"/>
             <w:r>
               <w:rPr>
                 <w:rFonts w:ascii="Arial" w:eastAsia="Times New Roman" w:hAnsi="Arial" w:cs="Arial"/>
@@ -11427,7 +11670,6 @@
               </w:rPr>
               <w:t>Electricity_Stats</w:t>
             </w:r>
-            <w:proofErr w:type="spellEnd"/>
           </w:p>
         </w:tc>
         <w:tc>
@@ -11447,7 +11689,6 @@
                 <w14:ligatures w14:val="none"/>
               </w:rPr>
             </w:pPr>
-            <w:proofErr w:type="spellStart"/>
             <w:r>
               <w:rPr>
                 <w:rFonts w:ascii="Arial" w:eastAsia="Times New Roman" w:hAnsi="Arial" w:cs="Arial"/>
@@ -11459,7 +11700,6 @@
               </w:rPr>
               <w:t>Customer_Demand_Charges</w:t>
             </w:r>
-            <w:proofErr w:type="spellEnd"/>
           </w:p>
         </w:tc>
         <w:tc>
@@ -11479,16 +11719,29 @@
                 <w14:ligatures w14:val="none"/>
               </w:rPr>
             </w:pPr>
-            <w:r>
-              <w:rPr>
-                <w:rFonts w:ascii="Arial" w:eastAsia="Times New Roman" w:hAnsi="Arial" w:cs="Arial"/>
-                <w:color w:val="000000"/>
-                <w:kern w:val="0"/>
-                <w:sz w:val="22"/>
-                <w:szCs w:val="22"/>
-                <w14:ligatures w14:val="none"/>
-              </w:rPr>
-              <w:t>Decimal(10,2)</w:t>
+            <w:proofErr w:type="gramStart"/>
+            <w:r>
+              <w:rPr>
+                <w:rFonts w:ascii="Arial" w:eastAsia="Times New Roman" w:hAnsi="Arial" w:cs="Arial"/>
+                <w:color w:val="000000"/>
+                <w:kern w:val="0"/>
+                <w:sz w:val="22"/>
+                <w:szCs w:val="22"/>
+                <w14:ligatures w14:val="none"/>
+              </w:rPr>
+              <w:t>Decimal(</w:t>
+            </w:r>
+            <w:proofErr w:type="gramEnd"/>
+            <w:r>
+              <w:rPr>
+                <w:rFonts w:ascii="Arial" w:eastAsia="Times New Roman" w:hAnsi="Arial" w:cs="Arial"/>
+                <w:color w:val="000000"/>
+                <w:kern w:val="0"/>
+                <w:sz w:val="22"/>
+                <w:szCs w:val="22"/>
+                <w14:ligatures w14:val="none"/>
+              </w:rPr>
+              <w:t>10,2)</w:t>
             </w:r>
           </w:p>
         </w:tc>
@@ -11549,7 +11802,6 @@
                 <w14:ligatures w14:val="none"/>
               </w:rPr>
             </w:pPr>
-            <w:proofErr w:type="spellStart"/>
             <w:r>
               <w:rPr>
                 <w:rFonts w:ascii="Arial" w:eastAsia="Times New Roman" w:hAnsi="Arial" w:cs="Arial"/>
@@ -11563,7 +11815,6 @@
               </w:rPr>
               <w:t>Electricity_Stats</w:t>
             </w:r>
-            <w:proofErr w:type="spellEnd"/>
           </w:p>
         </w:tc>
         <w:tc>
@@ -11583,7 +11834,6 @@
                 <w14:ligatures w14:val="none"/>
               </w:rPr>
             </w:pPr>
-            <w:proofErr w:type="spellStart"/>
             <w:r>
               <w:rPr>
                 <w:rFonts w:ascii="Arial" w:eastAsia="Times New Roman" w:hAnsi="Arial" w:cs="Arial"/>
@@ -11595,7 +11845,6 @@
               </w:rPr>
               <w:t>Customer_Charge</w:t>
             </w:r>
-            <w:proofErr w:type="spellEnd"/>
           </w:p>
         </w:tc>
         <w:tc>
@@ -11685,7 +11934,6 @@
                 <w14:ligatures w14:val="none"/>
               </w:rPr>
             </w:pPr>
-            <w:proofErr w:type="spellStart"/>
             <w:r>
               <w:rPr>
                 <w:rFonts w:ascii="Arial" w:eastAsia="Times New Roman" w:hAnsi="Arial" w:cs="Arial"/>
@@ -11699,7 +11947,6 @@
               </w:rPr>
               <w:t>Electricity_Stats</w:t>
             </w:r>
-            <w:proofErr w:type="spellEnd"/>
           </w:p>
         </w:tc>
         <w:tc>
@@ -11719,7 +11966,6 @@
                 <w14:ligatures w14:val="none"/>
               </w:rPr>
             </w:pPr>
-            <w:proofErr w:type="spellStart"/>
             <w:r>
               <w:rPr>
                 <w:rFonts w:ascii="Arial" w:eastAsia="Times New Roman" w:hAnsi="Arial" w:cs="Arial"/>
@@ -11731,7 +11977,6 @@
               </w:rPr>
               <w:t>Other_Charges</w:t>
             </w:r>
-            <w:proofErr w:type="spellEnd"/>
           </w:p>
         </w:tc>
         <w:tc>
@@ -11751,16 +11996,29 @@
                 <w14:ligatures w14:val="none"/>
               </w:rPr>
             </w:pPr>
-            <w:r>
-              <w:rPr>
-                <w:rFonts w:ascii="Arial" w:eastAsia="Times New Roman" w:hAnsi="Arial" w:cs="Arial"/>
-                <w:color w:val="000000"/>
-                <w:kern w:val="0"/>
-                <w:sz w:val="22"/>
-                <w:szCs w:val="22"/>
-                <w14:ligatures w14:val="none"/>
-              </w:rPr>
-              <w:t>Decimal(10,2)</w:t>
+            <w:proofErr w:type="gramStart"/>
+            <w:r>
+              <w:rPr>
+                <w:rFonts w:ascii="Arial" w:eastAsia="Times New Roman" w:hAnsi="Arial" w:cs="Arial"/>
+                <w:color w:val="000000"/>
+                <w:kern w:val="0"/>
+                <w:sz w:val="22"/>
+                <w:szCs w:val="22"/>
+                <w14:ligatures w14:val="none"/>
+              </w:rPr>
+              <w:t>Decimal(</w:t>
+            </w:r>
+            <w:proofErr w:type="gramEnd"/>
+            <w:r>
+              <w:rPr>
+                <w:rFonts w:ascii="Arial" w:eastAsia="Times New Roman" w:hAnsi="Arial" w:cs="Arial"/>
+                <w:color w:val="000000"/>
+                <w:kern w:val="0"/>
+                <w:sz w:val="22"/>
+                <w:szCs w:val="22"/>
+                <w14:ligatures w14:val="none"/>
+              </w:rPr>
+              <w:t>10,2)</w:t>
             </w:r>
           </w:p>
         </w:tc>
@@ -11821,7 +12079,6 @@
                 <w14:ligatures w14:val="none"/>
               </w:rPr>
             </w:pPr>
-            <w:proofErr w:type="spellStart"/>
             <w:r>
               <w:rPr>
                 <w:rFonts w:ascii="Arial" w:eastAsia="Times New Roman" w:hAnsi="Arial" w:cs="Arial"/>
@@ -11835,7 +12092,6 @@
               </w:rPr>
               <w:t>Electricity_Stats</w:t>
             </w:r>
-            <w:proofErr w:type="spellEnd"/>
           </w:p>
         </w:tc>
         <w:tc>
@@ -11855,7 +12111,6 @@
                 <w14:ligatures w14:val="none"/>
               </w:rPr>
             </w:pPr>
-            <w:proofErr w:type="spellStart"/>
             <w:r>
               <w:rPr>
                 <w:rFonts w:ascii="Arial" w:eastAsia="Times New Roman" w:hAnsi="Arial" w:cs="Arial"/>
@@ -11867,7 +12122,6 @@
               </w:rPr>
               <w:t>Tax_Cost</w:t>
             </w:r>
-            <w:proofErr w:type="spellEnd"/>
           </w:p>
         </w:tc>
         <w:tc>
@@ -11887,16 +12141,29 @@
                 <w14:ligatures w14:val="none"/>
               </w:rPr>
             </w:pPr>
-            <w:r>
-              <w:rPr>
-                <w:rFonts w:ascii="Arial" w:eastAsia="Times New Roman" w:hAnsi="Arial" w:cs="Arial"/>
-                <w:color w:val="000000"/>
-                <w:kern w:val="0"/>
-                <w:sz w:val="22"/>
-                <w:szCs w:val="22"/>
-                <w14:ligatures w14:val="none"/>
-              </w:rPr>
-              <w:t>Decimal(10,2)</w:t>
+            <w:proofErr w:type="gramStart"/>
+            <w:r>
+              <w:rPr>
+                <w:rFonts w:ascii="Arial" w:eastAsia="Times New Roman" w:hAnsi="Arial" w:cs="Arial"/>
+                <w:color w:val="000000"/>
+                <w:kern w:val="0"/>
+                <w:sz w:val="22"/>
+                <w:szCs w:val="22"/>
+                <w14:ligatures w14:val="none"/>
+              </w:rPr>
+              <w:t>Decimal(</w:t>
+            </w:r>
+            <w:proofErr w:type="gramEnd"/>
+            <w:r>
+              <w:rPr>
+                <w:rFonts w:ascii="Arial" w:eastAsia="Times New Roman" w:hAnsi="Arial" w:cs="Arial"/>
+                <w:color w:val="000000"/>
+                <w:kern w:val="0"/>
+                <w:sz w:val="22"/>
+                <w:szCs w:val="22"/>
+                <w14:ligatures w14:val="none"/>
+              </w:rPr>
+              <w:t>10,2)</w:t>
             </w:r>
           </w:p>
         </w:tc>
@@ -11957,7 +12224,6 @@
                 <w14:ligatures w14:val="none"/>
               </w:rPr>
             </w:pPr>
-            <w:proofErr w:type="spellStart"/>
             <w:r>
               <w:rPr>
                 <w:rFonts w:ascii="Arial" w:eastAsia="Times New Roman" w:hAnsi="Arial" w:cs="Arial"/>
@@ -11971,7 +12237,6 @@
               </w:rPr>
               <w:t>Electricity_Stats</w:t>
             </w:r>
-            <w:proofErr w:type="spellEnd"/>
           </w:p>
         </w:tc>
         <w:tc>
@@ -11991,7 +12256,6 @@
                 <w14:ligatures w14:val="none"/>
               </w:rPr>
             </w:pPr>
-            <w:proofErr w:type="spellStart"/>
             <w:r>
               <w:rPr>
                 <w:rFonts w:ascii="Arial" w:eastAsia="Times New Roman" w:hAnsi="Arial" w:cs="Arial"/>
@@ -12003,7 +12267,6 @@
               </w:rPr>
               <w:t>Summary_Of_Other_Charges</w:t>
             </w:r>
-            <w:proofErr w:type="spellEnd"/>
           </w:p>
         </w:tc>
         <w:tc>
@@ -12023,16 +12286,29 @@
                 <w14:ligatures w14:val="none"/>
               </w:rPr>
             </w:pPr>
-            <w:r>
-              <w:rPr>
-                <w:rFonts w:ascii="Arial" w:eastAsia="Times New Roman" w:hAnsi="Arial" w:cs="Arial"/>
-                <w:color w:val="000000"/>
-                <w:kern w:val="0"/>
-                <w:sz w:val="22"/>
-                <w:szCs w:val="22"/>
-                <w14:ligatures w14:val="none"/>
-              </w:rPr>
-              <w:t>Decimal(10,2)</w:t>
+            <w:proofErr w:type="gramStart"/>
+            <w:r>
+              <w:rPr>
+                <w:rFonts w:ascii="Arial" w:eastAsia="Times New Roman" w:hAnsi="Arial" w:cs="Arial"/>
+                <w:color w:val="000000"/>
+                <w:kern w:val="0"/>
+                <w:sz w:val="22"/>
+                <w:szCs w:val="22"/>
+                <w14:ligatures w14:val="none"/>
+              </w:rPr>
+              <w:t>Decimal(</w:t>
+            </w:r>
+            <w:proofErr w:type="gramEnd"/>
+            <w:r>
+              <w:rPr>
+                <w:rFonts w:ascii="Arial" w:eastAsia="Times New Roman" w:hAnsi="Arial" w:cs="Arial"/>
+                <w:color w:val="000000"/>
+                <w:kern w:val="0"/>
+                <w:sz w:val="22"/>
+                <w:szCs w:val="22"/>
+                <w14:ligatures w14:val="none"/>
+              </w:rPr>
+              <w:t>10,2)</w:t>
             </w:r>
           </w:p>
         </w:tc>
@@ -12093,7 +12369,6 @@
                 <w14:ligatures w14:val="none"/>
               </w:rPr>
             </w:pPr>
-            <w:proofErr w:type="spellStart"/>
             <w:r>
               <w:rPr>
                 <w:rFonts w:ascii="Arial" w:eastAsia="Times New Roman" w:hAnsi="Arial" w:cs="Arial"/>
@@ -12107,7 +12382,6 @@
               </w:rPr>
               <w:t>Electricity_Stats</w:t>
             </w:r>
-            <w:proofErr w:type="spellEnd"/>
           </w:p>
         </w:tc>
         <w:tc>
@@ -12127,7 +12401,6 @@
                 <w14:ligatures w14:val="none"/>
               </w:rPr>
             </w:pPr>
-            <w:proofErr w:type="spellStart"/>
             <w:r>
               <w:rPr>
                 <w:rFonts w:ascii="Arial" w:eastAsia="Times New Roman" w:hAnsi="Arial" w:cs="Arial"/>
@@ -12139,7 +12412,6 @@
               </w:rPr>
               <w:t>Previous_Balance_And_Adjustments_Electric</w:t>
             </w:r>
-            <w:proofErr w:type="spellEnd"/>
           </w:p>
         </w:tc>
         <w:tc>
@@ -12159,16 +12431,29 @@
                 <w14:ligatures w14:val="none"/>
               </w:rPr>
             </w:pPr>
-            <w:r>
-              <w:rPr>
-                <w:rFonts w:ascii="Arial" w:eastAsia="Times New Roman" w:hAnsi="Arial" w:cs="Arial"/>
-                <w:color w:val="000000"/>
-                <w:kern w:val="0"/>
-                <w:sz w:val="22"/>
-                <w:szCs w:val="22"/>
-                <w14:ligatures w14:val="none"/>
-              </w:rPr>
-              <w:t>Decimal(10,2)</w:t>
+            <w:proofErr w:type="gramStart"/>
+            <w:r>
+              <w:rPr>
+                <w:rFonts w:ascii="Arial" w:eastAsia="Times New Roman" w:hAnsi="Arial" w:cs="Arial"/>
+                <w:color w:val="000000"/>
+                <w:kern w:val="0"/>
+                <w:sz w:val="22"/>
+                <w:szCs w:val="22"/>
+                <w14:ligatures w14:val="none"/>
+              </w:rPr>
+              <w:t>Decimal(</w:t>
+            </w:r>
+            <w:proofErr w:type="gramEnd"/>
+            <w:r>
+              <w:rPr>
+                <w:rFonts w:ascii="Arial" w:eastAsia="Times New Roman" w:hAnsi="Arial" w:cs="Arial"/>
+                <w:color w:val="000000"/>
+                <w:kern w:val="0"/>
+                <w:sz w:val="22"/>
+                <w:szCs w:val="22"/>
+                <w14:ligatures w14:val="none"/>
+              </w:rPr>
+              <w:t>10,2)</w:t>
             </w:r>
           </w:p>
         </w:tc>
@@ -12229,7 +12514,6 @@
                 <w14:ligatures w14:val="none"/>
               </w:rPr>
             </w:pPr>
-            <w:proofErr w:type="spellStart"/>
             <w:r>
               <w:rPr>
                 <w:rFonts w:ascii="Arial" w:eastAsia="Times New Roman" w:hAnsi="Arial" w:cs="Arial"/>
@@ -12243,7 +12527,6 @@
               </w:rPr>
               <w:t>Electricity_Stats</w:t>
             </w:r>
-            <w:proofErr w:type="spellEnd"/>
           </w:p>
         </w:tc>
         <w:tc>
@@ -12263,7 +12546,6 @@
                 <w14:ligatures w14:val="none"/>
               </w:rPr>
             </w:pPr>
-            <w:proofErr w:type="spellStart"/>
             <w:r>
               <w:rPr>
                 <w:rFonts w:ascii="Arial" w:eastAsia="Times New Roman" w:hAnsi="Arial" w:cs="Arial"/>
@@ -12275,7 +12557,6 @@
               </w:rPr>
               <w:t>On_Peak_Energy_Usage_kWh</w:t>
             </w:r>
-            <w:proofErr w:type="spellEnd"/>
           </w:p>
         </w:tc>
         <w:tc>
@@ -12365,7 +12646,6 @@
                 <w14:ligatures w14:val="none"/>
               </w:rPr>
             </w:pPr>
-            <w:proofErr w:type="spellStart"/>
             <w:r>
               <w:rPr>
                 <w:rFonts w:ascii="Arial" w:eastAsia="Times New Roman" w:hAnsi="Arial" w:cs="Arial"/>
@@ -12379,7 +12659,6 @@
               </w:rPr>
               <w:t>Electricity_Stats</w:t>
             </w:r>
-            <w:proofErr w:type="spellEnd"/>
           </w:p>
         </w:tc>
         <w:tc>
@@ -12399,7 +12678,6 @@
                 <w14:ligatures w14:val="none"/>
               </w:rPr>
             </w:pPr>
-            <w:proofErr w:type="spellStart"/>
             <w:r>
               <w:rPr>
                 <w:rFonts w:ascii="Arial" w:eastAsia="Times New Roman" w:hAnsi="Arial" w:cs="Arial"/>
@@ -12433,7 +12711,6 @@
               </w:rPr>
               <w:t>_Peak_Energy_Usage_kWh</w:t>
             </w:r>
-            <w:proofErr w:type="spellEnd"/>
           </w:p>
         </w:tc>
         <w:tc>
@@ -12523,7 +12800,6 @@
                 <w14:ligatures w14:val="none"/>
               </w:rPr>
             </w:pPr>
-            <w:proofErr w:type="spellStart"/>
             <w:r>
               <w:rPr>
                 <w:rFonts w:ascii="Arial" w:eastAsia="Times New Roman" w:hAnsi="Arial" w:cs="Arial"/>
@@ -12537,7 +12813,6 @@
               </w:rPr>
               <w:t>Electricity_Stats</w:t>
             </w:r>
-            <w:proofErr w:type="spellEnd"/>
           </w:p>
         </w:tc>
         <w:tc>
@@ -12557,7 +12832,6 @@
                 <w14:ligatures w14:val="none"/>
               </w:rPr>
             </w:pPr>
-            <w:proofErr w:type="spellStart"/>
             <w:r>
               <w:rPr>
                 <w:rFonts w:ascii="Arial" w:eastAsia="Times New Roman" w:hAnsi="Arial" w:cs="Arial"/>
@@ -12569,7 +12843,6 @@
               </w:rPr>
               <w:t>System_Demand_kW</w:t>
             </w:r>
-            <w:proofErr w:type="spellEnd"/>
           </w:p>
         </w:tc>
         <w:tc>
@@ -12659,7 +12932,6 @@
                 <w14:ligatures w14:val="none"/>
               </w:rPr>
             </w:pPr>
-            <w:proofErr w:type="spellStart"/>
             <w:r>
               <w:rPr>
                 <w:rFonts w:ascii="Arial" w:eastAsia="Times New Roman" w:hAnsi="Arial" w:cs="Arial"/>
@@ -12673,7 +12945,6 @@
               </w:rPr>
               <w:t>Electricity_Stats</w:t>
             </w:r>
-            <w:proofErr w:type="spellEnd"/>
           </w:p>
         </w:tc>
         <w:tc>
@@ -12693,7 +12964,6 @@
                 <w14:ligatures w14:val="none"/>
               </w:rPr>
             </w:pPr>
-            <w:proofErr w:type="spellStart"/>
             <w:r>
               <w:rPr>
                 <w:rFonts w:ascii="Arial" w:eastAsia="Times New Roman" w:hAnsi="Arial" w:cs="Arial"/>
@@ -12705,7 +12975,6 @@
               </w:rPr>
               <w:t>Electricity_Heating_Degree_Days</w:t>
             </w:r>
-            <w:proofErr w:type="spellEnd"/>
           </w:p>
         </w:tc>
         <w:tc>
@@ -12795,7 +13064,6 @@
                 <w14:ligatures w14:val="none"/>
               </w:rPr>
             </w:pPr>
-            <w:proofErr w:type="spellStart"/>
             <w:r>
               <w:rPr>
                 <w:rFonts w:ascii="Arial" w:eastAsia="Times New Roman" w:hAnsi="Arial" w:cs="Arial"/>
@@ -12809,7 +13077,6 @@
               </w:rPr>
               <w:t>Electricity_Stats</w:t>
             </w:r>
-            <w:proofErr w:type="spellEnd"/>
           </w:p>
         </w:tc>
         <w:tc>
@@ -12829,7 +13096,6 @@
                 <w14:ligatures w14:val="none"/>
               </w:rPr>
             </w:pPr>
-            <w:proofErr w:type="spellStart"/>
             <w:r>
               <w:rPr>
                 <w:rFonts w:ascii="Arial" w:eastAsia="Times New Roman" w:hAnsi="Arial" w:cs="Arial"/>
@@ -12863,7 +13129,6 @@
               </w:rPr>
               <w:t>_Degree_Days</w:t>
             </w:r>
-            <w:proofErr w:type="spellEnd"/>
           </w:p>
         </w:tc>
         <w:tc>
@@ -12953,7 +13218,6 @@
                 <w14:ligatures w14:val="none"/>
               </w:rPr>
             </w:pPr>
-            <w:proofErr w:type="spellStart"/>
             <w:r>
               <w:rPr>
                 <w:rFonts w:ascii="Arial" w:eastAsia="Times New Roman" w:hAnsi="Arial" w:cs="Arial"/>
@@ -12967,7 +13231,6 @@
               </w:rPr>
               <w:t>Electricity_Stats</w:t>
             </w:r>
-            <w:proofErr w:type="spellEnd"/>
           </w:p>
         </w:tc>
         <w:tc>
@@ -12987,7 +13250,6 @@
                 <w14:ligatures w14:val="none"/>
               </w:rPr>
             </w:pPr>
-            <w:proofErr w:type="spellStart"/>
             <w:r>
               <w:rPr>
                 <w:rFonts w:ascii="Arial" w:eastAsia="Times New Roman" w:hAnsi="Arial" w:cs="Arial"/>
@@ -12999,7 +13261,6 @@
               </w:rPr>
               <w:t>Worker_ID</w:t>
             </w:r>
-            <w:proofErr w:type="spellEnd"/>
           </w:p>
         </w:tc>
         <w:tc>
@@ -13193,7 +13454,6 @@
                 <w:szCs w:val="22"/>
               </w:rPr>
             </w:pPr>
-            <w:proofErr w:type="spellStart"/>
             <w:r>
               <w:rPr>
                 <w:rFonts w:ascii="Arial" w:hAnsi="Arial" w:cs="Arial"/>
@@ -13202,7 +13462,6 @@
               </w:rPr>
               <w:t>Glycol_Machine</w:t>
             </w:r>
-            <w:proofErr w:type="spellEnd"/>
           </w:p>
         </w:tc>
         <w:tc>
@@ -13217,7 +13476,6 @@
                 <w:szCs w:val="22"/>
               </w:rPr>
             </w:pPr>
-            <w:proofErr w:type="spellStart"/>
             <w:r>
               <w:rPr>
                 <w:rFonts w:ascii="Arial" w:hAnsi="Arial" w:cs="Arial"/>
@@ -13226,7 +13484,6 @@
               </w:rPr>
               <w:t>Glycol_Machine_ID</w:t>
             </w:r>
-            <w:proofErr w:type="spellEnd"/>
           </w:p>
         </w:tc>
         <w:tc>
@@ -13300,7 +13557,6 @@
                 <w14:ligatures w14:val="none"/>
               </w:rPr>
             </w:pPr>
-            <w:proofErr w:type="spellStart"/>
             <w:r>
               <w:rPr>
                 <w:rFonts w:ascii="Arial" w:hAnsi="Arial" w:cs="Arial"/>
@@ -13311,7 +13567,6 @@
               </w:rPr>
               <w:t>Glycol_Machine</w:t>
             </w:r>
-            <w:proofErr w:type="spellEnd"/>
           </w:p>
         </w:tc>
         <w:tc>
@@ -13331,7 +13586,6 @@
                 <w14:ligatures w14:val="none"/>
               </w:rPr>
             </w:pPr>
-            <w:proofErr w:type="spellStart"/>
             <w:r>
               <w:rPr>
                 <w:rFonts w:ascii="Arial" w:hAnsi="Arial" w:cs="Arial"/>
@@ -13348,7 +13602,6 @@
               </w:rPr>
               <w:t>_Date</w:t>
             </w:r>
-            <w:proofErr w:type="spellEnd"/>
           </w:p>
         </w:tc>
         <w:tc>
@@ -13438,7 +13691,6 @@
                 <w14:ligatures w14:val="none"/>
               </w:rPr>
             </w:pPr>
-            <w:proofErr w:type="spellStart"/>
             <w:r>
               <w:rPr>
                 <w:rFonts w:ascii="Arial" w:hAnsi="Arial" w:cs="Arial"/>
@@ -13449,7 +13701,6 @@
               </w:rPr>
               <w:t>Glycol_Machine</w:t>
             </w:r>
-            <w:proofErr w:type="spellEnd"/>
           </w:p>
         </w:tc>
         <w:tc>
@@ -13469,7 +13720,6 @@
                 <w14:ligatures w14:val="none"/>
               </w:rPr>
             </w:pPr>
-            <w:proofErr w:type="spellStart"/>
             <w:r>
               <w:rPr>
                 <w:rFonts w:ascii="Arial" w:eastAsia="Times New Roman" w:hAnsi="Arial" w:cs="Arial"/>
@@ -13481,7 +13731,6 @@
               </w:rPr>
               <w:t>Before_Pressure_Return_PSI</w:t>
             </w:r>
-            <w:proofErr w:type="spellEnd"/>
           </w:p>
         </w:tc>
         <w:tc>
@@ -13571,7 +13820,6 @@
                 <w14:ligatures w14:val="none"/>
               </w:rPr>
             </w:pPr>
-            <w:proofErr w:type="spellStart"/>
             <w:r>
               <w:rPr>
                 <w:rFonts w:ascii="Arial" w:hAnsi="Arial" w:cs="Arial"/>
@@ -13582,7 +13830,6 @@
               </w:rPr>
               <w:t>Glycol_Machine</w:t>
             </w:r>
-            <w:proofErr w:type="spellEnd"/>
           </w:p>
         </w:tc>
         <w:tc>
@@ -13602,7 +13849,6 @@
                 <w14:ligatures w14:val="none"/>
               </w:rPr>
             </w:pPr>
-            <w:proofErr w:type="spellStart"/>
             <w:r>
               <w:rPr>
                 <w:rFonts w:ascii="Arial" w:eastAsia="Times New Roman" w:hAnsi="Arial" w:cs="Arial"/>
@@ -13614,7 +13860,6 @@
               </w:rPr>
               <w:t>Before_Pressure_Out_PSI</w:t>
             </w:r>
-            <w:proofErr w:type="spellEnd"/>
           </w:p>
         </w:tc>
         <w:tc>
@@ -13704,7 +13949,6 @@
                 <w14:ligatures w14:val="none"/>
               </w:rPr>
             </w:pPr>
-            <w:proofErr w:type="spellStart"/>
             <w:r>
               <w:rPr>
                 <w:rFonts w:ascii="Arial" w:hAnsi="Arial" w:cs="Arial"/>
@@ -13715,7 +13959,6 @@
               </w:rPr>
               <w:t>Glycol_Machine</w:t>
             </w:r>
-            <w:proofErr w:type="spellEnd"/>
           </w:p>
         </w:tc>
         <w:tc>
@@ -13735,7 +13978,6 @@
                 <w14:ligatures w14:val="none"/>
               </w:rPr>
             </w:pPr>
-            <w:proofErr w:type="spellStart"/>
             <w:r>
               <w:rPr>
                 <w:rFonts w:ascii="Arial" w:eastAsia="Times New Roman" w:hAnsi="Arial" w:cs="Arial"/>
@@ -13747,7 +13989,6 @@
               </w:rPr>
               <w:t>Before_Measure_Line</w:t>
             </w:r>
-            <w:proofErr w:type="spellEnd"/>
           </w:p>
         </w:tc>
         <w:tc>
@@ -13767,16 +14008,29 @@
                 <w14:ligatures w14:val="none"/>
               </w:rPr>
             </w:pPr>
-            <w:r>
-              <w:rPr>
-                <w:rFonts w:ascii="Arial" w:eastAsia="Times New Roman" w:hAnsi="Arial" w:cs="Arial"/>
-                <w:color w:val="000000"/>
-                <w:kern w:val="0"/>
-                <w:sz w:val="22"/>
-                <w:szCs w:val="22"/>
-                <w14:ligatures w14:val="none"/>
-              </w:rPr>
-              <w:t>Varchar(10)</w:t>
+            <w:proofErr w:type="gramStart"/>
+            <w:r>
+              <w:rPr>
+                <w:rFonts w:ascii="Arial" w:eastAsia="Times New Roman" w:hAnsi="Arial" w:cs="Arial"/>
+                <w:color w:val="000000"/>
+                <w:kern w:val="0"/>
+                <w:sz w:val="22"/>
+                <w:szCs w:val="22"/>
+                <w14:ligatures w14:val="none"/>
+              </w:rPr>
+              <w:t>Varchar(</w:t>
+            </w:r>
+            <w:proofErr w:type="gramEnd"/>
+            <w:r>
+              <w:rPr>
+                <w:rFonts w:ascii="Arial" w:eastAsia="Times New Roman" w:hAnsi="Arial" w:cs="Arial"/>
+                <w:color w:val="000000"/>
+                <w:kern w:val="0"/>
+                <w:sz w:val="22"/>
+                <w:szCs w:val="22"/>
+                <w14:ligatures w14:val="none"/>
+              </w:rPr>
+              <w:t>10)</w:t>
             </w:r>
           </w:p>
         </w:tc>
@@ -13924,7 +14178,6 @@
                 <w14:ligatures w14:val="none"/>
               </w:rPr>
             </w:pPr>
-            <w:proofErr w:type="spellStart"/>
             <w:r>
               <w:rPr>
                 <w:rFonts w:ascii="Arial" w:hAnsi="Arial" w:cs="Arial"/>
@@ -13935,7 +14188,6 @@
               </w:rPr>
               <w:t>Glycol_Machine</w:t>
             </w:r>
-            <w:proofErr w:type="spellEnd"/>
           </w:p>
         </w:tc>
         <w:tc>
@@ -13955,7 +14207,6 @@
                 <w14:ligatures w14:val="none"/>
               </w:rPr>
             </w:pPr>
-            <w:proofErr w:type="spellStart"/>
             <w:r>
               <w:rPr>
                 <w:rFonts w:ascii="Arial" w:eastAsia="Times New Roman" w:hAnsi="Arial" w:cs="Arial"/>
@@ -13967,7 +14218,6 @@
               </w:rPr>
               <w:t>After_Pressure_Return_PSI</w:t>
             </w:r>
-            <w:proofErr w:type="spellEnd"/>
           </w:p>
         </w:tc>
         <w:tc>
@@ -14057,7 +14307,6 @@
                 <w14:ligatures w14:val="none"/>
               </w:rPr>
             </w:pPr>
-            <w:proofErr w:type="spellStart"/>
             <w:r>
               <w:rPr>
                 <w:rFonts w:ascii="Arial" w:hAnsi="Arial" w:cs="Arial"/>
@@ -14068,7 +14317,6 @@
               </w:rPr>
               <w:t>Glycol_Machine</w:t>
             </w:r>
-            <w:proofErr w:type="spellEnd"/>
           </w:p>
         </w:tc>
         <w:tc>
@@ -14088,7 +14336,6 @@
                 <w14:ligatures w14:val="none"/>
               </w:rPr>
             </w:pPr>
-            <w:proofErr w:type="spellStart"/>
             <w:r>
               <w:rPr>
                 <w:rFonts w:ascii="Arial" w:eastAsia="Times New Roman" w:hAnsi="Arial" w:cs="Arial"/>
@@ -14100,7 +14347,6 @@
               </w:rPr>
               <w:t>After_Pressure_Out_PSI</w:t>
             </w:r>
-            <w:proofErr w:type="spellEnd"/>
           </w:p>
         </w:tc>
         <w:tc>
@@ -14190,7 +14436,6 @@
                 <w14:ligatures w14:val="none"/>
               </w:rPr>
             </w:pPr>
-            <w:proofErr w:type="spellStart"/>
             <w:r>
               <w:rPr>
                 <w:rFonts w:ascii="Arial" w:hAnsi="Arial" w:cs="Arial"/>
@@ -14201,7 +14446,6 @@
               </w:rPr>
               <w:t>Glycol_Machine</w:t>
             </w:r>
-            <w:proofErr w:type="spellEnd"/>
           </w:p>
         </w:tc>
         <w:tc>
@@ -14221,7 +14465,6 @@
                 <w14:ligatures w14:val="none"/>
               </w:rPr>
             </w:pPr>
-            <w:proofErr w:type="spellStart"/>
             <w:r>
               <w:rPr>
                 <w:rFonts w:ascii="Arial" w:eastAsia="Times New Roman" w:hAnsi="Arial" w:cs="Arial"/>
@@ -14233,7 +14476,6 @@
               </w:rPr>
               <w:t>After_Measure_Line</w:t>
             </w:r>
-            <w:proofErr w:type="spellEnd"/>
           </w:p>
         </w:tc>
         <w:tc>
@@ -14253,16 +14495,29 @@
                 <w14:ligatures w14:val="none"/>
               </w:rPr>
             </w:pPr>
-            <w:r>
-              <w:rPr>
-                <w:rFonts w:ascii="Arial" w:eastAsia="Times New Roman" w:hAnsi="Arial" w:cs="Arial"/>
-                <w:color w:val="000000"/>
-                <w:kern w:val="0"/>
-                <w:sz w:val="22"/>
-                <w:szCs w:val="22"/>
-                <w14:ligatures w14:val="none"/>
-              </w:rPr>
-              <w:t>Varchar(10)</w:t>
+            <w:proofErr w:type="gramStart"/>
+            <w:r>
+              <w:rPr>
+                <w:rFonts w:ascii="Arial" w:eastAsia="Times New Roman" w:hAnsi="Arial" w:cs="Arial"/>
+                <w:color w:val="000000"/>
+                <w:kern w:val="0"/>
+                <w:sz w:val="22"/>
+                <w:szCs w:val="22"/>
+                <w14:ligatures w14:val="none"/>
+              </w:rPr>
+              <w:t>Varchar(</w:t>
+            </w:r>
+            <w:proofErr w:type="gramEnd"/>
+            <w:r>
+              <w:rPr>
+                <w:rFonts w:ascii="Arial" w:eastAsia="Times New Roman" w:hAnsi="Arial" w:cs="Arial"/>
+                <w:color w:val="000000"/>
+                <w:kern w:val="0"/>
+                <w:sz w:val="22"/>
+                <w:szCs w:val="22"/>
+                <w14:ligatures w14:val="none"/>
+              </w:rPr>
+              <w:t>10)</w:t>
             </w:r>
           </w:p>
         </w:tc>
@@ -14410,7 +14665,6 @@
                 <w14:ligatures w14:val="none"/>
               </w:rPr>
             </w:pPr>
-            <w:proofErr w:type="spellStart"/>
             <w:r>
               <w:rPr>
                 <w:rFonts w:ascii="Arial" w:hAnsi="Arial" w:cs="Arial"/>
@@ -14421,7 +14675,6 @@
               </w:rPr>
               <w:t>Glycol_Machine</w:t>
             </w:r>
-            <w:proofErr w:type="spellEnd"/>
           </w:p>
         </w:tc>
         <w:tc>
@@ -14441,7 +14694,6 @@
                 <w14:ligatures w14:val="none"/>
               </w:rPr>
             </w:pPr>
-            <w:proofErr w:type="spellStart"/>
             <w:r>
               <w:rPr>
                 <w:rFonts w:ascii="Arial" w:eastAsia="Times New Roman" w:hAnsi="Arial" w:cs="Arial"/>
@@ -14453,7 +14705,6 @@
               </w:rPr>
               <w:t>Gallons_Added</w:t>
             </w:r>
-            <w:proofErr w:type="spellEnd"/>
           </w:p>
         </w:tc>
         <w:tc>
@@ -14543,7 +14794,6 @@
                 <w14:ligatures w14:val="none"/>
               </w:rPr>
             </w:pPr>
-            <w:proofErr w:type="spellStart"/>
             <w:r>
               <w:rPr>
                 <w:rFonts w:ascii="Arial" w:hAnsi="Arial" w:cs="Arial"/>
@@ -14554,7 +14804,6 @@
               </w:rPr>
               <w:t>Glycol_Machine</w:t>
             </w:r>
-            <w:proofErr w:type="spellEnd"/>
           </w:p>
         </w:tc>
         <w:tc>
@@ -14604,16 +14853,29 @@
                 <w14:ligatures w14:val="none"/>
               </w:rPr>
             </w:pPr>
-            <w:r>
-              <w:rPr>
-                <w:rFonts w:ascii="Arial" w:eastAsia="Times New Roman" w:hAnsi="Arial" w:cs="Arial"/>
-                <w:color w:val="000000"/>
-                <w:kern w:val="0"/>
-                <w:sz w:val="22"/>
-                <w:szCs w:val="22"/>
-                <w14:ligatures w14:val="none"/>
-              </w:rPr>
-              <w:t>Varchar(20)</w:t>
+            <w:proofErr w:type="gramStart"/>
+            <w:r>
+              <w:rPr>
+                <w:rFonts w:ascii="Arial" w:eastAsia="Times New Roman" w:hAnsi="Arial" w:cs="Arial"/>
+                <w:color w:val="000000"/>
+                <w:kern w:val="0"/>
+                <w:sz w:val="22"/>
+                <w:szCs w:val="22"/>
+                <w14:ligatures w14:val="none"/>
+              </w:rPr>
+              <w:t>Varchar(</w:t>
+            </w:r>
+            <w:proofErr w:type="gramEnd"/>
+            <w:r>
+              <w:rPr>
+                <w:rFonts w:ascii="Arial" w:eastAsia="Times New Roman" w:hAnsi="Arial" w:cs="Arial"/>
+                <w:color w:val="000000"/>
+                <w:kern w:val="0"/>
+                <w:sz w:val="22"/>
+                <w:szCs w:val="22"/>
+                <w14:ligatures w14:val="none"/>
+              </w:rPr>
+              <w:t>20)</w:t>
             </w:r>
           </w:p>
         </w:tc>
@@ -14671,7 +14933,6 @@
                 <w:szCs w:val="22"/>
               </w:rPr>
             </w:pPr>
-            <w:proofErr w:type="spellStart"/>
             <w:r>
               <w:rPr>
                 <w:rFonts w:ascii="Arial" w:hAnsi="Arial" w:cs="Arial"/>
@@ -14682,7 +14943,6 @@
               </w:rPr>
               <w:t>Glycol_Machine</w:t>
             </w:r>
-            <w:proofErr w:type="spellEnd"/>
           </w:p>
         </w:tc>
         <w:tc>
@@ -14702,7 +14962,6 @@
                 <w14:ligatures w14:val="none"/>
               </w:rPr>
             </w:pPr>
-            <w:proofErr w:type="spellStart"/>
             <w:r>
               <w:rPr>
                 <w:rFonts w:ascii="Arial" w:eastAsia="Times New Roman" w:hAnsi="Arial" w:cs="Arial"/>
@@ -14714,7 +14973,6 @@
               </w:rPr>
               <w:t>Worker_ID</w:t>
             </w:r>
-            <w:proofErr w:type="spellEnd"/>
           </w:p>
         </w:tc>
         <w:tc>
@@ -14863,8 +15121,17 @@
           <w:b/>
           <w:bCs/>
         </w:rPr>
-        <w:t>New hoses</w:t>
+        <w:t xml:space="preserve">New </w:t>
       </w:r>
+      <w:proofErr w:type="gramStart"/>
+      <w:r>
+        <w:rPr>
+          <w:b/>
+          <w:bCs/>
+        </w:rPr>
+        <w:t>hoses</w:t>
+      </w:r>
+      <w:proofErr w:type="gramEnd"/>
     </w:p>
     <w:p>
       <w:pPr>
@@ -19014,6 +19281,7 @@
   <w:style w:type="character" w:default="1" w:styleId="DefaultParagraphFont">
     <w:name w:val="Default Paragraph Font"/>
     <w:uiPriority w:val="1"/>
+    <w:semiHidden/>
     <w:unhideWhenUsed/>
   </w:style>
   <w:style w:type="table" w:default="1" w:styleId="TableNormal">

</xml_diff>

<commit_message>
Added checks and repairs for zam and added data to set tables and updated Building Data Schematics document
</commit_message>
<xml_diff>
--- a/Building Data Schematics.docx
+++ b/Building Data Schematics.docx
@@ -2112,6 +2112,35 @@
           </w:p>
           <w:p>
             <w:pPr>
+              <w:pStyle w:val="ListParagraph"/>
+              <w:numPr>
+                <w:ilvl w:val="0"/>
+                <w:numId w:val="2"/>
+              </w:numPr>
+              <w:cnfStyle w:val="000000000000" w:firstRow="0" w:lastRow="0" w:firstColumn="0" w:lastColumn="0" w:oddVBand="0" w:evenVBand="0" w:oddHBand="0" w:evenHBand="0" w:firstRowFirstColumn="0" w:firstRowLastColumn="0" w:lastRowFirstColumn="0" w:lastRowLastColumn="0"/>
+              <w:rPr>
+                <w:rFonts w:ascii="Arial" w:eastAsia="Times New Roman" w:hAnsi="Arial" w:cs="Arial"/>
+                <w:color w:val="000000"/>
+                <w:kern w:val="0"/>
+                <w:sz w:val="22"/>
+                <w:szCs w:val="22"/>
+                <w14:ligatures w14:val="none"/>
+              </w:rPr>
+            </w:pPr>
+            <w:r>
+              <w:rPr>
+                <w:rFonts w:ascii="Arial" w:eastAsia="Times New Roman" w:hAnsi="Arial" w:cs="Arial"/>
+                <w:color w:val="000000"/>
+                <w:kern w:val="0"/>
+                <w:sz w:val="22"/>
+                <w:szCs w:val="22"/>
+                <w14:ligatures w14:val="none"/>
+              </w:rPr>
+              <w:t>Propane</w:t>
+            </w:r>
+          </w:p>
+          <w:p>
+            <w:pPr>
               <w:cnfStyle w:val="000000000000" w:firstRow="0" w:lastRow="0" w:firstColumn="0" w:lastColumn="0" w:oddVBand="0" w:evenVBand="0" w:oddHBand="0" w:evenHBand="0" w:firstRowFirstColumn="0" w:firstRowLastColumn="0" w:lastRowFirstColumn="0" w:lastRowLastColumn="0"/>
               <w:rPr>
                 <w:rFonts w:ascii="Arial" w:eastAsia="Times New Roman" w:hAnsi="Arial" w:cs="Arial"/>
@@ -2772,6 +2801,7 @@
                 <w:szCs w:val="22"/>
                 <w14:ligatures w14:val="none"/>
               </w:rPr>
+              <w:lastRenderedPageBreak/>
               <w:t>Zam_Maintenance</w:t>
             </w:r>
             <w:proofErr w:type="spellEnd"/>
@@ -2911,7 +2941,6 @@
                 <w:szCs w:val="22"/>
                 <w14:ligatures w14:val="none"/>
               </w:rPr>
-              <w:lastRenderedPageBreak/>
               <w:t>Zam_Maintenance</w:t>
             </w:r>
             <w:proofErr w:type="spellEnd"/>
@@ -3822,6 +3851,148 @@
           <w:szCs w:val="40"/>
         </w:rPr>
         <w:t>Rink HVAC Filter Form</w:t>
+      </w:r>
+    </w:p>
+    <w:p>
+      <w:pPr>
+        <w:rPr>
+          <w:b/>
+          <w:bCs/>
+          <w:sz w:val="28"/>
+          <w:szCs w:val="28"/>
+        </w:rPr>
+      </w:pPr>
+      <w:r>
+        <w:rPr>
+          <w:b/>
+          <w:bCs/>
+          <w:sz w:val="28"/>
+          <w:szCs w:val="28"/>
+        </w:rPr>
+        <w:t>Inventory:</w:t>
+      </w:r>
+    </w:p>
+    <w:p>
+      <w:pPr>
+        <w:pStyle w:val="ListParagraph"/>
+        <w:numPr>
+          <w:ilvl w:val="0"/>
+          <w:numId w:val="16"/>
+        </w:numPr>
+        <w:rPr>
+          <w:rFonts w:ascii="Arial" w:eastAsia="Times New Roman" w:hAnsi="Arial" w:cs="Arial"/>
+          <w:color w:val="000000"/>
+          <w:kern w:val="0"/>
+          <w:sz w:val="22"/>
+          <w:szCs w:val="22"/>
+          <w14:ligatures w14:val="none"/>
+        </w:rPr>
+      </w:pPr>
+      <w:r>
+        <w:rPr>
+          <w:rFonts w:ascii="Arial" w:eastAsia="Times New Roman" w:hAnsi="Arial" w:cs="Arial"/>
+          <w:color w:val="000000"/>
+          <w:kern w:val="0"/>
+          <w:sz w:val="22"/>
+          <w:szCs w:val="22"/>
+          <w14:ligatures w14:val="none"/>
+        </w:rPr>
+        <w:t>Number Input for initial inventory</w:t>
+      </w:r>
+      <w:r>
+        <w:rPr>
+          <w:rFonts w:ascii="Arial" w:eastAsia="Times New Roman" w:hAnsi="Arial" w:cs="Arial"/>
+          <w:color w:val="000000"/>
+          <w:kern w:val="0"/>
+          <w:sz w:val="22"/>
+          <w:szCs w:val="22"/>
+          <w14:ligatures w14:val="none"/>
+        </w:rPr>
+        <w:t xml:space="preserve"> or any changes with inventory</w:t>
+      </w:r>
+    </w:p>
+    <w:p>
+      <w:pPr>
+        <w:pStyle w:val="ListParagraph"/>
+        <w:numPr>
+          <w:ilvl w:val="0"/>
+          <w:numId w:val="16"/>
+        </w:numPr>
+        <w:rPr>
+          <w:rFonts w:ascii="Arial" w:eastAsia="Times New Roman" w:hAnsi="Arial" w:cs="Arial"/>
+          <w:color w:val="000000"/>
+          <w:kern w:val="0"/>
+          <w:sz w:val="22"/>
+          <w:szCs w:val="22"/>
+          <w14:ligatures w14:val="none"/>
+        </w:rPr>
+      </w:pPr>
+      <w:r>
+        <w:rPr>
+          <w:rFonts w:ascii="Arial" w:eastAsia="Times New Roman" w:hAnsi="Arial" w:cs="Arial"/>
+          <w:color w:val="000000"/>
+          <w:kern w:val="0"/>
+          <w:sz w:val="22"/>
+          <w:szCs w:val="22"/>
+          <w14:ligatures w14:val="none"/>
+        </w:rPr>
+        <w:t>Auto deduct when checked yes</w:t>
+      </w:r>
+    </w:p>
+    <w:p>
+      <w:pPr>
+        <w:pStyle w:val="ListParagraph"/>
+        <w:numPr>
+          <w:ilvl w:val="0"/>
+          <w:numId w:val="16"/>
+        </w:numPr>
+        <w:rPr>
+          <w:rFonts w:ascii="Arial" w:eastAsia="Times New Roman" w:hAnsi="Arial" w:cs="Arial"/>
+          <w:color w:val="000000"/>
+          <w:kern w:val="0"/>
+          <w:sz w:val="22"/>
+          <w:szCs w:val="22"/>
+          <w14:ligatures w14:val="none"/>
+        </w:rPr>
+      </w:pPr>
+      <w:r>
+        <w:rPr>
+          <w:rFonts w:ascii="Arial" w:eastAsia="Times New Roman" w:hAnsi="Arial" w:cs="Arial"/>
+          <w:color w:val="000000"/>
+          <w:kern w:val="0"/>
+          <w:sz w:val="22"/>
+          <w:szCs w:val="22"/>
+          <w14:ligatures w14:val="none"/>
+        </w:rPr>
+        <w:t>When input is No bring over previous inventory numbers</w:t>
+      </w:r>
+    </w:p>
+    <w:p>
+      <w:pPr>
+        <w:pStyle w:val="ListParagraph"/>
+        <w:numPr>
+          <w:ilvl w:val="0"/>
+          <w:numId w:val="16"/>
+        </w:numPr>
+        <w:rPr>
+          <w:rFonts w:ascii="Arial" w:eastAsia="Times New Roman" w:hAnsi="Arial" w:cs="Arial"/>
+          <w:color w:val="000000"/>
+          <w:kern w:val="0"/>
+          <w:sz w:val="22"/>
+          <w:szCs w:val="22"/>
+          <w14:ligatures w14:val="none"/>
+        </w:rPr>
+      </w:pPr>
+      <w:r>
+        <w:rPr>
+          <w:rFonts w:ascii="Arial" w:eastAsia="Times New Roman" w:hAnsi="Arial" w:cs="Arial"/>
+          <w:color w:val="000000"/>
+          <w:kern w:val="0"/>
+          <w:sz w:val="22"/>
+          <w:szCs w:val="22"/>
+          <w14:ligatures w14:val="none"/>
+        </w:rPr>
+        <w:t>Down and Fixed give the option to auto deduct or not if filters were changed for each size</w:t>
       </w:r>
     </w:p>
     <w:tbl>
@@ -4235,16 +4406,29 @@
                 <w14:ligatures w14:val="none"/>
               </w:rPr>
             </w:pPr>
-            <w:r>
-              <w:rPr>
-                <w:rFonts w:ascii="Arial" w:eastAsia="Times New Roman" w:hAnsi="Arial" w:cs="Arial"/>
-                <w:color w:val="000000"/>
-                <w:kern w:val="0"/>
-                <w:sz w:val="22"/>
-                <w:szCs w:val="22"/>
-                <w14:ligatures w14:val="none"/>
-              </w:rPr>
-              <w:t>Bool</w:t>
+            <w:proofErr w:type="gramStart"/>
+            <w:r>
+              <w:rPr>
+                <w:rFonts w:ascii="Arial" w:eastAsia="Times New Roman" w:hAnsi="Arial" w:cs="Arial"/>
+                <w:color w:val="000000"/>
+                <w:kern w:val="0"/>
+                <w:sz w:val="22"/>
+                <w:szCs w:val="22"/>
+                <w14:ligatures w14:val="none"/>
+              </w:rPr>
+              <w:t>VARCHAR(</w:t>
+            </w:r>
+            <w:proofErr w:type="gramEnd"/>
+            <w:r>
+              <w:rPr>
+                <w:rFonts w:ascii="Arial" w:eastAsia="Times New Roman" w:hAnsi="Arial" w:cs="Arial"/>
+                <w:color w:val="000000"/>
+                <w:kern w:val="0"/>
+                <w:sz w:val="22"/>
+                <w:szCs w:val="22"/>
+                <w14:ligatures w14:val="none"/>
+              </w:rPr>
+              <w:t>5)</w:t>
             </w:r>
           </w:p>
         </w:tc>
@@ -4274,7 +4458,51 @@
                 <w:szCs w:val="22"/>
                 <w14:ligatures w14:val="none"/>
               </w:rPr>
-              <w:t>Yes/No Dropdown</w:t>
+              <w:t>Yes/No</w:t>
+            </w:r>
+            <w:r>
+              <w:rPr>
+                <w:rFonts w:ascii="Arial" w:eastAsia="Times New Roman" w:hAnsi="Arial" w:cs="Arial"/>
+                <w:color w:val="000000"/>
+                <w:kern w:val="0"/>
+                <w:sz w:val="22"/>
+                <w:szCs w:val="22"/>
+                <w14:ligatures w14:val="none"/>
+              </w:rPr>
+              <w:t>/Down</w:t>
+            </w:r>
+            <w:r>
+              <w:rPr>
+                <w:rFonts w:ascii="Arial" w:eastAsia="Times New Roman" w:hAnsi="Arial" w:cs="Arial"/>
+                <w:color w:val="000000"/>
+                <w:kern w:val="0"/>
+                <w:sz w:val="22"/>
+                <w:szCs w:val="22"/>
+                <w14:ligatures w14:val="none"/>
+              </w:rPr>
+              <w:t>/Fixed</w:t>
+            </w:r>
+            <w:r>
+              <w:rPr>
+                <w:rFonts w:ascii="Arial" w:eastAsia="Times New Roman" w:hAnsi="Arial" w:cs="Arial"/>
+                <w:color w:val="000000"/>
+                <w:kern w:val="0"/>
+                <w:sz w:val="22"/>
+                <w:szCs w:val="22"/>
+                <w14:ligatures w14:val="none"/>
+              </w:rPr>
+              <w:t xml:space="preserve"> </w:t>
+            </w:r>
+            <w:r>
+              <w:rPr>
+                <w:rFonts w:ascii="Arial" w:eastAsia="Times New Roman" w:hAnsi="Arial" w:cs="Arial"/>
+                <w:color w:val="000000"/>
+                <w:kern w:val="0"/>
+                <w:sz w:val="22"/>
+                <w:szCs w:val="22"/>
+                <w14:ligatures w14:val="none"/>
+              </w:rPr>
+              <w:t>Dropdown</w:t>
             </w:r>
           </w:p>
           <w:p>
@@ -4395,16 +4623,29 @@
                 <w14:ligatures w14:val="none"/>
               </w:rPr>
             </w:pPr>
-            <w:r>
-              <w:rPr>
-                <w:rFonts w:ascii="Arial" w:eastAsia="Times New Roman" w:hAnsi="Arial" w:cs="Arial"/>
-                <w:color w:val="000000"/>
-                <w:kern w:val="0"/>
-                <w:sz w:val="22"/>
-                <w:szCs w:val="22"/>
-                <w14:ligatures w14:val="none"/>
-              </w:rPr>
-              <w:t>Bool</w:t>
+            <w:proofErr w:type="gramStart"/>
+            <w:r>
+              <w:rPr>
+                <w:rFonts w:ascii="Arial" w:eastAsia="Times New Roman" w:hAnsi="Arial" w:cs="Arial"/>
+                <w:color w:val="000000"/>
+                <w:kern w:val="0"/>
+                <w:sz w:val="22"/>
+                <w:szCs w:val="22"/>
+                <w14:ligatures w14:val="none"/>
+              </w:rPr>
+              <w:t>VARCHAR(</w:t>
+            </w:r>
+            <w:proofErr w:type="gramEnd"/>
+            <w:r>
+              <w:rPr>
+                <w:rFonts w:ascii="Arial" w:eastAsia="Times New Roman" w:hAnsi="Arial" w:cs="Arial"/>
+                <w:color w:val="000000"/>
+                <w:kern w:val="0"/>
+                <w:sz w:val="22"/>
+                <w:szCs w:val="22"/>
+                <w14:ligatures w14:val="none"/>
+              </w:rPr>
+              <w:t>5)</w:t>
             </w:r>
           </w:p>
         </w:tc>
@@ -4434,7 +4675,51 @@
                 <w:szCs w:val="22"/>
                 <w14:ligatures w14:val="none"/>
               </w:rPr>
-              <w:t>Yes/No Dropdown</w:t>
+              <w:t>Yes/No</w:t>
+            </w:r>
+            <w:r>
+              <w:rPr>
+                <w:rFonts w:ascii="Arial" w:eastAsia="Times New Roman" w:hAnsi="Arial" w:cs="Arial"/>
+                <w:color w:val="000000"/>
+                <w:kern w:val="0"/>
+                <w:sz w:val="22"/>
+                <w:szCs w:val="22"/>
+                <w14:ligatures w14:val="none"/>
+              </w:rPr>
+              <w:t>/Down</w:t>
+            </w:r>
+            <w:r>
+              <w:rPr>
+                <w:rFonts w:ascii="Arial" w:eastAsia="Times New Roman" w:hAnsi="Arial" w:cs="Arial"/>
+                <w:color w:val="000000"/>
+                <w:kern w:val="0"/>
+                <w:sz w:val="22"/>
+                <w:szCs w:val="22"/>
+                <w14:ligatures w14:val="none"/>
+              </w:rPr>
+              <w:t>/Fixed</w:t>
+            </w:r>
+            <w:r>
+              <w:rPr>
+                <w:rFonts w:ascii="Arial" w:eastAsia="Times New Roman" w:hAnsi="Arial" w:cs="Arial"/>
+                <w:color w:val="000000"/>
+                <w:kern w:val="0"/>
+                <w:sz w:val="22"/>
+                <w:szCs w:val="22"/>
+                <w14:ligatures w14:val="none"/>
+              </w:rPr>
+              <w:t xml:space="preserve"> </w:t>
+            </w:r>
+            <w:r>
+              <w:rPr>
+                <w:rFonts w:ascii="Arial" w:eastAsia="Times New Roman" w:hAnsi="Arial" w:cs="Arial"/>
+                <w:color w:val="000000"/>
+                <w:kern w:val="0"/>
+                <w:sz w:val="22"/>
+                <w:szCs w:val="22"/>
+                <w14:ligatures w14:val="none"/>
+              </w:rPr>
+              <w:t>Dropdown</w:t>
             </w:r>
           </w:p>
           <w:p>
@@ -4555,16 +4840,29 @@
                 <w14:ligatures w14:val="none"/>
               </w:rPr>
             </w:pPr>
-            <w:r>
-              <w:rPr>
-                <w:rFonts w:ascii="Arial" w:eastAsia="Times New Roman" w:hAnsi="Arial" w:cs="Arial"/>
-                <w:color w:val="000000"/>
-                <w:kern w:val="0"/>
-                <w:sz w:val="22"/>
-                <w:szCs w:val="22"/>
-                <w14:ligatures w14:val="none"/>
-              </w:rPr>
-              <w:t>Bool</w:t>
+            <w:proofErr w:type="gramStart"/>
+            <w:r>
+              <w:rPr>
+                <w:rFonts w:ascii="Arial" w:eastAsia="Times New Roman" w:hAnsi="Arial" w:cs="Arial"/>
+                <w:color w:val="000000"/>
+                <w:kern w:val="0"/>
+                <w:sz w:val="22"/>
+                <w:szCs w:val="22"/>
+                <w14:ligatures w14:val="none"/>
+              </w:rPr>
+              <w:t>VARCHAR(</w:t>
+            </w:r>
+            <w:proofErr w:type="gramEnd"/>
+            <w:r>
+              <w:rPr>
+                <w:rFonts w:ascii="Arial" w:eastAsia="Times New Roman" w:hAnsi="Arial" w:cs="Arial"/>
+                <w:color w:val="000000"/>
+                <w:kern w:val="0"/>
+                <w:sz w:val="22"/>
+                <w:szCs w:val="22"/>
+                <w14:ligatures w14:val="none"/>
+              </w:rPr>
+              <w:t>5)</w:t>
             </w:r>
           </w:p>
         </w:tc>
@@ -4594,7 +4892,51 @@
                 <w:szCs w:val="22"/>
                 <w14:ligatures w14:val="none"/>
               </w:rPr>
-              <w:t>Yes/No Dropdown</w:t>
+              <w:t>Yes/No</w:t>
+            </w:r>
+            <w:r>
+              <w:rPr>
+                <w:rFonts w:ascii="Arial" w:eastAsia="Times New Roman" w:hAnsi="Arial" w:cs="Arial"/>
+                <w:color w:val="000000"/>
+                <w:kern w:val="0"/>
+                <w:sz w:val="22"/>
+                <w:szCs w:val="22"/>
+                <w14:ligatures w14:val="none"/>
+              </w:rPr>
+              <w:t>/Down</w:t>
+            </w:r>
+            <w:r>
+              <w:rPr>
+                <w:rFonts w:ascii="Arial" w:eastAsia="Times New Roman" w:hAnsi="Arial" w:cs="Arial"/>
+                <w:color w:val="000000"/>
+                <w:kern w:val="0"/>
+                <w:sz w:val="22"/>
+                <w:szCs w:val="22"/>
+                <w14:ligatures w14:val="none"/>
+              </w:rPr>
+              <w:t>/Fixed</w:t>
+            </w:r>
+            <w:r>
+              <w:rPr>
+                <w:rFonts w:ascii="Arial" w:eastAsia="Times New Roman" w:hAnsi="Arial" w:cs="Arial"/>
+                <w:color w:val="000000"/>
+                <w:kern w:val="0"/>
+                <w:sz w:val="22"/>
+                <w:szCs w:val="22"/>
+                <w14:ligatures w14:val="none"/>
+              </w:rPr>
+              <w:t xml:space="preserve"> </w:t>
+            </w:r>
+            <w:r>
+              <w:rPr>
+                <w:rFonts w:ascii="Arial" w:eastAsia="Times New Roman" w:hAnsi="Arial" w:cs="Arial"/>
+                <w:color w:val="000000"/>
+                <w:kern w:val="0"/>
+                <w:sz w:val="22"/>
+                <w:szCs w:val="22"/>
+                <w14:ligatures w14:val="none"/>
+              </w:rPr>
+              <w:t>Dropdown</w:t>
             </w:r>
           </w:p>
           <w:p>
@@ -4735,64 +5077,6 @@
           </w:tcPr>
           <w:p>
             <w:pPr>
-              <w:pStyle w:val="ListParagraph"/>
-              <w:numPr>
-                <w:ilvl w:val="0"/>
-                <w:numId w:val="18"/>
-              </w:numPr>
-              <w:cnfStyle w:val="000000000000" w:firstRow="0" w:lastRow="0" w:firstColumn="0" w:lastColumn="0" w:oddVBand="0" w:evenVBand="0" w:oddHBand="0" w:evenHBand="0" w:firstRowFirstColumn="0" w:firstRowLastColumn="0" w:lastRowFirstColumn="0" w:lastRowLastColumn="0"/>
-              <w:rPr>
-                <w:rFonts w:ascii="Arial" w:eastAsia="Times New Roman" w:hAnsi="Arial" w:cs="Arial"/>
-                <w:color w:val="000000"/>
-                <w:kern w:val="0"/>
-                <w:sz w:val="22"/>
-                <w:szCs w:val="22"/>
-                <w14:ligatures w14:val="none"/>
-              </w:rPr>
-            </w:pPr>
-            <w:r>
-              <w:rPr>
-                <w:rFonts w:ascii="Arial" w:eastAsia="Times New Roman" w:hAnsi="Arial" w:cs="Arial"/>
-                <w:color w:val="000000"/>
-                <w:kern w:val="0"/>
-                <w:sz w:val="22"/>
-                <w:szCs w:val="22"/>
-                <w14:ligatures w14:val="none"/>
-              </w:rPr>
-              <w:t>Number Input for initial inventory</w:t>
-            </w:r>
-          </w:p>
-          <w:p>
-            <w:pPr>
-              <w:pStyle w:val="ListParagraph"/>
-              <w:numPr>
-                <w:ilvl w:val="0"/>
-                <w:numId w:val="18"/>
-              </w:numPr>
-              <w:cnfStyle w:val="000000000000" w:firstRow="0" w:lastRow="0" w:firstColumn="0" w:lastColumn="0" w:oddVBand="0" w:evenVBand="0" w:oddHBand="0" w:evenHBand="0" w:firstRowFirstColumn="0" w:firstRowLastColumn="0" w:lastRowFirstColumn="0" w:lastRowLastColumn="0"/>
-              <w:rPr>
-                <w:rFonts w:ascii="Arial" w:eastAsia="Times New Roman" w:hAnsi="Arial" w:cs="Arial"/>
-                <w:color w:val="000000"/>
-                <w:kern w:val="0"/>
-                <w:sz w:val="22"/>
-                <w:szCs w:val="22"/>
-                <w14:ligatures w14:val="none"/>
-              </w:rPr>
-            </w:pPr>
-            <w:r>
-              <w:rPr>
-                <w:rFonts w:ascii="Arial" w:eastAsia="Times New Roman" w:hAnsi="Arial" w:cs="Arial"/>
-                <w:color w:val="000000"/>
-                <w:kern w:val="0"/>
-                <w:sz w:val="22"/>
-                <w:szCs w:val="22"/>
-                <w14:ligatures w14:val="none"/>
-              </w:rPr>
-              <w:t>Auto deduct when checked yes</w:t>
-            </w:r>
-          </w:p>
-          <w:p>
-            <w:pPr>
               <w:cnfStyle w:val="000000000000" w:firstRow="0" w:lastRow="0" w:firstColumn="0" w:lastColumn="0" w:oddVBand="0" w:evenVBand="0" w:oddHBand="0" w:evenHBand="0" w:firstRowFirstColumn="0" w:firstRowLastColumn="0" w:lastRowFirstColumn="0" w:lastRowLastColumn="0"/>
               <w:rPr>
                 <w:rFonts w:ascii="Arial" w:eastAsia="Times New Roman" w:hAnsi="Arial" w:cs="Arial"/>
@@ -4929,64 +5213,6 @@
           </w:tcPr>
           <w:p>
             <w:pPr>
-              <w:pStyle w:val="ListParagraph"/>
-              <w:numPr>
-                <w:ilvl w:val="0"/>
-                <w:numId w:val="18"/>
-              </w:numPr>
-              <w:cnfStyle w:val="000000000000" w:firstRow="0" w:lastRow="0" w:firstColumn="0" w:lastColumn="0" w:oddVBand="0" w:evenVBand="0" w:oddHBand="0" w:evenHBand="0" w:firstRowFirstColumn="0" w:firstRowLastColumn="0" w:lastRowFirstColumn="0" w:lastRowLastColumn="0"/>
-              <w:rPr>
-                <w:rFonts w:ascii="Arial" w:eastAsia="Times New Roman" w:hAnsi="Arial" w:cs="Arial"/>
-                <w:color w:val="000000"/>
-                <w:kern w:val="0"/>
-                <w:sz w:val="22"/>
-                <w:szCs w:val="22"/>
-                <w14:ligatures w14:val="none"/>
-              </w:rPr>
-            </w:pPr>
-            <w:r>
-              <w:rPr>
-                <w:rFonts w:ascii="Arial" w:eastAsia="Times New Roman" w:hAnsi="Arial" w:cs="Arial"/>
-                <w:color w:val="000000"/>
-                <w:kern w:val="0"/>
-                <w:sz w:val="22"/>
-                <w:szCs w:val="22"/>
-                <w14:ligatures w14:val="none"/>
-              </w:rPr>
-              <w:t>Number Input for initial inventory</w:t>
-            </w:r>
-          </w:p>
-          <w:p>
-            <w:pPr>
-              <w:pStyle w:val="ListParagraph"/>
-              <w:numPr>
-                <w:ilvl w:val="0"/>
-                <w:numId w:val="18"/>
-              </w:numPr>
-              <w:cnfStyle w:val="000000000000" w:firstRow="0" w:lastRow="0" w:firstColumn="0" w:lastColumn="0" w:oddVBand="0" w:evenVBand="0" w:oddHBand="0" w:evenHBand="0" w:firstRowFirstColumn="0" w:firstRowLastColumn="0" w:lastRowFirstColumn="0" w:lastRowLastColumn="0"/>
-              <w:rPr>
-                <w:rFonts w:ascii="Arial" w:eastAsia="Times New Roman" w:hAnsi="Arial" w:cs="Arial"/>
-                <w:color w:val="000000"/>
-                <w:kern w:val="0"/>
-                <w:sz w:val="22"/>
-                <w:szCs w:val="22"/>
-                <w14:ligatures w14:val="none"/>
-              </w:rPr>
-            </w:pPr>
-            <w:r>
-              <w:rPr>
-                <w:rFonts w:ascii="Arial" w:eastAsia="Times New Roman" w:hAnsi="Arial" w:cs="Arial"/>
-                <w:color w:val="000000"/>
-                <w:kern w:val="0"/>
-                <w:sz w:val="22"/>
-                <w:szCs w:val="22"/>
-                <w14:ligatures w14:val="none"/>
-              </w:rPr>
-              <w:t>Auto deduct when checked yes</w:t>
-            </w:r>
-          </w:p>
-          <w:p>
-            <w:pPr>
               <w:cnfStyle w:val="000000000000" w:firstRow="0" w:lastRow="0" w:firstColumn="0" w:lastColumn="0" w:oddVBand="0" w:evenVBand="0" w:oddHBand="0" w:evenHBand="0" w:firstRowFirstColumn="0" w:firstRowLastColumn="0" w:lastRowFirstColumn="0" w:lastRowLastColumn="0"/>
               <w:rPr>
                 <w:rFonts w:ascii="Arial" w:eastAsia="Times New Roman" w:hAnsi="Arial" w:cs="Arial"/>
@@ -5123,64 +5349,6 @@
           </w:tcPr>
           <w:p>
             <w:pPr>
-              <w:pStyle w:val="ListParagraph"/>
-              <w:numPr>
-                <w:ilvl w:val="0"/>
-                <w:numId w:val="18"/>
-              </w:numPr>
-              <w:cnfStyle w:val="000000000000" w:firstRow="0" w:lastRow="0" w:firstColumn="0" w:lastColumn="0" w:oddVBand="0" w:evenVBand="0" w:oddHBand="0" w:evenHBand="0" w:firstRowFirstColumn="0" w:firstRowLastColumn="0" w:lastRowFirstColumn="0" w:lastRowLastColumn="0"/>
-              <w:rPr>
-                <w:rFonts w:ascii="Arial" w:eastAsia="Times New Roman" w:hAnsi="Arial" w:cs="Arial"/>
-                <w:color w:val="000000"/>
-                <w:kern w:val="0"/>
-                <w:sz w:val="22"/>
-                <w:szCs w:val="22"/>
-                <w14:ligatures w14:val="none"/>
-              </w:rPr>
-            </w:pPr>
-            <w:r>
-              <w:rPr>
-                <w:rFonts w:ascii="Arial" w:eastAsia="Times New Roman" w:hAnsi="Arial" w:cs="Arial"/>
-                <w:color w:val="000000"/>
-                <w:kern w:val="0"/>
-                <w:sz w:val="22"/>
-                <w:szCs w:val="22"/>
-                <w14:ligatures w14:val="none"/>
-              </w:rPr>
-              <w:t>Number Input for initial inventory</w:t>
-            </w:r>
-          </w:p>
-          <w:p>
-            <w:pPr>
-              <w:pStyle w:val="ListParagraph"/>
-              <w:numPr>
-                <w:ilvl w:val="0"/>
-                <w:numId w:val="18"/>
-              </w:numPr>
-              <w:cnfStyle w:val="000000000000" w:firstRow="0" w:lastRow="0" w:firstColumn="0" w:lastColumn="0" w:oddVBand="0" w:evenVBand="0" w:oddHBand="0" w:evenHBand="0" w:firstRowFirstColumn="0" w:firstRowLastColumn="0" w:lastRowFirstColumn="0" w:lastRowLastColumn="0"/>
-              <w:rPr>
-                <w:rFonts w:ascii="Arial" w:eastAsia="Times New Roman" w:hAnsi="Arial" w:cs="Arial"/>
-                <w:color w:val="000000"/>
-                <w:kern w:val="0"/>
-                <w:sz w:val="22"/>
-                <w:szCs w:val="22"/>
-                <w14:ligatures w14:val="none"/>
-              </w:rPr>
-            </w:pPr>
-            <w:r>
-              <w:rPr>
-                <w:rFonts w:ascii="Arial" w:eastAsia="Times New Roman" w:hAnsi="Arial" w:cs="Arial"/>
-                <w:color w:val="000000"/>
-                <w:kern w:val="0"/>
-                <w:sz w:val="22"/>
-                <w:szCs w:val="22"/>
-                <w14:ligatures w14:val="none"/>
-              </w:rPr>
-              <w:t>Auto deduct when checked yes</w:t>
-            </w:r>
-          </w:p>
-          <w:p>
-            <w:pPr>
               <w:cnfStyle w:val="000000000000" w:firstRow="0" w:lastRow="0" w:firstColumn="0" w:lastColumn="0" w:oddVBand="0" w:evenVBand="0" w:oddHBand="0" w:evenHBand="0" w:firstRowFirstColumn="0" w:firstRowLastColumn="0" w:lastRowFirstColumn="0" w:lastRowLastColumn="0"/>
               <w:rPr>
                 <w:rFonts w:ascii="Arial" w:eastAsia="Times New Roman" w:hAnsi="Arial" w:cs="Arial"/>
@@ -5392,7 +5560,6 @@
                 <w:szCs w:val="22"/>
                 <w14:ligatures w14:val="none"/>
               </w:rPr>
-              <w:lastRenderedPageBreak/>
               <w:t>Rink_HVAC_Filter</w:t>
             </w:r>
             <w:proofErr w:type="spellEnd"/>
@@ -5492,6 +5659,16 @@
         </w:tc>
       </w:tr>
     </w:tbl>
+    <w:p>
+      <w:pPr>
+        <w:rPr>
+          <w:b/>
+          <w:bCs/>
+          <w:sz w:val="40"/>
+          <w:szCs w:val="40"/>
+        </w:rPr>
+      </w:pPr>
+    </w:p>
     <w:p>
       <w:pPr>
         <w:rPr>
@@ -5530,6 +5707,148 @@
         <w:t xml:space="preserve"> HVAC Filter Form</w:t>
       </w:r>
     </w:p>
+    <w:p>
+      <w:pPr>
+        <w:rPr>
+          <w:b/>
+          <w:bCs/>
+          <w:sz w:val="28"/>
+          <w:szCs w:val="28"/>
+        </w:rPr>
+      </w:pPr>
+      <w:r>
+        <w:rPr>
+          <w:b/>
+          <w:bCs/>
+          <w:sz w:val="28"/>
+          <w:szCs w:val="28"/>
+        </w:rPr>
+        <w:t>Inventory:</w:t>
+      </w:r>
+    </w:p>
+    <w:p>
+      <w:pPr>
+        <w:pStyle w:val="ListParagraph"/>
+        <w:numPr>
+          <w:ilvl w:val="0"/>
+          <w:numId w:val="16"/>
+        </w:numPr>
+        <w:rPr>
+          <w:rFonts w:ascii="Arial" w:eastAsia="Times New Roman" w:hAnsi="Arial" w:cs="Arial"/>
+          <w:color w:val="000000"/>
+          <w:kern w:val="0"/>
+          <w:sz w:val="22"/>
+          <w:szCs w:val="22"/>
+          <w14:ligatures w14:val="none"/>
+        </w:rPr>
+      </w:pPr>
+      <w:r>
+        <w:rPr>
+          <w:rFonts w:ascii="Arial" w:eastAsia="Times New Roman" w:hAnsi="Arial" w:cs="Arial"/>
+          <w:color w:val="000000"/>
+          <w:kern w:val="0"/>
+          <w:sz w:val="22"/>
+          <w:szCs w:val="22"/>
+          <w14:ligatures w14:val="none"/>
+        </w:rPr>
+        <w:t>Number Input for initial inventory</w:t>
+      </w:r>
+      <w:r>
+        <w:rPr>
+          <w:rFonts w:ascii="Arial" w:eastAsia="Times New Roman" w:hAnsi="Arial" w:cs="Arial"/>
+          <w:color w:val="000000"/>
+          <w:kern w:val="0"/>
+          <w:sz w:val="22"/>
+          <w:szCs w:val="22"/>
+          <w14:ligatures w14:val="none"/>
+        </w:rPr>
+        <w:t xml:space="preserve"> or any changes with inventory</w:t>
+      </w:r>
+    </w:p>
+    <w:p>
+      <w:pPr>
+        <w:pStyle w:val="ListParagraph"/>
+        <w:numPr>
+          <w:ilvl w:val="0"/>
+          <w:numId w:val="16"/>
+        </w:numPr>
+        <w:rPr>
+          <w:rFonts w:ascii="Arial" w:eastAsia="Times New Roman" w:hAnsi="Arial" w:cs="Arial"/>
+          <w:color w:val="000000"/>
+          <w:kern w:val="0"/>
+          <w:sz w:val="22"/>
+          <w:szCs w:val="22"/>
+          <w14:ligatures w14:val="none"/>
+        </w:rPr>
+      </w:pPr>
+      <w:r>
+        <w:rPr>
+          <w:rFonts w:ascii="Arial" w:eastAsia="Times New Roman" w:hAnsi="Arial" w:cs="Arial"/>
+          <w:color w:val="000000"/>
+          <w:kern w:val="0"/>
+          <w:sz w:val="22"/>
+          <w:szCs w:val="22"/>
+          <w14:ligatures w14:val="none"/>
+        </w:rPr>
+        <w:t>Auto deduct when checked yes</w:t>
+      </w:r>
+    </w:p>
+    <w:p>
+      <w:pPr>
+        <w:pStyle w:val="ListParagraph"/>
+        <w:numPr>
+          <w:ilvl w:val="0"/>
+          <w:numId w:val="16"/>
+        </w:numPr>
+        <w:rPr>
+          <w:rFonts w:ascii="Arial" w:eastAsia="Times New Roman" w:hAnsi="Arial" w:cs="Arial"/>
+          <w:color w:val="000000"/>
+          <w:kern w:val="0"/>
+          <w:sz w:val="22"/>
+          <w:szCs w:val="22"/>
+          <w14:ligatures w14:val="none"/>
+        </w:rPr>
+      </w:pPr>
+      <w:r>
+        <w:rPr>
+          <w:rFonts w:ascii="Arial" w:eastAsia="Times New Roman" w:hAnsi="Arial" w:cs="Arial"/>
+          <w:color w:val="000000"/>
+          <w:kern w:val="0"/>
+          <w:sz w:val="22"/>
+          <w:szCs w:val="22"/>
+          <w14:ligatures w14:val="none"/>
+        </w:rPr>
+        <w:t>When input is No bring over previous inventory numbers</w:t>
+      </w:r>
+    </w:p>
+    <w:p>
+      <w:pPr>
+        <w:pStyle w:val="ListParagraph"/>
+        <w:numPr>
+          <w:ilvl w:val="0"/>
+          <w:numId w:val="16"/>
+        </w:numPr>
+        <w:rPr>
+          <w:rFonts w:ascii="Arial" w:eastAsia="Times New Roman" w:hAnsi="Arial" w:cs="Arial"/>
+          <w:color w:val="000000"/>
+          <w:kern w:val="0"/>
+          <w:sz w:val="22"/>
+          <w:szCs w:val="22"/>
+          <w14:ligatures w14:val="none"/>
+        </w:rPr>
+      </w:pPr>
+      <w:r>
+        <w:rPr>
+          <w:rFonts w:ascii="Arial" w:eastAsia="Times New Roman" w:hAnsi="Arial" w:cs="Arial"/>
+          <w:color w:val="000000"/>
+          <w:kern w:val="0"/>
+          <w:sz w:val="22"/>
+          <w:szCs w:val="22"/>
+          <w14:ligatures w14:val="none"/>
+        </w:rPr>
+        <w:t>Down and Fixed give the option to auto deduct or not if filters were changed for each size</w:t>
+      </w:r>
+    </w:p>
     <w:tbl>
       <w:tblPr>
         <w:tblStyle w:val="GridTable1Light"/>
@@ -5971,16 +6290,29 @@
                 <w14:ligatures w14:val="none"/>
               </w:rPr>
             </w:pPr>
-            <w:r>
-              <w:rPr>
-                <w:rFonts w:ascii="Arial" w:eastAsia="Times New Roman" w:hAnsi="Arial" w:cs="Arial"/>
-                <w:color w:val="000000"/>
-                <w:kern w:val="0"/>
-                <w:sz w:val="22"/>
-                <w:szCs w:val="22"/>
-                <w14:ligatures w14:val="none"/>
-              </w:rPr>
-              <w:t>Bool</w:t>
+            <w:proofErr w:type="gramStart"/>
+            <w:r>
+              <w:rPr>
+                <w:rFonts w:ascii="Arial" w:eastAsia="Times New Roman" w:hAnsi="Arial" w:cs="Arial"/>
+                <w:color w:val="000000"/>
+                <w:kern w:val="0"/>
+                <w:sz w:val="22"/>
+                <w:szCs w:val="22"/>
+                <w14:ligatures w14:val="none"/>
+              </w:rPr>
+              <w:t>VARCHAR(</w:t>
+            </w:r>
+            <w:proofErr w:type="gramEnd"/>
+            <w:r>
+              <w:rPr>
+                <w:rFonts w:ascii="Arial" w:eastAsia="Times New Roman" w:hAnsi="Arial" w:cs="Arial"/>
+                <w:color w:val="000000"/>
+                <w:kern w:val="0"/>
+                <w:sz w:val="22"/>
+                <w:szCs w:val="22"/>
+                <w14:ligatures w14:val="none"/>
+              </w:rPr>
+              <w:t>5)</w:t>
             </w:r>
           </w:p>
         </w:tc>
@@ -6010,7 +6342,40 @@
                 <w:szCs w:val="22"/>
                 <w14:ligatures w14:val="none"/>
               </w:rPr>
-              <w:t>Yes/No Dropdown</w:t>
+              <w:t>Yes/No</w:t>
+            </w:r>
+            <w:r>
+              <w:rPr>
+                <w:rFonts w:ascii="Arial" w:eastAsia="Times New Roman" w:hAnsi="Arial" w:cs="Arial"/>
+                <w:color w:val="000000"/>
+                <w:kern w:val="0"/>
+                <w:sz w:val="22"/>
+                <w:szCs w:val="22"/>
+                <w14:ligatures w14:val="none"/>
+              </w:rPr>
+              <w:t>/Down</w:t>
+            </w:r>
+            <w:r>
+              <w:rPr>
+                <w:rFonts w:ascii="Arial" w:eastAsia="Times New Roman" w:hAnsi="Arial" w:cs="Arial"/>
+                <w:color w:val="000000"/>
+                <w:kern w:val="0"/>
+                <w:sz w:val="22"/>
+                <w:szCs w:val="22"/>
+                <w14:ligatures w14:val="none"/>
+              </w:rPr>
+              <w:t>/Fixed</w:t>
+            </w:r>
+            <w:r>
+              <w:rPr>
+                <w:rFonts w:ascii="Arial" w:eastAsia="Times New Roman" w:hAnsi="Arial" w:cs="Arial"/>
+                <w:color w:val="000000"/>
+                <w:kern w:val="0"/>
+                <w:sz w:val="22"/>
+                <w:szCs w:val="22"/>
+                <w14:ligatures w14:val="none"/>
+              </w:rPr>
+              <w:t xml:space="preserve"> Dropdown</w:t>
             </w:r>
           </w:p>
           <w:p>
@@ -6175,16 +6540,29 @@
                 <w14:ligatures w14:val="none"/>
               </w:rPr>
             </w:pPr>
-            <w:r>
-              <w:rPr>
-                <w:rFonts w:ascii="Arial" w:eastAsia="Times New Roman" w:hAnsi="Arial" w:cs="Arial"/>
-                <w:color w:val="000000"/>
-                <w:kern w:val="0"/>
-                <w:sz w:val="22"/>
-                <w:szCs w:val="22"/>
-                <w14:ligatures w14:val="none"/>
-              </w:rPr>
-              <w:t>Bool</w:t>
+            <w:proofErr w:type="gramStart"/>
+            <w:r>
+              <w:rPr>
+                <w:rFonts w:ascii="Arial" w:eastAsia="Times New Roman" w:hAnsi="Arial" w:cs="Arial"/>
+                <w:color w:val="000000"/>
+                <w:kern w:val="0"/>
+                <w:sz w:val="22"/>
+                <w:szCs w:val="22"/>
+                <w14:ligatures w14:val="none"/>
+              </w:rPr>
+              <w:t>VARCHAR(</w:t>
+            </w:r>
+            <w:proofErr w:type="gramEnd"/>
+            <w:r>
+              <w:rPr>
+                <w:rFonts w:ascii="Arial" w:eastAsia="Times New Roman" w:hAnsi="Arial" w:cs="Arial"/>
+                <w:color w:val="000000"/>
+                <w:kern w:val="0"/>
+                <w:sz w:val="22"/>
+                <w:szCs w:val="22"/>
+                <w14:ligatures w14:val="none"/>
+              </w:rPr>
+              <w:t>5)</w:t>
             </w:r>
           </w:p>
         </w:tc>
@@ -6214,7 +6592,40 @@
                 <w:szCs w:val="22"/>
                 <w14:ligatures w14:val="none"/>
               </w:rPr>
-              <w:t>Yes/No Dropdown</w:t>
+              <w:t>Yes/No</w:t>
+            </w:r>
+            <w:r>
+              <w:rPr>
+                <w:rFonts w:ascii="Arial" w:eastAsia="Times New Roman" w:hAnsi="Arial" w:cs="Arial"/>
+                <w:color w:val="000000"/>
+                <w:kern w:val="0"/>
+                <w:sz w:val="22"/>
+                <w:szCs w:val="22"/>
+                <w14:ligatures w14:val="none"/>
+              </w:rPr>
+              <w:t>/Down</w:t>
+            </w:r>
+            <w:r>
+              <w:rPr>
+                <w:rFonts w:ascii="Arial" w:eastAsia="Times New Roman" w:hAnsi="Arial" w:cs="Arial"/>
+                <w:color w:val="000000"/>
+                <w:kern w:val="0"/>
+                <w:sz w:val="22"/>
+                <w:szCs w:val="22"/>
+                <w14:ligatures w14:val="none"/>
+              </w:rPr>
+              <w:t>/Fixed</w:t>
+            </w:r>
+            <w:r>
+              <w:rPr>
+                <w:rFonts w:ascii="Arial" w:eastAsia="Times New Roman" w:hAnsi="Arial" w:cs="Arial"/>
+                <w:color w:val="000000"/>
+                <w:kern w:val="0"/>
+                <w:sz w:val="22"/>
+                <w:szCs w:val="22"/>
+                <w14:ligatures w14:val="none"/>
+              </w:rPr>
+              <w:t xml:space="preserve"> Dropdown</w:t>
             </w:r>
           </w:p>
           <w:p>
@@ -6379,16 +6790,29 @@
                 <w14:ligatures w14:val="none"/>
               </w:rPr>
             </w:pPr>
-            <w:r>
-              <w:rPr>
-                <w:rFonts w:ascii="Arial" w:eastAsia="Times New Roman" w:hAnsi="Arial" w:cs="Arial"/>
-                <w:color w:val="000000"/>
-                <w:kern w:val="0"/>
-                <w:sz w:val="22"/>
-                <w:szCs w:val="22"/>
-                <w14:ligatures w14:val="none"/>
-              </w:rPr>
-              <w:t>Bool</w:t>
+            <w:proofErr w:type="gramStart"/>
+            <w:r>
+              <w:rPr>
+                <w:rFonts w:ascii="Arial" w:eastAsia="Times New Roman" w:hAnsi="Arial" w:cs="Arial"/>
+                <w:color w:val="000000"/>
+                <w:kern w:val="0"/>
+                <w:sz w:val="22"/>
+                <w:szCs w:val="22"/>
+                <w14:ligatures w14:val="none"/>
+              </w:rPr>
+              <w:t>VARCHAR(</w:t>
+            </w:r>
+            <w:proofErr w:type="gramEnd"/>
+            <w:r>
+              <w:rPr>
+                <w:rFonts w:ascii="Arial" w:eastAsia="Times New Roman" w:hAnsi="Arial" w:cs="Arial"/>
+                <w:color w:val="000000"/>
+                <w:kern w:val="0"/>
+                <w:sz w:val="22"/>
+                <w:szCs w:val="22"/>
+                <w14:ligatures w14:val="none"/>
+              </w:rPr>
+              <w:t>5)</w:t>
             </w:r>
           </w:p>
         </w:tc>
@@ -6418,7 +6842,40 @@
                 <w:szCs w:val="22"/>
                 <w14:ligatures w14:val="none"/>
               </w:rPr>
-              <w:t>Yes/No Dropdown</w:t>
+              <w:t>Yes/No</w:t>
+            </w:r>
+            <w:r>
+              <w:rPr>
+                <w:rFonts w:ascii="Arial" w:eastAsia="Times New Roman" w:hAnsi="Arial" w:cs="Arial"/>
+                <w:color w:val="000000"/>
+                <w:kern w:val="0"/>
+                <w:sz w:val="22"/>
+                <w:szCs w:val="22"/>
+                <w14:ligatures w14:val="none"/>
+              </w:rPr>
+              <w:t>/Down</w:t>
+            </w:r>
+            <w:r>
+              <w:rPr>
+                <w:rFonts w:ascii="Arial" w:eastAsia="Times New Roman" w:hAnsi="Arial" w:cs="Arial"/>
+                <w:color w:val="000000"/>
+                <w:kern w:val="0"/>
+                <w:sz w:val="22"/>
+                <w:szCs w:val="22"/>
+                <w14:ligatures w14:val="none"/>
+              </w:rPr>
+              <w:t>/Fixed</w:t>
+            </w:r>
+            <w:r>
+              <w:rPr>
+                <w:rFonts w:ascii="Arial" w:eastAsia="Times New Roman" w:hAnsi="Arial" w:cs="Arial"/>
+                <w:color w:val="000000"/>
+                <w:kern w:val="0"/>
+                <w:sz w:val="22"/>
+                <w:szCs w:val="22"/>
+                <w14:ligatures w14:val="none"/>
+              </w:rPr>
+              <w:t xml:space="preserve"> Dropdown</w:t>
             </w:r>
           </w:p>
           <w:p>
@@ -6581,76 +7038,6 @@
           </w:tcPr>
           <w:p>
             <w:pPr>
-              <w:pStyle w:val="ListParagraph"/>
-              <w:numPr>
-                <w:ilvl w:val="0"/>
-                <w:numId w:val="16"/>
-              </w:numPr>
-              <w:cnfStyle w:val="000000000000" w:firstRow="0" w:lastRow="0" w:firstColumn="0" w:lastColumn="0" w:oddVBand="0" w:evenVBand="0" w:oddHBand="0" w:evenHBand="0" w:firstRowFirstColumn="0" w:firstRowLastColumn="0" w:lastRowFirstColumn="0" w:lastRowLastColumn="0"/>
-              <w:rPr>
-                <w:rFonts w:ascii="Arial" w:eastAsia="Times New Roman" w:hAnsi="Arial" w:cs="Arial"/>
-                <w:color w:val="000000"/>
-                <w:kern w:val="0"/>
-                <w:sz w:val="22"/>
-                <w:szCs w:val="22"/>
-                <w14:ligatures w14:val="none"/>
-              </w:rPr>
-            </w:pPr>
-            <w:r>
-              <w:rPr>
-                <w:rFonts w:ascii="Arial" w:eastAsia="Times New Roman" w:hAnsi="Arial" w:cs="Arial"/>
-                <w:color w:val="000000"/>
-                <w:kern w:val="0"/>
-                <w:sz w:val="22"/>
-                <w:szCs w:val="22"/>
-                <w14:ligatures w14:val="none"/>
-              </w:rPr>
-              <w:t>Number Input</w:t>
-            </w:r>
-            <w:r>
-              <w:rPr>
-                <w:rFonts w:ascii="Arial" w:eastAsia="Times New Roman" w:hAnsi="Arial" w:cs="Arial"/>
-                <w:color w:val="000000"/>
-                <w:kern w:val="0"/>
-                <w:sz w:val="22"/>
-                <w:szCs w:val="22"/>
-                <w14:ligatures w14:val="none"/>
-              </w:rPr>
-              <w:t xml:space="preserve"> for initial inventory</w:t>
-            </w:r>
-          </w:p>
-          <w:p>
-            <w:pPr>
-              <w:pStyle w:val="ListParagraph"/>
-              <w:numPr>
-                <w:ilvl w:val="0"/>
-                <w:numId w:val="16"/>
-              </w:numPr>
-              <w:cnfStyle w:val="000000000000" w:firstRow="0" w:lastRow="0" w:firstColumn="0" w:lastColumn="0" w:oddVBand="0" w:evenVBand="0" w:oddHBand="0" w:evenHBand="0" w:firstRowFirstColumn="0" w:firstRowLastColumn="0" w:lastRowFirstColumn="0" w:lastRowLastColumn="0"/>
-              <w:rPr>
-                <w:rFonts w:ascii="Arial" w:eastAsia="Times New Roman" w:hAnsi="Arial" w:cs="Arial"/>
-                <w:color w:val="000000"/>
-                <w:kern w:val="0"/>
-                <w:sz w:val="22"/>
-                <w:szCs w:val="22"/>
-                <w14:ligatures w14:val="none"/>
-              </w:rPr>
-            </w:pPr>
-            <w:r>
-              <w:rPr>
-                <w:rFonts w:ascii="Arial" w:eastAsia="Times New Roman" w:hAnsi="Arial" w:cs="Arial"/>
-                <w:color w:val="000000"/>
-                <w:kern w:val="0"/>
-                <w:sz w:val="22"/>
-                <w:szCs w:val="22"/>
-                <w14:ligatures w14:val="none"/>
-              </w:rPr>
-              <w:t>Auto deduct when checked yes</w:t>
-            </w:r>
-          </w:p>
-          <w:p>
-            <w:pPr>
-              <w:ind w:left="360"/>
               <w:cnfStyle w:val="000000000000" w:firstRow="0" w:lastRow="0" w:firstColumn="0" w:lastColumn="0" w:oddVBand="0" w:evenVBand="0" w:oddHBand="0" w:evenHBand="0" w:firstRowFirstColumn="0" w:firstRowLastColumn="0" w:lastRowFirstColumn="0" w:lastRowLastColumn="0"/>
               <w:rPr>
                 <w:rFonts w:ascii="Arial" w:eastAsia="Times New Roman" w:hAnsi="Arial" w:cs="Arial"/>
@@ -6831,76 +7218,6 @@
           </w:tcPr>
           <w:p>
             <w:pPr>
-              <w:pStyle w:val="ListParagraph"/>
-              <w:numPr>
-                <w:ilvl w:val="0"/>
-                <w:numId w:val="17"/>
-              </w:numPr>
-              <w:cnfStyle w:val="000000000000" w:firstRow="0" w:lastRow="0" w:firstColumn="0" w:lastColumn="0" w:oddVBand="0" w:evenVBand="0" w:oddHBand="0" w:evenHBand="0" w:firstRowFirstColumn="0" w:firstRowLastColumn="0" w:lastRowFirstColumn="0" w:lastRowLastColumn="0"/>
-              <w:rPr>
-                <w:rFonts w:ascii="Arial" w:eastAsia="Times New Roman" w:hAnsi="Arial" w:cs="Arial"/>
-                <w:color w:val="000000"/>
-                <w:kern w:val="0"/>
-                <w:sz w:val="22"/>
-                <w:szCs w:val="22"/>
-                <w14:ligatures w14:val="none"/>
-              </w:rPr>
-            </w:pPr>
-            <w:r>
-              <w:rPr>
-                <w:rFonts w:ascii="Arial" w:eastAsia="Times New Roman" w:hAnsi="Arial" w:cs="Arial"/>
-                <w:color w:val="000000"/>
-                <w:kern w:val="0"/>
-                <w:sz w:val="22"/>
-                <w:szCs w:val="22"/>
-                <w14:ligatures w14:val="none"/>
-              </w:rPr>
-              <w:t>Number Input</w:t>
-            </w:r>
-            <w:r>
-              <w:rPr>
-                <w:rFonts w:ascii="Arial" w:eastAsia="Times New Roman" w:hAnsi="Arial" w:cs="Arial"/>
-                <w:color w:val="000000"/>
-                <w:kern w:val="0"/>
-                <w:sz w:val="22"/>
-                <w:szCs w:val="22"/>
-                <w14:ligatures w14:val="none"/>
-              </w:rPr>
-              <w:t xml:space="preserve"> for initial inventory</w:t>
-            </w:r>
-          </w:p>
-          <w:p>
-            <w:pPr>
-              <w:pStyle w:val="ListParagraph"/>
-              <w:numPr>
-                <w:ilvl w:val="0"/>
-                <w:numId w:val="17"/>
-              </w:numPr>
-              <w:cnfStyle w:val="000000000000" w:firstRow="0" w:lastRow="0" w:firstColumn="0" w:lastColumn="0" w:oddVBand="0" w:evenVBand="0" w:oddHBand="0" w:evenHBand="0" w:firstRowFirstColumn="0" w:firstRowLastColumn="0" w:lastRowFirstColumn="0" w:lastRowLastColumn="0"/>
-              <w:rPr>
-                <w:rFonts w:ascii="Arial" w:eastAsia="Times New Roman" w:hAnsi="Arial" w:cs="Arial"/>
-                <w:color w:val="000000"/>
-                <w:kern w:val="0"/>
-                <w:sz w:val="22"/>
-                <w:szCs w:val="22"/>
-                <w14:ligatures w14:val="none"/>
-              </w:rPr>
-            </w:pPr>
-            <w:r>
-              <w:rPr>
-                <w:rFonts w:ascii="Arial" w:eastAsia="Times New Roman" w:hAnsi="Arial" w:cs="Arial"/>
-                <w:color w:val="000000"/>
-                <w:kern w:val="0"/>
-                <w:sz w:val="22"/>
-                <w:szCs w:val="22"/>
-                <w14:ligatures w14:val="none"/>
-              </w:rPr>
-              <w:t>Auto deduct when checked yes</w:t>
-            </w:r>
-          </w:p>
-          <w:p>
-            <w:pPr>
-              <w:ind w:left="360"/>
               <w:cnfStyle w:val="000000000000" w:firstRow="0" w:lastRow="0" w:firstColumn="0" w:lastColumn="0" w:oddVBand="0" w:evenVBand="0" w:oddHBand="0" w:evenHBand="0" w:firstRowFirstColumn="0" w:firstRowLastColumn="0" w:lastRowFirstColumn="0" w:lastRowLastColumn="0"/>
               <w:rPr>
                 <w:rFonts w:ascii="Arial" w:eastAsia="Times New Roman" w:hAnsi="Arial" w:cs="Arial"/>
@@ -7081,76 +7398,6 @@
           </w:tcPr>
           <w:p>
             <w:pPr>
-              <w:pStyle w:val="ListParagraph"/>
-              <w:numPr>
-                <w:ilvl w:val="0"/>
-                <w:numId w:val="18"/>
-              </w:numPr>
-              <w:cnfStyle w:val="000000000000" w:firstRow="0" w:lastRow="0" w:firstColumn="0" w:lastColumn="0" w:oddVBand="0" w:evenVBand="0" w:oddHBand="0" w:evenHBand="0" w:firstRowFirstColumn="0" w:firstRowLastColumn="0" w:lastRowFirstColumn="0" w:lastRowLastColumn="0"/>
-              <w:rPr>
-                <w:rFonts w:ascii="Arial" w:eastAsia="Times New Roman" w:hAnsi="Arial" w:cs="Arial"/>
-                <w:color w:val="000000"/>
-                <w:kern w:val="0"/>
-                <w:sz w:val="22"/>
-                <w:szCs w:val="22"/>
-                <w14:ligatures w14:val="none"/>
-              </w:rPr>
-            </w:pPr>
-            <w:r>
-              <w:rPr>
-                <w:rFonts w:ascii="Arial" w:eastAsia="Times New Roman" w:hAnsi="Arial" w:cs="Arial"/>
-                <w:color w:val="000000"/>
-                <w:kern w:val="0"/>
-                <w:sz w:val="22"/>
-                <w:szCs w:val="22"/>
-                <w14:ligatures w14:val="none"/>
-              </w:rPr>
-              <w:t>Number Input</w:t>
-            </w:r>
-            <w:r>
-              <w:rPr>
-                <w:rFonts w:ascii="Arial" w:eastAsia="Times New Roman" w:hAnsi="Arial" w:cs="Arial"/>
-                <w:color w:val="000000"/>
-                <w:kern w:val="0"/>
-                <w:sz w:val="22"/>
-                <w:szCs w:val="22"/>
-                <w14:ligatures w14:val="none"/>
-              </w:rPr>
-              <w:t xml:space="preserve"> for initial inventory</w:t>
-            </w:r>
-          </w:p>
-          <w:p>
-            <w:pPr>
-              <w:pStyle w:val="ListParagraph"/>
-              <w:numPr>
-                <w:ilvl w:val="0"/>
-                <w:numId w:val="18"/>
-              </w:numPr>
-              <w:cnfStyle w:val="000000000000" w:firstRow="0" w:lastRow="0" w:firstColumn="0" w:lastColumn="0" w:oddVBand="0" w:evenVBand="0" w:oddHBand="0" w:evenHBand="0" w:firstRowFirstColumn="0" w:firstRowLastColumn="0" w:lastRowFirstColumn="0" w:lastRowLastColumn="0"/>
-              <w:rPr>
-                <w:rFonts w:ascii="Arial" w:eastAsia="Times New Roman" w:hAnsi="Arial" w:cs="Arial"/>
-                <w:color w:val="000000"/>
-                <w:kern w:val="0"/>
-                <w:sz w:val="22"/>
-                <w:szCs w:val="22"/>
-                <w14:ligatures w14:val="none"/>
-              </w:rPr>
-            </w:pPr>
-            <w:r>
-              <w:rPr>
-                <w:rFonts w:ascii="Arial" w:eastAsia="Times New Roman" w:hAnsi="Arial" w:cs="Arial"/>
-                <w:color w:val="000000"/>
-                <w:kern w:val="0"/>
-                <w:sz w:val="22"/>
-                <w:szCs w:val="22"/>
-                <w14:ligatures w14:val="none"/>
-              </w:rPr>
-              <w:t>Auto deduct when checked yes</w:t>
-            </w:r>
-          </w:p>
-          <w:p>
-            <w:pPr>
-              <w:ind w:left="360"/>
               <w:cnfStyle w:val="000000000000" w:firstRow="0" w:lastRow="0" w:firstColumn="0" w:lastColumn="0" w:oddVBand="0" w:evenVBand="0" w:oddHBand="0" w:evenHBand="0" w:firstRowFirstColumn="0" w:firstRowLastColumn="0" w:lastRowFirstColumn="0" w:lastRowLastColumn="0"/>
               <w:rPr>
                 <w:rFonts w:ascii="Arial" w:eastAsia="Times New Roman" w:hAnsi="Arial" w:cs="Arial"/>
@@ -7480,16 +7727,6 @@
         </w:rPr>
         <w:br w:type="page"/>
       </w:r>
-    </w:p>
-    <w:p>
-      <w:pPr>
-        <w:rPr>
-          <w:b/>
-          <w:bCs/>
-          <w:sz w:val="40"/>
-          <w:szCs w:val="40"/>
-        </w:rPr>
-      </w:pPr>
       <w:r>
         <w:rPr>
           <w:b/>
@@ -15686,20 +15923,7 @@
                 <w:szCs w:val="22"/>
                 <w14:ligatures w14:val="none"/>
               </w:rPr>
-              <w:t xml:space="preserve"> </w:t>
-            </w:r>
-            <w:r>
-              <w:rPr>
-                <w:rFonts w:ascii="Arial" w:eastAsia="Times New Roman" w:hAnsi="Arial" w:cs="Arial"/>
-                <w:b/>
-                <w:bCs/>
-                <w:color w:val="000000"/>
-                <w:kern w:val="0"/>
-                <w:sz w:val="22"/>
-                <w:szCs w:val="22"/>
-                <w14:ligatures w14:val="none"/>
-              </w:rPr>
-              <w:t>Required</w:t>
+              <w:t xml:space="preserve"> Required</w:t>
             </w:r>
           </w:p>
         </w:tc>
@@ -17002,6 +17226,45 @@
           <w:b/>
           <w:bCs/>
         </w:rPr>
+        <w:t xml:space="preserve"> all inside the “</w:t>
+      </w:r>
+      <w:proofErr w:type="spellStart"/>
+      <w:r>
+        <w:rPr>
+          <w:b/>
+          <w:bCs/>
+        </w:rPr>
+        <w:t>Maintenance_Checks_and_Repairs</w:t>
+      </w:r>
+      <w:proofErr w:type="spellEnd"/>
+      <w:r>
+        <w:rPr>
+          <w:b/>
+          <w:bCs/>
+        </w:rPr>
+        <w:t>” table and categorized using “</w:t>
+      </w:r>
+      <w:proofErr w:type="spellStart"/>
+      <w:r>
+        <w:rPr>
+          <w:b/>
+          <w:bCs/>
+        </w:rPr>
+        <w:t>Maintenance_Category</w:t>
+      </w:r>
+      <w:proofErr w:type="spellEnd"/>
+      <w:r>
+        <w:rPr>
+          <w:b/>
+          <w:bCs/>
+        </w:rPr>
+        <w:t>” Table</w:t>
+      </w:r>
+      <w:r>
+        <w:rPr>
+          <w:b/>
+          <w:bCs/>
+        </w:rPr>
         <w:t>:</w:t>
       </w:r>
     </w:p>
@@ -17150,6 +17413,7 @@
           <w:b/>
           <w:bCs/>
         </w:rPr>
+        <w:lastRenderedPageBreak/>
         <w:t xml:space="preserve">Battery Replaced </w:t>
       </w:r>
     </w:p>
@@ -17169,7 +17433,6 @@
           <w:b/>
           <w:bCs/>
         </w:rPr>
-        <w:lastRenderedPageBreak/>
         <w:t xml:space="preserve">Belts Replaced </w:t>
       </w:r>
     </w:p>
@@ -17643,6 +17906,7 @@
           <w:b/>
           <w:bCs/>
         </w:rPr>
+        <w:lastRenderedPageBreak/>
         <w:t xml:space="preserve">Grease Applied </w:t>
       </w:r>
     </w:p>
@@ -17662,7 +17926,6 @@
           <w:b/>
           <w:bCs/>
         </w:rPr>
-        <w:lastRenderedPageBreak/>
         <w:t xml:space="preserve">Grease Points Serviced </w:t>
       </w:r>
     </w:p>
@@ -18129,6 +18392,7 @@
           <w:b/>
           <w:bCs/>
         </w:rPr>
+        <w:lastRenderedPageBreak/>
         <w:t xml:space="preserve">Annual Inspection </w:t>
       </w:r>
     </w:p>
@@ -18148,7 +18412,6 @@
           <w:b/>
           <w:bCs/>
         </w:rPr>
-        <w:lastRenderedPageBreak/>
         <w:t xml:space="preserve">Safety Inspection </w:t>
       </w:r>
     </w:p>

</xml_diff>